<commit_message>
Update AI Usage Register standards with additional name column
AI ID for idea generation was added, clear description of the team member feature was added along with the physical column in the AI usage register table, and the decision column's standard was updated from only ACCEPT/REJECT to clear description what was accepted, changed, or rejected from AI.
</commit_message>
<xml_diff>
--- a/docs/ai-usage-register.docx
+++ b/docs/ai-usage-register.docx
@@ -20,29 +20,39 @@
       <w:pPr>
         <w:rPr>
           <w:rFonts w:ascii="Times New Roman" w:hAnsi="Times New Roman" w:cs="Times New Roman"/>
-        </w:rPr>
-      </w:pPr>
-      <w:r>
-        <w:rPr>
-          <w:rFonts w:ascii="Times New Roman" w:hAnsi="Times New Roman" w:cs="Times New Roman"/>
+          <w:sz w:val="22"/>
+          <w:szCs w:val="22"/>
+        </w:rPr>
+      </w:pPr>
+      <w:r>
+        <w:rPr>
+          <w:rFonts w:ascii="Times New Roman" w:hAnsi="Times New Roman" w:cs="Times New Roman"/>
+          <w:sz w:val="22"/>
+          <w:szCs w:val="22"/>
         </w:rPr>
         <w:t xml:space="preserve">In the event if any team member has asked the assistance of AI to analyse, research, </w:t>
       </w:r>
       <w:r>
         <w:rPr>
           <w:rFonts w:ascii="Times New Roman" w:hAnsi="Times New Roman" w:cs="Times New Roman"/>
+          <w:sz w:val="22"/>
+          <w:szCs w:val="22"/>
         </w:rPr>
         <w:t>compare architecture, design, code, test, debug, review documentation</w:t>
       </w:r>
       <w:r>
         <w:rPr>
           <w:rFonts w:ascii="Times New Roman" w:hAnsi="Times New Roman" w:cs="Times New Roman"/>
+          <w:sz w:val="22"/>
+          <w:szCs w:val="22"/>
         </w:rPr>
         <w:t xml:space="preserve"> and operational analysis, the following table underneath provide all the information that each AI usage must require.</w:t>
       </w:r>
       <w:r>
         <w:rPr>
           <w:rFonts w:ascii="Times New Roman" w:hAnsi="Times New Roman" w:cs="Times New Roman"/>
+          <w:sz w:val="22"/>
+          <w:szCs w:val="22"/>
         </w:rPr>
         <w:t xml:space="preserve"> The following key points of the table will assist in completing each AI usage within the table:</w:t>
       </w:r>
@@ -70,17 +80,23 @@
         </w:numPr>
         <w:rPr>
           <w:rFonts w:ascii="Times New Roman" w:hAnsi="Times New Roman" w:cs="Times New Roman"/>
-        </w:rPr>
-      </w:pPr>
-      <w:r>
-        <w:rPr>
-          <w:rFonts w:ascii="Times New Roman" w:hAnsi="Times New Roman" w:cs="Times New Roman"/>
+          <w:sz w:val="22"/>
+          <w:szCs w:val="22"/>
+        </w:rPr>
+      </w:pPr>
+      <w:r>
+        <w:rPr>
+          <w:rFonts w:ascii="Times New Roman" w:hAnsi="Times New Roman" w:cs="Times New Roman"/>
+          <w:sz w:val="22"/>
+          <w:szCs w:val="22"/>
         </w:rPr>
         <w:t xml:space="preserve">ID: This is the ID of an AI usage. </w:t>
       </w:r>
       <w:r>
         <w:rPr>
           <w:rFonts w:ascii="Times New Roman" w:hAnsi="Times New Roman" w:cs="Times New Roman"/>
+          <w:sz w:val="22"/>
+          <w:szCs w:val="22"/>
         </w:rPr>
         <w:t>The following will give the naming convention of AI IDs:</w:t>
       </w:r>
@@ -94,17 +110,23 @@
         </w:numPr>
         <w:rPr>
           <w:rFonts w:ascii="Times New Roman" w:hAnsi="Times New Roman" w:cs="Times New Roman"/>
-        </w:rPr>
-      </w:pPr>
-      <w:r>
-        <w:rPr>
-          <w:rFonts w:ascii="Times New Roman" w:hAnsi="Times New Roman" w:cs="Times New Roman"/>
+          <w:sz w:val="22"/>
+          <w:szCs w:val="22"/>
+        </w:rPr>
+      </w:pPr>
+      <w:r>
+        <w:rPr>
+          <w:rFonts w:ascii="Times New Roman" w:hAnsi="Times New Roman" w:cs="Times New Roman"/>
+          <w:sz w:val="22"/>
+          <w:szCs w:val="22"/>
         </w:rPr>
         <w:t>Research:  E.g. “AI-RES-1</w:t>
       </w:r>
       <w:r>
         <w:rPr>
           <w:rFonts w:ascii="Times New Roman" w:hAnsi="Times New Roman" w:cs="Times New Roman"/>
+          <w:sz w:val="22"/>
+          <w:szCs w:val="22"/>
         </w:rPr>
         <w:t>”</w:t>
       </w:r>
@@ -118,11 +140,15 @@
         </w:numPr>
         <w:rPr>
           <w:rFonts w:ascii="Times New Roman" w:hAnsi="Times New Roman" w:cs="Times New Roman"/>
-        </w:rPr>
-      </w:pPr>
-      <w:r>
-        <w:rPr>
-          <w:rFonts w:ascii="Times New Roman" w:hAnsi="Times New Roman" w:cs="Times New Roman"/>
+          <w:sz w:val="22"/>
+          <w:szCs w:val="22"/>
+        </w:rPr>
+      </w:pPr>
+      <w:r>
+        <w:rPr>
+          <w:rFonts w:ascii="Times New Roman" w:hAnsi="Times New Roman" w:cs="Times New Roman"/>
+          <w:sz w:val="22"/>
+          <w:szCs w:val="22"/>
         </w:rPr>
         <w:t>Formatting: E.g. “AI-FORM-34”</w:t>
       </w:r>
@@ -136,13 +162,25 @@
         </w:numPr>
         <w:rPr>
           <w:rFonts w:ascii="Times New Roman" w:hAnsi="Times New Roman" w:cs="Times New Roman"/>
-        </w:rPr>
-      </w:pPr>
-      <w:r>
-        <w:rPr>
-          <w:rFonts w:ascii="Times New Roman" w:hAnsi="Times New Roman" w:cs="Times New Roman"/>
-        </w:rPr>
-        <w:t>Coding: E.g. “AI-CODE-12”</w:t>
+          <w:sz w:val="22"/>
+          <w:szCs w:val="22"/>
+        </w:rPr>
+      </w:pPr>
+      <w:r>
+        <w:rPr>
+          <w:rFonts w:ascii="Times New Roman" w:hAnsi="Times New Roman" w:cs="Times New Roman"/>
+          <w:sz w:val="22"/>
+          <w:szCs w:val="22"/>
+        </w:rPr>
+        <w:t>Idea Generation: E.g. “AI-IDEA</w:t>
+      </w:r>
+      <w:r>
+        <w:rPr>
+          <w:rFonts w:ascii="Times New Roman" w:hAnsi="Times New Roman" w:cs="Times New Roman"/>
+          <w:sz w:val="22"/>
+          <w:szCs w:val="22"/>
+        </w:rPr>
+        <w:t>-11”</w:t>
       </w:r>
     </w:p>
     <w:p>
@@ -154,13 +192,17 @@
         </w:numPr>
         <w:rPr>
           <w:rFonts w:ascii="Times New Roman" w:hAnsi="Times New Roman" w:cs="Times New Roman"/>
-        </w:rPr>
-      </w:pPr>
-      <w:r>
-        <w:rPr>
-          <w:rFonts w:ascii="Times New Roman" w:hAnsi="Times New Roman" w:cs="Times New Roman"/>
-        </w:rPr>
-        <w:t>Analysis: E.g. “AI-ANA-55”</w:t>
+          <w:sz w:val="22"/>
+          <w:szCs w:val="22"/>
+        </w:rPr>
+      </w:pPr>
+      <w:r>
+        <w:rPr>
+          <w:rFonts w:ascii="Times New Roman" w:hAnsi="Times New Roman" w:cs="Times New Roman"/>
+          <w:sz w:val="22"/>
+          <w:szCs w:val="22"/>
+        </w:rPr>
+        <w:t>Coding: E.g. “AI-CODE-12”</w:t>
       </w:r>
     </w:p>
     <w:p>
@@ -172,13 +214,17 @@
         </w:numPr>
         <w:rPr>
           <w:rFonts w:ascii="Times New Roman" w:hAnsi="Times New Roman" w:cs="Times New Roman"/>
-        </w:rPr>
-      </w:pPr>
-      <w:r>
-        <w:rPr>
-          <w:rFonts w:ascii="Times New Roman" w:hAnsi="Times New Roman" w:cs="Times New Roman"/>
-        </w:rPr>
-        <w:t>Design: E.g.” AI-DES-91”</w:t>
+          <w:sz w:val="22"/>
+          <w:szCs w:val="22"/>
+        </w:rPr>
+      </w:pPr>
+      <w:r>
+        <w:rPr>
+          <w:rFonts w:ascii="Times New Roman" w:hAnsi="Times New Roman" w:cs="Times New Roman"/>
+          <w:sz w:val="22"/>
+          <w:szCs w:val="22"/>
+        </w:rPr>
+        <w:t>Analysis: E.g. “AI-ANA-55”</w:t>
       </w:r>
     </w:p>
     <w:p>
@@ -190,13 +236,17 @@
         </w:numPr>
         <w:rPr>
           <w:rFonts w:ascii="Times New Roman" w:hAnsi="Times New Roman" w:cs="Times New Roman"/>
-        </w:rPr>
-      </w:pPr>
-      <w:r>
-        <w:rPr>
-          <w:rFonts w:ascii="Times New Roman" w:hAnsi="Times New Roman" w:cs="Times New Roman"/>
-        </w:rPr>
-        <w:t>Debug: E.g. “AI-DEB-83”</w:t>
+          <w:sz w:val="22"/>
+          <w:szCs w:val="22"/>
+        </w:rPr>
+      </w:pPr>
+      <w:r>
+        <w:rPr>
+          <w:rFonts w:ascii="Times New Roman" w:hAnsi="Times New Roman" w:cs="Times New Roman"/>
+          <w:sz w:val="22"/>
+          <w:szCs w:val="22"/>
+        </w:rPr>
+        <w:t>Design: E.g.” AI-DES-91”</w:t>
       </w:r>
     </w:p>
     <w:p>
@@ -208,13 +258,17 @@
         </w:numPr>
         <w:rPr>
           <w:rFonts w:ascii="Times New Roman" w:hAnsi="Times New Roman" w:cs="Times New Roman"/>
-        </w:rPr>
-      </w:pPr>
-      <w:r>
-        <w:rPr>
-          <w:rFonts w:ascii="Times New Roman" w:hAnsi="Times New Roman" w:cs="Times New Roman"/>
-        </w:rPr>
-        <w:t>Review documentation: E.g. “AI-REV-32”</w:t>
+          <w:sz w:val="22"/>
+          <w:szCs w:val="22"/>
+        </w:rPr>
+      </w:pPr>
+      <w:r>
+        <w:rPr>
+          <w:rFonts w:ascii="Times New Roman" w:hAnsi="Times New Roman" w:cs="Times New Roman"/>
+          <w:sz w:val="22"/>
+          <w:szCs w:val="22"/>
+        </w:rPr>
+        <w:t>Debug: E.g. “AI-DEB-83”</w:t>
       </w:r>
     </w:p>
     <w:p>
@@ -226,126 +280,190 @@
         </w:numPr>
         <w:rPr>
           <w:rFonts w:ascii="Times New Roman" w:hAnsi="Times New Roman" w:cs="Times New Roman"/>
-        </w:rPr>
-      </w:pPr>
-      <w:r>
-        <w:rPr>
-          <w:rFonts w:ascii="Times New Roman" w:hAnsi="Times New Roman" w:cs="Times New Roman"/>
-        </w:rPr>
-        <w:t>Test: E.g. “AI-TEST-2”</w:t>
+          <w:sz w:val="22"/>
+          <w:szCs w:val="22"/>
+        </w:rPr>
+      </w:pPr>
+      <w:r>
+        <w:rPr>
+          <w:rFonts w:ascii="Times New Roman" w:hAnsi="Times New Roman" w:cs="Times New Roman"/>
+          <w:sz w:val="22"/>
+          <w:szCs w:val="22"/>
+        </w:rPr>
+        <w:t>Review documentation: E.g. “AI-REV-32”</w:t>
       </w:r>
     </w:p>
     <w:p>
       <w:pPr>
-        <w:rPr>
-          <w:rFonts w:ascii="Times New Roman" w:hAnsi="Times New Roman" w:cs="Times New Roman"/>
-        </w:rPr>
-      </w:pPr>
-      <w:r>
-        <w:rPr>
-          <w:rFonts w:ascii="Times New Roman" w:hAnsi="Times New Roman" w:cs="Times New Roman"/>
+        <w:pStyle w:val="ListParagraph"/>
+        <w:numPr>
+          <w:ilvl w:val="1"/>
+          <w:numId w:val="1"/>
+        </w:numPr>
+        <w:rPr>
+          <w:rFonts w:ascii="Times New Roman" w:hAnsi="Times New Roman" w:cs="Times New Roman"/>
+          <w:sz w:val="22"/>
+          <w:szCs w:val="22"/>
+        </w:rPr>
+      </w:pPr>
+      <w:r>
+        <w:rPr>
+          <w:rFonts w:ascii="Times New Roman" w:hAnsi="Times New Roman" w:cs="Times New Roman"/>
+          <w:sz w:val="22"/>
+          <w:szCs w:val="22"/>
+        </w:rPr>
+        <w:t>Test: E.g. “AI-TEST-2”</w:t>
+      </w:r>
+    </w:p>
+    <w:p>
+      <w:pPr>
+        <w:rPr>
+          <w:rFonts w:ascii="Times New Roman" w:hAnsi="Times New Roman" w:cs="Times New Roman"/>
+          <w:sz w:val="22"/>
+          <w:szCs w:val="22"/>
+        </w:rPr>
+      </w:pPr>
+      <w:r>
+        <w:rPr>
+          <w:rFonts w:ascii="Times New Roman" w:hAnsi="Times New Roman" w:cs="Times New Roman"/>
+          <w:sz w:val="22"/>
+          <w:szCs w:val="22"/>
         </w:rPr>
         <w:t>If</w:t>
       </w:r>
       <w:r>
         <w:rPr>
           <w:rFonts w:ascii="Times New Roman" w:hAnsi="Times New Roman" w:cs="Times New Roman"/>
+          <w:sz w:val="22"/>
+          <w:szCs w:val="22"/>
         </w:rPr>
         <w:t xml:space="preserve"> more ID naming standards are required</w:t>
       </w:r>
       <w:r>
         <w:rPr>
           <w:rFonts w:ascii="Times New Roman" w:hAnsi="Times New Roman" w:cs="Times New Roman"/>
+          <w:sz w:val="22"/>
+          <w:szCs w:val="22"/>
         </w:rPr>
         <w:t xml:space="preserve"> for more project variety tasks</w:t>
       </w:r>
       <w:r>
         <w:rPr>
           <w:rFonts w:ascii="Times New Roman" w:hAnsi="Times New Roman" w:cs="Times New Roman"/>
+          <w:sz w:val="22"/>
+          <w:szCs w:val="22"/>
         </w:rPr>
         <w:t xml:space="preserve">, inform lead of this so that more standards can be discussed and approved or rejected. These ones at the top are simply </w:t>
       </w:r>
       <w:r>
         <w:rPr>
           <w:rFonts w:ascii="Times New Roman" w:hAnsi="Times New Roman" w:cs="Times New Roman"/>
+          <w:sz w:val="22"/>
+          <w:szCs w:val="22"/>
         </w:rPr>
         <w:t>base AI ID naming conventions</w:t>
       </w:r>
       <w:r>
         <w:rPr>
           <w:rFonts w:ascii="Times New Roman" w:hAnsi="Times New Roman" w:cs="Times New Roman"/>
+          <w:sz w:val="22"/>
+          <w:szCs w:val="22"/>
         </w:rPr>
         <w:t xml:space="preserve"> for known project elements</w:t>
       </w:r>
       <w:r>
         <w:rPr>
           <w:rFonts w:ascii="Times New Roman" w:hAnsi="Times New Roman" w:cs="Times New Roman"/>
+          <w:sz w:val="22"/>
+          <w:szCs w:val="22"/>
         </w:rPr>
         <w:t>.</w:t>
       </w:r>
       <w:r>
         <w:rPr>
           <w:rFonts w:ascii="Times New Roman" w:hAnsi="Times New Roman" w:cs="Times New Roman"/>
+          <w:sz w:val="22"/>
+          <w:szCs w:val="22"/>
         </w:rPr>
         <w:t xml:space="preserve"> Also</w:t>
       </w:r>
       <w:r>
         <w:rPr>
           <w:rFonts w:ascii="Times New Roman" w:hAnsi="Times New Roman" w:cs="Times New Roman"/>
+          <w:sz w:val="22"/>
+          <w:szCs w:val="22"/>
         </w:rPr>
         <w:t xml:space="preserve">, if a person used AI for research for the first time, he/she will write </w:t>
       </w:r>
       <w:r>
         <w:rPr>
           <w:rFonts w:ascii="Times New Roman" w:hAnsi="Times New Roman" w:cs="Times New Roman"/>
+          <w:sz w:val="22"/>
+          <w:szCs w:val="22"/>
         </w:rPr>
         <w:t>“</w:t>
       </w:r>
       <w:r>
         <w:rPr>
           <w:rFonts w:ascii="Times New Roman" w:hAnsi="Times New Roman" w:cs="Times New Roman"/>
+          <w:sz w:val="22"/>
+          <w:szCs w:val="22"/>
         </w:rPr>
         <w:t>AI-RES-1</w:t>
       </w:r>
       <w:r>
         <w:rPr>
           <w:rFonts w:ascii="Times New Roman" w:hAnsi="Times New Roman" w:cs="Times New Roman"/>
+          <w:sz w:val="22"/>
+          <w:szCs w:val="22"/>
         </w:rPr>
         <w:t>”</w:t>
       </w:r>
       <w:r>
         <w:rPr>
           <w:rFonts w:ascii="Times New Roman" w:hAnsi="Times New Roman" w:cs="Times New Roman"/>
+          <w:sz w:val="22"/>
+          <w:szCs w:val="22"/>
         </w:rPr>
         <w:t xml:space="preserve"> but if </w:t>
       </w:r>
       <w:r>
         <w:rPr>
           <w:rFonts w:ascii="Times New Roman" w:hAnsi="Times New Roman" w:cs="Times New Roman"/>
+          <w:sz w:val="22"/>
+          <w:szCs w:val="22"/>
         </w:rPr>
         <w:t xml:space="preserve">he/she uses AI to debug code, do not increment the ID number, write </w:t>
       </w:r>
       <w:r>
         <w:rPr>
           <w:rFonts w:ascii="Times New Roman" w:hAnsi="Times New Roman" w:cs="Times New Roman"/>
+          <w:sz w:val="22"/>
+          <w:szCs w:val="22"/>
         </w:rPr>
         <w:t>“</w:t>
       </w:r>
       <w:r>
         <w:rPr>
           <w:rFonts w:ascii="Times New Roman" w:hAnsi="Times New Roman" w:cs="Times New Roman"/>
+          <w:sz w:val="22"/>
+          <w:szCs w:val="22"/>
         </w:rPr>
         <w:t>AI-</w:t>
       </w:r>
       <w:r>
         <w:rPr>
           <w:rFonts w:ascii="Times New Roman" w:hAnsi="Times New Roman" w:cs="Times New Roman"/>
+          <w:sz w:val="22"/>
+          <w:szCs w:val="22"/>
         </w:rPr>
         <w:t>DEB-1”. Only increment the ID number once the AI has assisted more than once in a specific usage such as research</w:t>
       </w:r>
       <w:r>
         <w:rPr>
           <w:rFonts w:ascii="Times New Roman" w:hAnsi="Times New Roman" w:cs="Times New Roman"/>
+          <w:sz w:val="22"/>
+          <w:szCs w:val="22"/>
         </w:rPr>
         <w:t xml:space="preserve"> and debug.</w:t>
       </w:r>
@@ -359,37 +477,17 @@
         </w:numPr>
         <w:rPr>
           <w:rFonts w:ascii="Times New Roman" w:hAnsi="Times New Roman" w:cs="Times New Roman"/>
-        </w:rPr>
-      </w:pPr>
-      <w:r>
-        <w:rPr>
-          <w:rFonts w:ascii="Times New Roman" w:hAnsi="Times New Roman" w:cs="Times New Roman"/>
-        </w:rPr>
-        <w:t xml:space="preserve">Date: This is the date on which the team member acquired the usage of AI. For </w:t>
-      </w:r>
-      <w:r>
-        <w:rPr>
-          <w:rFonts w:ascii="Times New Roman" w:hAnsi="Times New Roman" w:cs="Times New Roman"/>
-        </w:rPr>
-        <w:t>conciseness, keep the date format such as “25/</w:t>
-      </w:r>
-      <w:r>
-        <w:rPr>
-          <w:rFonts w:ascii="Times New Roman" w:hAnsi="Times New Roman" w:cs="Times New Roman"/>
-        </w:rPr>
-        <w:t>06/2026</w:t>
-      </w:r>
-      <w:r>
-        <w:rPr>
-          <w:rFonts w:ascii="Times New Roman" w:hAnsi="Times New Roman" w:cs="Times New Roman"/>
-        </w:rPr>
-        <w:t>”</w:t>
-      </w:r>
-      <w:r>
-        <w:rPr>
-          <w:rFonts w:ascii="Times New Roman" w:hAnsi="Times New Roman" w:cs="Times New Roman"/>
-        </w:rPr>
-        <w:t>.</w:t>
+          <w:sz w:val="22"/>
+          <w:szCs w:val="22"/>
+        </w:rPr>
+      </w:pPr>
+      <w:r>
+        <w:rPr>
+          <w:rFonts w:ascii="Times New Roman" w:hAnsi="Times New Roman" w:cs="Times New Roman"/>
+          <w:sz w:val="22"/>
+          <w:szCs w:val="22"/>
+        </w:rPr>
+        <w:t>Team member: This is the full name of the team member who used AI.</w:t>
       </w:r>
     </w:p>
     <w:p>
@@ -401,25 +499,49 @@
         </w:numPr>
         <w:rPr>
           <w:rFonts w:ascii="Times New Roman" w:hAnsi="Times New Roman" w:cs="Times New Roman"/>
-        </w:rPr>
-      </w:pPr>
-      <w:r>
-        <w:rPr>
-          <w:rFonts w:ascii="Times New Roman" w:hAnsi="Times New Roman" w:cs="Times New Roman"/>
-        </w:rPr>
-        <w:t xml:space="preserve">Tool: This is the tool that </w:t>
-      </w:r>
-      <w:r>
-        <w:rPr>
-          <w:rFonts w:ascii="Times New Roman" w:hAnsi="Times New Roman" w:cs="Times New Roman"/>
-        </w:rPr>
-        <w:t xml:space="preserve">a team member </w:t>
-      </w:r>
-      <w:r>
-        <w:rPr>
-          <w:rFonts w:ascii="Times New Roman" w:hAnsi="Times New Roman" w:cs="Times New Roman"/>
-        </w:rPr>
-        <w:t>used, in other words, name the AI tool. E.g. “Gemini”.</w:t>
+          <w:sz w:val="22"/>
+          <w:szCs w:val="22"/>
+        </w:rPr>
+      </w:pPr>
+      <w:r>
+        <w:rPr>
+          <w:rFonts w:ascii="Times New Roman" w:hAnsi="Times New Roman" w:cs="Times New Roman"/>
+          <w:sz w:val="22"/>
+          <w:szCs w:val="22"/>
+        </w:rPr>
+        <w:t xml:space="preserve">Date: This is the date on which the team member acquired the usage of AI. For </w:t>
+      </w:r>
+      <w:r>
+        <w:rPr>
+          <w:rFonts w:ascii="Times New Roman" w:hAnsi="Times New Roman" w:cs="Times New Roman"/>
+          <w:sz w:val="22"/>
+          <w:szCs w:val="22"/>
+        </w:rPr>
+        <w:t>conciseness, keep the date format such as “25/</w:t>
+      </w:r>
+      <w:r>
+        <w:rPr>
+          <w:rFonts w:ascii="Times New Roman" w:hAnsi="Times New Roman" w:cs="Times New Roman"/>
+          <w:sz w:val="22"/>
+          <w:szCs w:val="22"/>
+        </w:rPr>
+        <w:t>06/2026</w:t>
+      </w:r>
+      <w:r>
+        <w:rPr>
+          <w:rFonts w:ascii="Times New Roman" w:hAnsi="Times New Roman" w:cs="Times New Roman"/>
+          <w:sz w:val="22"/>
+          <w:szCs w:val="22"/>
+        </w:rPr>
+        <w:t>”</w:t>
+      </w:r>
+      <w:r>
+        <w:rPr>
+          <w:rFonts w:ascii="Times New Roman" w:hAnsi="Times New Roman" w:cs="Times New Roman"/>
+          <w:sz w:val="22"/>
+          <w:szCs w:val="22"/>
+        </w:rPr>
+        <w:t>.</w:t>
       </w:r>
     </w:p>
     <w:p>
@@ -431,31 +553,33 @@
         </w:numPr>
         <w:rPr>
           <w:rFonts w:ascii="Times New Roman" w:hAnsi="Times New Roman" w:cs="Times New Roman"/>
-        </w:rPr>
-      </w:pPr>
-      <w:r>
-        <w:rPr>
-          <w:rFonts w:ascii="Times New Roman" w:hAnsi="Times New Roman" w:cs="Times New Roman"/>
-        </w:rPr>
-        <w:t xml:space="preserve">Engineering Task: </w:t>
-      </w:r>
-      <w:r>
-        <w:rPr>
-          <w:rFonts w:ascii="Times New Roman" w:hAnsi="Times New Roman" w:cs="Times New Roman"/>
-        </w:rPr>
-        <w:t xml:space="preserve">Team member must explain why they </w:t>
-      </w:r>
-      <w:r>
-        <w:rPr>
-          <w:rFonts w:ascii="Times New Roman" w:hAnsi="Times New Roman" w:cs="Times New Roman"/>
-        </w:rPr>
-        <w:t xml:space="preserve">used the AI tool. </w:t>
-      </w:r>
-      <w:r>
-        <w:rPr>
-          <w:rFonts w:ascii="Times New Roman" w:hAnsi="Times New Roman" w:cs="Times New Roman"/>
-        </w:rPr>
-        <w:t>How did it assist for the project?</w:t>
+          <w:sz w:val="22"/>
+          <w:szCs w:val="22"/>
+        </w:rPr>
+      </w:pPr>
+      <w:r>
+        <w:rPr>
+          <w:rFonts w:ascii="Times New Roman" w:hAnsi="Times New Roman" w:cs="Times New Roman"/>
+          <w:sz w:val="22"/>
+          <w:szCs w:val="22"/>
+        </w:rPr>
+        <w:t xml:space="preserve">Tool: This is the tool that </w:t>
+      </w:r>
+      <w:r>
+        <w:rPr>
+          <w:rFonts w:ascii="Times New Roman" w:hAnsi="Times New Roman" w:cs="Times New Roman"/>
+          <w:sz w:val="22"/>
+          <w:szCs w:val="22"/>
+        </w:rPr>
+        <w:t xml:space="preserve">a team member </w:t>
+      </w:r>
+      <w:r>
+        <w:rPr>
+          <w:rFonts w:ascii="Times New Roman" w:hAnsi="Times New Roman" w:cs="Times New Roman"/>
+          <w:sz w:val="22"/>
+          <w:szCs w:val="22"/>
+        </w:rPr>
+        <w:t>used, in other words, name the AI tool. E.g. “Gemini”.</w:t>
       </w:r>
     </w:p>
     <w:p>
@@ -467,25 +591,41 @@
         </w:numPr>
         <w:rPr>
           <w:rFonts w:ascii="Times New Roman" w:hAnsi="Times New Roman" w:cs="Times New Roman"/>
-        </w:rPr>
-      </w:pPr>
-      <w:r>
-        <w:rPr>
-          <w:rFonts w:ascii="Times New Roman" w:hAnsi="Times New Roman" w:cs="Times New Roman"/>
-        </w:rPr>
-        <w:t xml:space="preserve">AI contribution: Write down what the AI contributed for the engineering task. Do not copy and paste the actual response from AI, simply summarize what the AI contributed for </w:t>
-      </w:r>
-      <w:r>
-        <w:rPr>
-          <w:rFonts w:ascii="Times New Roman" w:hAnsi="Times New Roman" w:cs="Times New Roman"/>
-        </w:rPr>
-        <w:t>the</w:t>
-      </w:r>
-      <w:r>
-        <w:rPr>
-          <w:rFonts w:ascii="Times New Roman" w:hAnsi="Times New Roman" w:cs="Times New Roman"/>
-        </w:rPr>
-        <w:t xml:space="preserve"> task.</w:t>
+          <w:sz w:val="22"/>
+          <w:szCs w:val="22"/>
+        </w:rPr>
+      </w:pPr>
+      <w:r>
+        <w:rPr>
+          <w:rFonts w:ascii="Times New Roman" w:hAnsi="Times New Roman" w:cs="Times New Roman"/>
+          <w:sz w:val="22"/>
+          <w:szCs w:val="22"/>
+        </w:rPr>
+        <w:t xml:space="preserve">Engineering Task: </w:t>
+      </w:r>
+      <w:r>
+        <w:rPr>
+          <w:rFonts w:ascii="Times New Roman" w:hAnsi="Times New Roman" w:cs="Times New Roman"/>
+          <w:sz w:val="22"/>
+          <w:szCs w:val="22"/>
+        </w:rPr>
+        <w:t xml:space="preserve">Team member must explain why they </w:t>
+      </w:r>
+      <w:r>
+        <w:rPr>
+          <w:rFonts w:ascii="Times New Roman" w:hAnsi="Times New Roman" w:cs="Times New Roman"/>
+          <w:sz w:val="22"/>
+          <w:szCs w:val="22"/>
+        </w:rPr>
+        <w:t xml:space="preserve">used the AI tool. </w:t>
+      </w:r>
+      <w:r>
+        <w:rPr>
+          <w:rFonts w:ascii="Times New Roman" w:hAnsi="Times New Roman" w:cs="Times New Roman"/>
+          <w:sz w:val="22"/>
+          <w:szCs w:val="22"/>
+        </w:rPr>
+        <w:t>How did it assist for the project?</w:t>
       </w:r>
     </w:p>
     <w:p>
@@ -497,37 +637,33 @@
         </w:numPr>
         <w:rPr>
           <w:rFonts w:ascii="Times New Roman" w:hAnsi="Times New Roman" w:cs="Times New Roman"/>
-        </w:rPr>
-      </w:pPr>
-      <w:r>
-        <w:rPr>
-          <w:rFonts w:ascii="Times New Roman" w:hAnsi="Times New Roman" w:cs="Times New Roman"/>
-        </w:rPr>
-        <w:t xml:space="preserve">Verification: </w:t>
-      </w:r>
-      <w:r>
-        <w:rPr>
-          <w:rFonts w:ascii="Times New Roman" w:hAnsi="Times New Roman" w:cs="Times New Roman"/>
-        </w:rPr>
-        <w:t>How did a team member</w:t>
-      </w:r>
-      <w:r>
-        <w:rPr>
-          <w:rFonts w:ascii="Times New Roman" w:hAnsi="Times New Roman" w:cs="Times New Roman"/>
-        </w:rPr>
-        <w:t xml:space="preserve"> check that the AI’s claim or assistance is correct? E.g. If </w:t>
-      </w:r>
-      <w:r>
-        <w:rPr>
-          <w:rFonts w:ascii="Times New Roman" w:hAnsi="Times New Roman" w:cs="Times New Roman"/>
-        </w:rPr>
-        <w:t xml:space="preserve">a team member asked AI to guide research, </w:t>
-      </w:r>
-      <w:r>
-        <w:rPr>
-          <w:rFonts w:ascii="Times New Roman" w:hAnsi="Times New Roman" w:cs="Times New Roman"/>
-        </w:rPr>
-        <w:t>verify the AI’s claim by seeing if the resources recommended has not been fabricated and exists on Google Scholar.</w:t>
+          <w:sz w:val="22"/>
+          <w:szCs w:val="22"/>
+        </w:rPr>
+      </w:pPr>
+      <w:r>
+        <w:rPr>
+          <w:rFonts w:ascii="Times New Roman" w:hAnsi="Times New Roman" w:cs="Times New Roman"/>
+          <w:sz w:val="22"/>
+          <w:szCs w:val="22"/>
+        </w:rPr>
+        <w:t xml:space="preserve">AI contribution: Write down what the AI contributed for the engineering task. Do not copy and paste the actual response from AI, simply summarize what the AI contributed for </w:t>
+      </w:r>
+      <w:r>
+        <w:rPr>
+          <w:rFonts w:ascii="Times New Roman" w:hAnsi="Times New Roman" w:cs="Times New Roman"/>
+          <w:sz w:val="22"/>
+          <w:szCs w:val="22"/>
+        </w:rPr>
+        <w:t>the</w:t>
+      </w:r>
+      <w:r>
+        <w:rPr>
+          <w:rFonts w:ascii="Times New Roman" w:hAnsi="Times New Roman" w:cs="Times New Roman"/>
+          <w:sz w:val="22"/>
+          <w:szCs w:val="22"/>
+        </w:rPr>
+        <w:t xml:space="preserve"> task.</w:t>
       </w:r>
     </w:p>
     <w:p>
@@ -539,13 +675,49 @@
         </w:numPr>
         <w:rPr>
           <w:rFonts w:ascii="Times New Roman" w:hAnsi="Times New Roman" w:cs="Times New Roman"/>
-        </w:rPr>
-      </w:pPr>
-      <w:r>
-        <w:rPr>
-          <w:rFonts w:ascii="Times New Roman" w:hAnsi="Times New Roman" w:cs="Times New Roman"/>
-        </w:rPr>
-        <w:t>Decision: This is where a team member decides if they will accept the AI’s assistance or if they reject it. Simply write “ACCEPT” or “REJECT”.</w:t>
+          <w:sz w:val="22"/>
+          <w:szCs w:val="22"/>
+        </w:rPr>
+      </w:pPr>
+      <w:r>
+        <w:rPr>
+          <w:rFonts w:ascii="Times New Roman" w:hAnsi="Times New Roman" w:cs="Times New Roman"/>
+          <w:sz w:val="22"/>
+          <w:szCs w:val="22"/>
+        </w:rPr>
+        <w:t xml:space="preserve">Verification: </w:t>
+      </w:r>
+      <w:r>
+        <w:rPr>
+          <w:rFonts w:ascii="Times New Roman" w:hAnsi="Times New Roman" w:cs="Times New Roman"/>
+          <w:sz w:val="22"/>
+          <w:szCs w:val="22"/>
+        </w:rPr>
+        <w:t>How did a team member</w:t>
+      </w:r>
+      <w:r>
+        <w:rPr>
+          <w:rFonts w:ascii="Times New Roman" w:hAnsi="Times New Roman" w:cs="Times New Roman"/>
+          <w:sz w:val="22"/>
+          <w:szCs w:val="22"/>
+        </w:rPr>
+        <w:t xml:space="preserve"> check that the AI’s claim or assistance is correct? E.g. If </w:t>
+      </w:r>
+      <w:r>
+        <w:rPr>
+          <w:rFonts w:ascii="Times New Roman" w:hAnsi="Times New Roman" w:cs="Times New Roman"/>
+          <w:sz w:val="22"/>
+          <w:szCs w:val="22"/>
+        </w:rPr>
+        <w:t xml:space="preserve">a team member asked AI to guide research, </w:t>
+      </w:r>
+      <w:r>
+        <w:rPr>
+          <w:rFonts w:ascii="Times New Roman" w:hAnsi="Times New Roman" w:cs="Times New Roman"/>
+          <w:sz w:val="22"/>
+          <w:szCs w:val="22"/>
+        </w:rPr>
+        <w:t>verify the AI’s claim by seeing if the resources recommended has not been fabricated and exists on Google Scholar.</w:t>
       </w:r>
     </w:p>
     <w:p>
@@ -557,42 +729,112 @@
         </w:numPr>
         <w:rPr>
           <w:rFonts w:ascii="Times New Roman" w:hAnsi="Times New Roman" w:cs="Times New Roman"/>
-        </w:rPr>
-      </w:pPr>
-      <w:r>
-        <w:rPr>
-          <w:rFonts w:ascii="Times New Roman" w:hAnsi="Times New Roman" w:cs="Times New Roman"/>
-        </w:rPr>
-        <w:t xml:space="preserve">Issues Found: If AI did not contribute well and issues were found </w:t>
-      </w:r>
-      <w:r>
-        <w:rPr>
-          <w:rFonts w:ascii="Times New Roman" w:hAnsi="Times New Roman" w:cs="Times New Roman"/>
-        </w:rPr>
-        <w:t>when a team member asked AI for assistance, write down what went wrong.</w:t>
-      </w:r>
+          <w:sz w:val="22"/>
+          <w:szCs w:val="22"/>
+        </w:rPr>
+      </w:pPr>
+      <w:r>
+        <w:rPr>
+          <w:rFonts w:ascii="Times New Roman" w:hAnsi="Times New Roman" w:cs="Times New Roman"/>
+          <w:sz w:val="22"/>
+          <w:szCs w:val="22"/>
+        </w:rPr>
+        <w:t xml:space="preserve">Decision: This is where a team member decides if they will accept the AI’s assistance or if they reject it. Simply write </w:t>
+      </w:r>
+      <w:r>
+        <w:rPr>
+          <w:rFonts w:ascii="Times New Roman" w:hAnsi="Times New Roman" w:cs="Times New Roman"/>
+          <w:sz w:val="22"/>
+          <w:szCs w:val="22"/>
+        </w:rPr>
+        <w:t>what was accepted</w:t>
+      </w:r>
+      <w:r>
+        <w:rPr>
+          <w:rFonts w:ascii="Times New Roman" w:hAnsi="Times New Roman" w:cs="Times New Roman"/>
+          <w:sz w:val="22"/>
+          <w:szCs w:val="22"/>
+        </w:rPr>
+        <w:t>, changed, or</w:t>
+      </w:r>
+      <w:r>
+        <w:rPr>
+          <w:rFonts w:ascii="Times New Roman" w:hAnsi="Times New Roman" w:cs="Times New Roman"/>
+          <w:sz w:val="22"/>
+          <w:szCs w:val="22"/>
+        </w:rPr>
+        <w:t xml:space="preserve"> rejected</w:t>
+      </w:r>
+      <w:r>
+        <w:rPr>
+          <w:rFonts w:ascii="Times New Roman" w:hAnsi="Times New Roman" w:cs="Times New Roman"/>
+          <w:sz w:val="22"/>
+          <w:szCs w:val="22"/>
+        </w:rPr>
+        <w:t xml:space="preserve"> from AI.</w:t>
+      </w:r>
+    </w:p>
+    <w:p>
+      <w:pPr>
+        <w:pStyle w:val="ListParagraph"/>
+        <w:numPr>
+          <w:ilvl w:val="0"/>
+          <w:numId w:val="1"/>
+        </w:numPr>
+        <w:rPr>
+          <w:rFonts w:ascii="Times New Roman" w:hAnsi="Times New Roman" w:cs="Times New Roman"/>
+          <w:sz w:val="22"/>
+          <w:szCs w:val="22"/>
+        </w:rPr>
+      </w:pPr>
+      <w:r>
+        <w:rPr>
+          <w:rFonts w:ascii="Times New Roman" w:hAnsi="Times New Roman" w:cs="Times New Roman"/>
+          <w:sz w:val="22"/>
+          <w:szCs w:val="22"/>
+        </w:rPr>
+        <w:t>Issues Found: If AI did not contribute well and issues were found when a team member asked AI for assistance, write down what went wrong.</w:t>
+      </w:r>
+    </w:p>
+    <w:p>
+      <w:pPr>
+        <w:ind w:left="360"/>
+        <w:rPr>
+          <w:rFonts w:ascii="Times New Roman" w:hAnsi="Times New Roman" w:cs="Times New Roman"/>
+        </w:rPr>
+      </w:pPr>
+    </w:p>
+    <w:p>
+      <w:pPr>
+        <w:pStyle w:val="ListParagraph"/>
+        <w:ind w:left="1440"/>
+        <w:rPr>
+          <w:rFonts w:ascii="Times New Roman" w:hAnsi="Times New Roman" w:cs="Times New Roman"/>
+        </w:rPr>
+      </w:pPr>
     </w:p>
     <w:tbl>
       <w:tblPr>
         <w:tblStyle w:val="TableGrid"/>
-        <w:tblpPr w:leftFromText="180" w:rightFromText="180" w:vertAnchor="text" w:horzAnchor="margin" w:tblpXSpec="center" w:tblpY="-1013"/>
-        <w:tblW w:w="11058" w:type="dxa"/>
+        <w:tblpPr w:leftFromText="180" w:rightFromText="180" w:vertAnchor="text" w:horzAnchor="margin" w:tblpXSpec="center" w:tblpY="-1014"/>
+        <w:tblW w:w="11148" w:type="dxa"/>
         <w:tblLook w:val="04A0" w:firstRow="1" w:lastRow="0" w:firstColumn="1" w:lastColumn="0" w:noHBand="0" w:noVBand="1"/>
       </w:tblPr>
       <w:tblGrid>
-        <w:gridCol w:w="988"/>
-        <w:gridCol w:w="998"/>
+        <w:gridCol w:w="987"/>
+        <w:gridCol w:w="1402"/>
         <w:gridCol w:w="1134"/>
-        <w:gridCol w:w="1489"/>
-        <w:gridCol w:w="1771"/>
-        <w:gridCol w:w="1979"/>
-        <w:gridCol w:w="1134"/>
-        <w:gridCol w:w="1565"/>
+        <w:gridCol w:w="850"/>
+        <w:gridCol w:w="1407"/>
+        <w:gridCol w:w="1544"/>
+        <w:gridCol w:w="1602"/>
+        <w:gridCol w:w="1149"/>
+        <w:gridCol w:w="1073"/>
       </w:tblGrid>
       <w:tr>
         <w:tc>
           <w:tcPr>
-            <w:tcW w:w="988" w:type="dxa"/>
+            <w:tcW w:w="987" w:type="dxa"/>
             <w:shd w:val="clear" w:color="auto" w:fill="0F4761" w:themeFill="accent1" w:themeFillShade="BF"/>
           </w:tcPr>
           <w:p>
@@ -616,7 +858,7 @@
         </w:tc>
         <w:tc>
           <w:tcPr>
-            <w:tcW w:w="998" w:type="dxa"/>
+            <w:tcW w:w="1402" w:type="dxa"/>
             <w:shd w:val="clear" w:color="auto" w:fill="0F4761" w:themeFill="accent1" w:themeFillShade="BF"/>
           </w:tcPr>
           <w:p>
@@ -633,7 +875,7 @@
                 <w:sz w:val="20"/>
                 <w:szCs w:val="20"/>
               </w:rPr>
-              <w:t>Date</w:t>
+              <w:t>Team member</w:t>
             </w:r>
           </w:p>
         </w:tc>
@@ -656,13 +898,36 @@
                 <w:sz w:val="20"/>
                 <w:szCs w:val="20"/>
               </w:rPr>
+              <w:t>Date</w:t>
+            </w:r>
+          </w:p>
+        </w:tc>
+        <w:tc>
+          <w:tcPr>
+            <w:tcW w:w="850" w:type="dxa"/>
+            <w:shd w:val="clear" w:color="auto" w:fill="0F4761" w:themeFill="accent1" w:themeFillShade="BF"/>
+          </w:tcPr>
+          <w:p>
+            <w:pPr>
+              <w:rPr>
+                <w:rFonts w:ascii="Times New Roman" w:hAnsi="Times New Roman" w:cs="Times New Roman"/>
+                <w:sz w:val="20"/>
+                <w:szCs w:val="20"/>
+              </w:rPr>
+            </w:pPr>
+            <w:r>
+              <w:rPr>
+                <w:rFonts w:ascii="Times New Roman" w:hAnsi="Times New Roman" w:cs="Times New Roman"/>
+                <w:sz w:val="20"/>
+                <w:szCs w:val="20"/>
+              </w:rPr>
               <w:t>Tool</w:t>
             </w:r>
           </w:p>
         </w:tc>
         <w:tc>
           <w:tcPr>
-            <w:tcW w:w="1489" w:type="dxa"/>
+            <w:tcW w:w="1407" w:type="dxa"/>
             <w:shd w:val="clear" w:color="auto" w:fill="0F4761" w:themeFill="accent1" w:themeFillShade="BF"/>
           </w:tcPr>
           <w:p>
@@ -685,7 +950,7 @@
         </w:tc>
         <w:tc>
           <w:tcPr>
-            <w:tcW w:w="1771" w:type="dxa"/>
+            <w:tcW w:w="1544" w:type="dxa"/>
             <w:shd w:val="clear" w:color="auto" w:fill="0F4761" w:themeFill="accent1" w:themeFillShade="BF"/>
           </w:tcPr>
           <w:p>
@@ -708,7 +973,7 @@
         </w:tc>
         <w:tc>
           <w:tcPr>
-            <w:tcW w:w="1979" w:type="dxa"/>
+            <w:tcW w:w="1602" w:type="dxa"/>
             <w:shd w:val="clear" w:color="auto" w:fill="0F4761" w:themeFill="accent1" w:themeFillShade="BF"/>
           </w:tcPr>
           <w:p>
@@ -731,7 +996,7 @@
         </w:tc>
         <w:tc>
           <w:tcPr>
-            <w:tcW w:w="1134" w:type="dxa"/>
+            <w:tcW w:w="1149" w:type="dxa"/>
             <w:shd w:val="clear" w:color="auto" w:fill="0F4761" w:themeFill="accent1" w:themeFillShade="BF"/>
           </w:tcPr>
           <w:p>
@@ -754,7 +1019,7 @@
         </w:tc>
         <w:tc>
           <w:tcPr>
-            <w:tcW w:w="1565" w:type="dxa"/>
+            <w:tcW w:w="1073" w:type="dxa"/>
             <w:shd w:val="clear" w:color="auto" w:fill="0F4761" w:themeFill="accent1" w:themeFillShade="BF"/>
           </w:tcPr>
           <w:p>
@@ -779,7 +1044,7 @@
       <w:tr>
         <w:tc>
           <w:tcPr>
-            <w:tcW w:w="988" w:type="dxa"/>
+            <w:tcW w:w="987" w:type="dxa"/>
           </w:tcPr>
           <w:p>
             <w:pPr>
@@ -793,7 +1058,7 @@
         </w:tc>
         <w:tc>
           <w:tcPr>
-            <w:tcW w:w="998" w:type="dxa"/>
+            <w:tcW w:w="1402" w:type="dxa"/>
           </w:tcPr>
           <w:p>
             <w:pPr>
@@ -821,7 +1086,7 @@
         </w:tc>
         <w:tc>
           <w:tcPr>
-            <w:tcW w:w="1489" w:type="dxa"/>
+            <w:tcW w:w="850" w:type="dxa"/>
           </w:tcPr>
           <w:p>
             <w:pPr>
@@ -835,7 +1100,7 @@
         </w:tc>
         <w:tc>
           <w:tcPr>
-            <w:tcW w:w="1771" w:type="dxa"/>
+            <w:tcW w:w="1407" w:type="dxa"/>
           </w:tcPr>
           <w:p>
             <w:pPr>
@@ -849,7 +1114,79 @@
         </w:tc>
         <w:tc>
           <w:tcPr>
-            <w:tcW w:w="1979" w:type="dxa"/>
+            <w:tcW w:w="1544" w:type="dxa"/>
+          </w:tcPr>
+          <w:p>
+            <w:pPr>
+              <w:rPr>
+                <w:rFonts w:ascii="Times New Roman" w:hAnsi="Times New Roman" w:cs="Times New Roman"/>
+                <w:sz w:val="20"/>
+                <w:szCs w:val="20"/>
+              </w:rPr>
+            </w:pPr>
+          </w:p>
+        </w:tc>
+        <w:tc>
+          <w:tcPr>
+            <w:tcW w:w="1602" w:type="dxa"/>
+          </w:tcPr>
+          <w:p>
+            <w:pPr>
+              <w:rPr>
+                <w:rFonts w:ascii="Times New Roman" w:hAnsi="Times New Roman" w:cs="Times New Roman"/>
+                <w:sz w:val="20"/>
+                <w:szCs w:val="20"/>
+              </w:rPr>
+            </w:pPr>
+          </w:p>
+        </w:tc>
+        <w:tc>
+          <w:tcPr>
+            <w:tcW w:w="1149" w:type="dxa"/>
+          </w:tcPr>
+          <w:p>
+            <w:pPr>
+              <w:rPr>
+                <w:rFonts w:ascii="Times New Roman" w:hAnsi="Times New Roman" w:cs="Times New Roman"/>
+                <w:sz w:val="20"/>
+                <w:szCs w:val="20"/>
+              </w:rPr>
+            </w:pPr>
+          </w:p>
+        </w:tc>
+        <w:tc>
+          <w:tcPr>
+            <w:tcW w:w="1073" w:type="dxa"/>
+          </w:tcPr>
+          <w:p>
+            <w:pPr>
+              <w:rPr>
+                <w:rFonts w:ascii="Times New Roman" w:hAnsi="Times New Roman" w:cs="Times New Roman"/>
+                <w:sz w:val="20"/>
+                <w:szCs w:val="20"/>
+              </w:rPr>
+            </w:pPr>
+          </w:p>
+        </w:tc>
+      </w:tr>
+      <w:tr>
+        <w:tc>
+          <w:tcPr>
+            <w:tcW w:w="987" w:type="dxa"/>
+          </w:tcPr>
+          <w:p>
+            <w:pPr>
+              <w:rPr>
+                <w:rFonts w:ascii="Times New Roman" w:hAnsi="Times New Roman" w:cs="Times New Roman"/>
+                <w:sz w:val="20"/>
+                <w:szCs w:val="20"/>
+              </w:rPr>
+            </w:pPr>
+          </w:p>
+        </w:tc>
+        <w:tc>
+          <w:tcPr>
+            <w:tcW w:w="1402" w:type="dxa"/>
           </w:tcPr>
           <w:p>
             <w:pPr>
@@ -877,23 +1214,7 @@
         </w:tc>
         <w:tc>
           <w:tcPr>
-            <w:tcW w:w="1565" w:type="dxa"/>
-          </w:tcPr>
-          <w:p>
-            <w:pPr>
-              <w:rPr>
-                <w:rFonts w:ascii="Times New Roman" w:hAnsi="Times New Roman" w:cs="Times New Roman"/>
-                <w:sz w:val="20"/>
-                <w:szCs w:val="20"/>
-              </w:rPr>
-            </w:pPr>
-          </w:p>
-        </w:tc>
-      </w:tr>
-      <w:tr>
-        <w:tc>
-          <w:tcPr>
-            <w:tcW w:w="988" w:type="dxa"/>
+            <w:tcW w:w="850" w:type="dxa"/>
           </w:tcPr>
           <w:p>
             <w:pPr>
@@ -907,7 +1228,7 @@
         </w:tc>
         <w:tc>
           <w:tcPr>
-            <w:tcW w:w="998" w:type="dxa"/>
+            <w:tcW w:w="1407" w:type="dxa"/>
           </w:tcPr>
           <w:p>
             <w:pPr>
@@ -921,7 +1242,7 @@
         </w:tc>
         <w:tc>
           <w:tcPr>
-            <w:tcW w:w="1134" w:type="dxa"/>
+            <w:tcW w:w="1544" w:type="dxa"/>
           </w:tcPr>
           <w:p>
             <w:pPr>
@@ -935,7 +1256,7 @@
         </w:tc>
         <w:tc>
           <w:tcPr>
-            <w:tcW w:w="1489" w:type="dxa"/>
+            <w:tcW w:w="1602" w:type="dxa"/>
           </w:tcPr>
           <w:p>
             <w:pPr>
@@ -949,7 +1270,7 @@
         </w:tc>
         <w:tc>
           <w:tcPr>
-            <w:tcW w:w="1771" w:type="dxa"/>
+            <w:tcW w:w="1149" w:type="dxa"/>
           </w:tcPr>
           <w:p>
             <w:pPr>
@@ -963,35 +1284,7 @@
         </w:tc>
         <w:tc>
           <w:tcPr>
-            <w:tcW w:w="1979" w:type="dxa"/>
-          </w:tcPr>
-          <w:p>
-            <w:pPr>
-              <w:rPr>
-                <w:rFonts w:ascii="Times New Roman" w:hAnsi="Times New Roman" w:cs="Times New Roman"/>
-                <w:sz w:val="20"/>
-                <w:szCs w:val="20"/>
-              </w:rPr>
-            </w:pPr>
-          </w:p>
-        </w:tc>
-        <w:tc>
-          <w:tcPr>
-            <w:tcW w:w="1134" w:type="dxa"/>
-          </w:tcPr>
-          <w:p>
-            <w:pPr>
-              <w:rPr>
-                <w:rFonts w:ascii="Times New Roman" w:hAnsi="Times New Roman" w:cs="Times New Roman"/>
-                <w:sz w:val="20"/>
-                <w:szCs w:val="20"/>
-              </w:rPr>
-            </w:pPr>
-          </w:p>
-        </w:tc>
-        <w:tc>
-          <w:tcPr>
-            <w:tcW w:w="1565" w:type="dxa"/>
+            <w:tcW w:w="1073" w:type="dxa"/>
           </w:tcPr>
           <w:p>
             <w:pPr>
@@ -1005,23 +1298,6 @@
         </w:tc>
       </w:tr>
     </w:tbl>
-    <w:p>
-      <w:pPr>
-        <w:ind w:left="360"/>
-        <w:rPr>
-          <w:rFonts w:ascii="Times New Roman" w:hAnsi="Times New Roman" w:cs="Times New Roman"/>
-        </w:rPr>
-      </w:pPr>
-    </w:p>
-    <w:p>
-      <w:pPr>
-        <w:pStyle w:val="ListParagraph"/>
-        <w:ind w:left="1440"/>
-        <w:rPr>
-          <w:rFonts w:ascii="Times New Roman" w:hAnsi="Times New Roman" w:cs="Times New Roman"/>
-        </w:rPr>
-      </w:pPr>
-    </w:p>
     <w:p>
       <w:pPr>
         <w:rPr>

</xml_diff>

<commit_message>
Added AI usages regarding AI Register, GOVERNANCE and README
Included how AI was used to solve initial README commit description, idea suggestions for AI usage IDs, as well as proper styling for GOVERNANCE file.
</commit_message>
<xml_diff>
--- a/docs/ai-usage-register.docx
+++ b/docs/ai-usage-register.docx
@@ -821,15 +821,15 @@
         <w:tblLook w:val="04A0" w:firstRow="1" w:lastRow="0" w:firstColumn="1" w:lastColumn="0" w:noHBand="0" w:noVBand="1"/>
       </w:tblPr>
       <w:tblGrid>
-        <w:gridCol w:w="987"/>
-        <w:gridCol w:w="1402"/>
-        <w:gridCol w:w="1134"/>
-        <w:gridCol w:w="850"/>
-        <w:gridCol w:w="1407"/>
-        <w:gridCol w:w="1544"/>
-        <w:gridCol w:w="1602"/>
-        <w:gridCol w:w="1149"/>
-        <w:gridCol w:w="1073"/>
+        <w:gridCol w:w="974"/>
+        <w:gridCol w:w="1133"/>
+        <w:gridCol w:w="1129"/>
+        <w:gridCol w:w="823"/>
+        <w:gridCol w:w="1966"/>
+        <w:gridCol w:w="1966"/>
+        <w:gridCol w:w="1247"/>
+        <w:gridCol w:w="1114"/>
+        <w:gridCol w:w="796"/>
       </w:tblGrid>
       <w:tr>
         <w:tc>
@@ -1054,6 +1054,23 @@
                 <w:szCs w:val="20"/>
               </w:rPr>
             </w:pPr>
+            <w:r>
+              <w:rPr>
+                <w:rFonts w:ascii="Times New Roman" w:hAnsi="Times New Roman" w:cs="Times New Roman"/>
+                <w:sz w:val="20"/>
+                <w:szCs w:val="20"/>
+              </w:rPr>
+              <w:t>AI-DEBUG-1</w:t>
+            </w:r>
+          </w:p>
+          <w:p>
+            <w:pPr>
+              <w:rPr>
+                <w:rFonts w:ascii="Times New Roman" w:hAnsi="Times New Roman" w:cs="Times New Roman"/>
+                <w:sz w:val="20"/>
+                <w:szCs w:val="20"/>
+              </w:rPr>
+            </w:pPr>
           </w:p>
         </w:tc>
         <w:tc>
@@ -1068,6 +1085,23 @@
                 <w:szCs w:val="20"/>
               </w:rPr>
             </w:pPr>
+            <w:r>
+              <w:rPr>
+                <w:rFonts w:ascii="Times New Roman" w:hAnsi="Times New Roman" w:cs="Times New Roman"/>
+                <w:sz w:val="20"/>
+                <w:szCs w:val="20"/>
+              </w:rPr>
+              <w:t>Benno Weideman</w:t>
+            </w:r>
+          </w:p>
+          <w:p>
+            <w:pPr>
+              <w:rPr>
+                <w:rFonts w:ascii="Times New Roman" w:hAnsi="Times New Roman" w:cs="Times New Roman"/>
+                <w:sz w:val="20"/>
+                <w:szCs w:val="20"/>
+              </w:rPr>
+            </w:pPr>
           </w:p>
         </w:tc>
         <w:tc>
@@ -1082,6 +1116,23 @@
                 <w:szCs w:val="20"/>
               </w:rPr>
             </w:pPr>
+            <w:r>
+              <w:rPr>
+                <w:rFonts w:ascii="Times New Roman" w:hAnsi="Times New Roman" w:cs="Times New Roman"/>
+                <w:sz w:val="20"/>
+                <w:szCs w:val="20"/>
+              </w:rPr>
+              <w:t>04/09/2026</w:t>
+            </w:r>
+          </w:p>
+          <w:p>
+            <w:pPr>
+              <w:rPr>
+                <w:rFonts w:ascii="Times New Roman" w:hAnsi="Times New Roman" w:cs="Times New Roman"/>
+                <w:sz w:val="20"/>
+                <w:szCs w:val="20"/>
+              </w:rPr>
+            </w:pPr>
           </w:p>
         </w:tc>
         <w:tc>
@@ -1096,6 +1147,14 @@
                 <w:szCs w:val="20"/>
               </w:rPr>
             </w:pPr>
+            <w:r>
+              <w:rPr>
+                <w:rFonts w:ascii="Times New Roman" w:hAnsi="Times New Roman" w:cs="Times New Roman"/>
+                <w:sz w:val="20"/>
+                <w:szCs w:val="20"/>
+              </w:rPr>
+              <w:t>Gemini</w:t>
+            </w:r>
           </w:p>
         </w:tc>
         <w:tc>
@@ -1110,6 +1169,39 @@
                 <w:szCs w:val="20"/>
               </w:rPr>
             </w:pPr>
+            <w:r>
+              <w:rPr>
+                <w:rFonts w:ascii="Times New Roman" w:hAnsi="Times New Roman" w:cs="Times New Roman"/>
+                <w:sz w:val="20"/>
+                <w:szCs w:val="20"/>
+              </w:rPr>
+              <w:t>Edit initial commit</w:t>
+            </w:r>
+            <w:r>
+              <w:rPr>
+                <w:rFonts w:ascii="Times New Roman" w:hAnsi="Times New Roman" w:cs="Times New Roman"/>
+                <w:sz w:val="20"/>
+                <w:szCs w:val="20"/>
+              </w:rPr>
+              <w:t xml:space="preserve"> of README</w:t>
+            </w:r>
+            <w:r>
+              <w:rPr>
+                <w:rFonts w:ascii="Times New Roman" w:hAnsi="Times New Roman" w:cs="Times New Roman"/>
+                <w:sz w:val="20"/>
+                <w:szCs w:val="20"/>
+              </w:rPr>
+              <w:t xml:space="preserve"> to have a clear description</w:t>
+            </w:r>
+          </w:p>
+          <w:p>
+            <w:pPr>
+              <w:rPr>
+                <w:rFonts w:ascii="Times New Roman" w:hAnsi="Times New Roman" w:cs="Times New Roman"/>
+                <w:sz w:val="20"/>
+                <w:szCs w:val="20"/>
+              </w:rPr>
+            </w:pPr>
           </w:p>
         </w:tc>
         <w:tc>
@@ -1124,6 +1216,23 @@
                 <w:szCs w:val="20"/>
               </w:rPr>
             </w:pPr>
+            <w:r>
+              <w:rPr>
+                <w:rFonts w:ascii="Times New Roman" w:hAnsi="Times New Roman" w:cs="Times New Roman"/>
+                <w:sz w:val="20"/>
+                <w:szCs w:val="20"/>
+              </w:rPr>
+              <w:t>Create fresh main branch. Create initial commit with clear description.  Delete original main branch and rename fresh main to main. Force overwrites the new main to GitHub.</w:t>
+            </w:r>
+          </w:p>
+          <w:p>
+            <w:pPr>
+              <w:rPr>
+                <w:rFonts w:ascii="Times New Roman" w:hAnsi="Times New Roman" w:cs="Times New Roman"/>
+                <w:sz w:val="20"/>
+                <w:szCs w:val="20"/>
+              </w:rPr>
+            </w:pPr>
           </w:p>
         </w:tc>
         <w:tc>
@@ -1138,6 +1247,55 @@
                 <w:szCs w:val="20"/>
               </w:rPr>
             </w:pPr>
+            <w:r>
+              <w:rPr>
+                <w:rFonts w:ascii="Times New Roman" w:hAnsi="Times New Roman" w:cs="Times New Roman"/>
+                <w:sz w:val="20"/>
+                <w:szCs w:val="20"/>
+              </w:rPr>
+              <w:t>M</w:t>
+            </w:r>
+            <w:r>
+              <w:rPr>
+                <w:rFonts w:ascii="Times New Roman" w:hAnsi="Times New Roman" w:cs="Times New Roman"/>
+                <w:sz w:val="20"/>
+                <w:szCs w:val="20"/>
+              </w:rPr>
+              <w:t xml:space="preserve">anually checked the repository and locally on machine, the </w:t>
+            </w:r>
+            <w:r>
+              <w:rPr>
+                <w:rFonts w:ascii="Times New Roman" w:hAnsi="Times New Roman" w:cs="Times New Roman"/>
+                <w:sz w:val="20"/>
+                <w:szCs w:val="20"/>
+              </w:rPr>
+              <w:t>README</w:t>
+            </w:r>
+            <w:r>
+              <w:rPr>
+                <w:rFonts w:ascii="Times New Roman" w:hAnsi="Times New Roman" w:cs="Times New Roman"/>
+                <w:sz w:val="20"/>
+                <w:szCs w:val="20"/>
+              </w:rPr>
+              <w:t xml:space="preserve"> is there</w:t>
+            </w:r>
+            <w:r>
+              <w:rPr>
+                <w:rFonts w:ascii="Times New Roman" w:hAnsi="Times New Roman" w:cs="Times New Roman"/>
+                <w:sz w:val="20"/>
+                <w:szCs w:val="20"/>
+              </w:rPr>
+              <w:t xml:space="preserve"> with a clear description other than “Initial commit”.</w:t>
+            </w:r>
+          </w:p>
+          <w:p>
+            <w:pPr>
+              <w:rPr>
+                <w:rFonts w:ascii="Times New Roman" w:hAnsi="Times New Roman" w:cs="Times New Roman"/>
+                <w:sz w:val="20"/>
+                <w:szCs w:val="20"/>
+              </w:rPr>
+            </w:pPr>
           </w:p>
         </w:tc>
         <w:tc>
@@ -1152,6 +1310,23 @@
                 <w:szCs w:val="20"/>
               </w:rPr>
             </w:pPr>
+            <w:r>
+              <w:rPr>
+                <w:rFonts w:ascii="Times New Roman" w:hAnsi="Times New Roman" w:cs="Times New Roman"/>
+                <w:sz w:val="20"/>
+                <w:szCs w:val="20"/>
+              </w:rPr>
+              <w:t>Entire suggestion was accepted and applied to fix commit.</w:t>
+            </w:r>
+          </w:p>
+          <w:p>
+            <w:pPr>
+              <w:rPr>
+                <w:rFonts w:ascii="Times New Roman" w:hAnsi="Times New Roman" w:cs="Times New Roman"/>
+                <w:sz w:val="20"/>
+                <w:szCs w:val="20"/>
+              </w:rPr>
+            </w:pPr>
           </w:p>
         </w:tc>
         <w:tc>
@@ -1166,6 +1341,14 @@
                 <w:szCs w:val="20"/>
               </w:rPr>
             </w:pPr>
+            <w:r>
+              <w:rPr>
+                <w:rFonts w:ascii="Times New Roman" w:hAnsi="Times New Roman" w:cs="Times New Roman"/>
+                <w:sz w:val="20"/>
+                <w:szCs w:val="20"/>
+              </w:rPr>
+              <w:t>None</w:t>
+            </w:r>
           </w:p>
         </w:tc>
       </w:tr>
@@ -1182,6 +1365,23 @@
                 <w:szCs w:val="20"/>
               </w:rPr>
             </w:pPr>
+            <w:r>
+              <w:rPr>
+                <w:rFonts w:ascii="Times New Roman" w:hAnsi="Times New Roman" w:cs="Times New Roman"/>
+                <w:sz w:val="20"/>
+                <w:szCs w:val="20"/>
+              </w:rPr>
+              <w:t>AI-IDEA-1</w:t>
+            </w:r>
+          </w:p>
+          <w:p>
+            <w:pPr>
+              <w:rPr>
+                <w:rFonts w:ascii="Times New Roman" w:hAnsi="Times New Roman" w:cs="Times New Roman"/>
+                <w:sz w:val="20"/>
+                <w:szCs w:val="20"/>
+              </w:rPr>
+            </w:pPr>
           </w:p>
         </w:tc>
         <w:tc>
@@ -1196,6 +1396,23 @@
                 <w:szCs w:val="20"/>
               </w:rPr>
             </w:pPr>
+            <w:r>
+              <w:rPr>
+                <w:rFonts w:ascii="Times New Roman" w:hAnsi="Times New Roman" w:cs="Times New Roman"/>
+                <w:sz w:val="20"/>
+                <w:szCs w:val="20"/>
+              </w:rPr>
+              <w:t>Benno Weideman</w:t>
+            </w:r>
+          </w:p>
+          <w:p>
+            <w:pPr>
+              <w:rPr>
+                <w:rFonts w:ascii="Times New Roman" w:hAnsi="Times New Roman" w:cs="Times New Roman"/>
+                <w:sz w:val="20"/>
+                <w:szCs w:val="20"/>
+              </w:rPr>
+            </w:pPr>
           </w:p>
         </w:tc>
         <w:tc>
@@ -1210,6 +1427,23 @@
                 <w:szCs w:val="20"/>
               </w:rPr>
             </w:pPr>
+            <w:r>
+              <w:rPr>
+                <w:rFonts w:ascii="Times New Roman" w:hAnsi="Times New Roman" w:cs="Times New Roman"/>
+                <w:sz w:val="20"/>
+                <w:szCs w:val="20"/>
+              </w:rPr>
+              <w:t>05/09/2026</w:t>
+            </w:r>
+          </w:p>
+          <w:p>
+            <w:pPr>
+              <w:rPr>
+                <w:rFonts w:ascii="Times New Roman" w:hAnsi="Times New Roman" w:cs="Times New Roman"/>
+                <w:sz w:val="20"/>
+                <w:szCs w:val="20"/>
+              </w:rPr>
+            </w:pPr>
           </w:p>
         </w:tc>
         <w:tc>
@@ -1224,6 +1458,14 @@
                 <w:szCs w:val="20"/>
               </w:rPr>
             </w:pPr>
+            <w:r>
+              <w:rPr>
+                <w:rFonts w:ascii="Times New Roman" w:hAnsi="Times New Roman" w:cs="Times New Roman"/>
+                <w:sz w:val="20"/>
+                <w:szCs w:val="20"/>
+              </w:rPr>
+              <w:t>Gemini</w:t>
+            </w:r>
           </w:p>
         </w:tc>
         <w:tc>
@@ -1238,6 +1480,23 @@
                 <w:szCs w:val="20"/>
               </w:rPr>
             </w:pPr>
+            <w:r>
+              <w:rPr>
+                <w:rFonts w:ascii="Times New Roman" w:hAnsi="Times New Roman" w:cs="Times New Roman"/>
+                <w:sz w:val="20"/>
+                <w:szCs w:val="20"/>
+              </w:rPr>
+              <w:t>Idea generation of proper ID naming conventions for AI usage.</w:t>
+            </w:r>
+          </w:p>
+          <w:p>
+            <w:pPr>
+              <w:rPr>
+                <w:rFonts w:ascii="Times New Roman" w:hAnsi="Times New Roman" w:cs="Times New Roman"/>
+                <w:sz w:val="20"/>
+                <w:szCs w:val="20"/>
+              </w:rPr>
+            </w:pPr>
           </w:p>
         </w:tc>
         <w:tc>
@@ -1252,6 +1511,23 @@
                 <w:szCs w:val="20"/>
               </w:rPr>
             </w:pPr>
+            <w:r>
+              <w:rPr>
+                <w:rFonts w:ascii="Times New Roman" w:hAnsi="Times New Roman" w:cs="Times New Roman"/>
+                <w:sz w:val="20"/>
+                <w:szCs w:val="20"/>
+              </w:rPr>
+              <w:t>Suggested naming convention for IDs such as ai- “pmpt” and “resp”.</w:t>
+            </w:r>
+          </w:p>
+          <w:p>
+            <w:pPr>
+              <w:rPr>
+                <w:rFonts w:ascii="Times New Roman" w:hAnsi="Times New Roman" w:cs="Times New Roman"/>
+                <w:sz w:val="20"/>
+                <w:szCs w:val="20"/>
+              </w:rPr>
+            </w:pPr>
           </w:p>
         </w:tc>
         <w:tc>
@@ -1266,6 +1542,23 @@
                 <w:szCs w:val="20"/>
               </w:rPr>
             </w:pPr>
+            <w:r>
+              <w:rPr>
+                <w:rFonts w:ascii="Times New Roman" w:hAnsi="Times New Roman" w:cs="Times New Roman"/>
+                <w:sz w:val="20"/>
+                <w:szCs w:val="20"/>
+              </w:rPr>
+              <w:t>Visually checked the naming convention for ID and it is appropriate and concise.</w:t>
+            </w:r>
+          </w:p>
+          <w:p>
+            <w:pPr>
+              <w:rPr>
+                <w:rFonts w:ascii="Times New Roman" w:hAnsi="Times New Roman" w:cs="Times New Roman"/>
+                <w:sz w:val="20"/>
+                <w:szCs w:val="20"/>
+              </w:rPr>
+            </w:pPr>
           </w:p>
         </w:tc>
         <w:tc>
@@ -1273,6 +1566,16 @@
             <w:tcW w:w="1149" w:type="dxa"/>
           </w:tcPr>
           <w:p>
+            <w:r>
+              <w:rPr>
+                <w:rFonts w:ascii="Times New Roman" w:hAnsi="Times New Roman" w:cs="Times New Roman"/>
+                <w:sz w:val="20"/>
+                <w:szCs w:val="20"/>
+              </w:rPr>
+              <w:t>Accepted the naming convention but did not accept the word usage. Own words tailored to project was used such as DEBUG, RES, and REV.</w:t>
+            </w:r>
+          </w:p>
+          <w:p>
             <w:pPr>
               <w:rPr>
                 <w:rFonts w:ascii="Times New Roman" w:hAnsi="Times New Roman" w:cs="Times New Roman"/>
@@ -1294,6 +1597,214 @@
                 <w:szCs w:val="20"/>
               </w:rPr>
             </w:pPr>
+            <w:r>
+              <w:rPr>
+                <w:rFonts w:ascii="Times New Roman" w:hAnsi="Times New Roman" w:cs="Times New Roman"/>
+                <w:sz w:val="20"/>
+                <w:szCs w:val="20"/>
+              </w:rPr>
+              <w:t>None</w:t>
+            </w:r>
+          </w:p>
+        </w:tc>
+      </w:tr>
+      <w:tr>
+        <w:tc>
+          <w:tcPr>
+            <w:tcW w:w="987" w:type="dxa"/>
+          </w:tcPr>
+          <w:p>
+            <w:pPr>
+              <w:rPr>
+                <w:rFonts w:ascii="Times New Roman" w:hAnsi="Times New Roman" w:cs="Times New Roman"/>
+                <w:sz w:val="20"/>
+                <w:szCs w:val="20"/>
+              </w:rPr>
+            </w:pPr>
+            <w:r>
+              <w:rPr>
+                <w:rFonts w:ascii="Times New Roman" w:hAnsi="Times New Roman" w:cs="Times New Roman"/>
+                <w:sz w:val="20"/>
+                <w:szCs w:val="20"/>
+              </w:rPr>
+              <w:t>AI-FORM-1</w:t>
+            </w:r>
+          </w:p>
+        </w:tc>
+        <w:tc>
+          <w:tcPr>
+            <w:tcW w:w="1402" w:type="dxa"/>
+          </w:tcPr>
+          <w:p>
+            <w:pPr>
+              <w:rPr>
+                <w:rFonts w:ascii="Times New Roman" w:hAnsi="Times New Roman" w:cs="Times New Roman"/>
+                <w:sz w:val="20"/>
+                <w:szCs w:val="20"/>
+              </w:rPr>
+            </w:pPr>
+            <w:r>
+              <w:rPr>
+                <w:rFonts w:ascii="Times New Roman" w:hAnsi="Times New Roman" w:cs="Times New Roman"/>
+                <w:sz w:val="20"/>
+                <w:szCs w:val="20"/>
+              </w:rPr>
+              <w:t>Benno Weideman</w:t>
+            </w:r>
+          </w:p>
+        </w:tc>
+        <w:tc>
+          <w:tcPr>
+            <w:tcW w:w="1134" w:type="dxa"/>
+          </w:tcPr>
+          <w:p>
+            <w:pPr>
+              <w:rPr>
+                <w:rFonts w:ascii="Times New Roman" w:hAnsi="Times New Roman" w:cs="Times New Roman"/>
+                <w:sz w:val="20"/>
+                <w:szCs w:val="20"/>
+              </w:rPr>
+            </w:pPr>
+            <w:r>
+              <w:rPr>
+                <w:rFonts w:ascii="Times New Roman" w:hAnsi="Times New Roman" w:cs="Times New Roman"/>
+                <w:sz w:val="20"/>
+                <w:szCs w:val="20"/>
+              </w:rPr>
+              <w:t>05/09/2026</w:t>
+            </w:r>
+          </w:p>
+        </w:tc>
+        <w:tc>
+          <w:tcPr>
+            <w:tcW w:w="850" w:type="dxa"/>
+          </w:tcPr>
+          <w:p>
+            <w:pPr>
+              <w:rPr>
+                <w:rFonts w:ascii="Times New Roman" w:hAnsi="Times New Roman" w:cs="Times New Roman"/>
+                <w:sz w:val="20"/>
+                <w:szCs w:val="20"/>
+              </w:rPr>
+            </w:pPr>
+            <w:r>
+              <w:rPr>
+                <w:rFonts w:ascii="Times New Roman" w:hAnsi="Times New Roman" w:cs="Times New Roman"/>
+                <w:sz w:val="20"/>
+                <w:szCs w:val="20"/>
+              </w:rPr>
+              <w:t>Claude</w:t>
+            </w:r>
+          </w:p>
+        </w:tc>
+        <w:tc>
+          <w:tcPr>
+            <w:tcW w:w="1407" w:type="dxa"/>
+          </w:tcPr>
+          <w:p>
+            <w:pPr>
+              <w:rPr>
+                <w:rFonts w:ascii="Times New Roman" w:hAnsi="Times New Roman" w:cs="Times New Roman"/>
+                <w:sz w:val="20"/>
+                <w:szCs w:val="20"/>
+              </w:rPr>
+            </w:pPr>
+            <w:r>
+              <w:rPr>
+                <w:rFonts w:ascii="Times New Roman" w:hAnsi="Times New Roman" w:cs="Times New Roman"/>
+                <w:sz w:val="20"/>
+                <w:szCs w:val="20"/>
+              </w:rPr>
+              <w:t>Apply styling to GOVERNANCE.MD file.</w:t>
+            </w:r>
+          </w:p>
+        </w:tc>
+        <w:tc>
+          <w:tcPr>
+            <w:tcW w:w="1544" w:type="dxa"/>
+          </w:tcPr>
+          <w:p>
+            <w:pPr>
+              <w:rPr>
+                <w:rFonts w:ascii="Times New Roman" w:hAnsi="Times New Roman" w:cs="Times New Roman"/>
+                <w:sz w:val="20"/>
+                <w:szCs w:val="20"/>
+              </w:rPr>
+            </w:pPr>
+            <w:r>
+              <w:rPr>
+                <w:rFonts w:ascii="Times New Roman" w:hAnsi="Times New Roman" w:cs="Times New Roman"/>
+                <w:sz w:val="20"/>
+                <w:szCs w:val="20"/>
+              </w:rPr>
+              <w:t>AI applied styling to GOVERNANCE.MD file making it more appropriate and user friendly.</w:t>
+            </w:r>
+          </w:p>
+        </w:tc>
+        <w:tc>
+          <w:tcPr>
+            <w:tcW w:w="1602" w:type="dxa"/>
+          </w:tcPr>
+          <w:p>
+            <w:pPr>
+              <w:rPr>
+                <w:rFonts w:ascii="Times New Roman" w:hAnsi="Times New Roman" w:cs="Times New Roman"/>
+                <w:sz w:val="20"/>
+                <w:szCs w:val="20"/>
+              </w:rPr>
+            </w:pPr>
+            <w:r>
+              <w:rPr>
+                <w:rFonts w:ascii="Times New Roman" w:hAnsi="Times New Roman" w:cs="Times New Roman"/>
+                <w:sz w:val="20"/>
+                <w:szCs w:val="20"/>
+              </w:rPr>
+              <w:t>File looks visually appealing. Content was not changed.</w:t>
+            </w:r>
+          </w:p>
+        </w:tc>
+        <w:tc>
+          <w:tcPr>
+            <w:tcW w:w="1149" w:type="dxa"/>
+          </w:tcPr>
+          <w:p>
+            <w:pPr>
+              <w:rPr>
+                <w:rFonts w:ascii="Times New Roman" w:hAnsi="Times New Roman" w:cs="Times New Roman"/>
+                <w:sz w:val="20"/>
+                <w:szCs w:val="20"/>
+              </w:rPr>
+            </w:pPr>
+            <w:r>
+              <w:rPr>
+                <w:rFonts w:ascii="Times New Roman" w:hAnsi="Times New Roman" w:cs="Times New Roman"/>
+                <w:sz w:val="20"/>
+                <w:szCs w:val="20"/>
+              </w:rPr>
+              <w:t>Accept the entire change of styling.</w:t>
+            </w:r>
+          </w:p>
+        </w:tc>
+        <w:tc>
+          <w:tcPr>
+            <w:tcW w:w="1073" w:type="dxa"/>
+          </w:tcPr>
+          <w:p>
+            <w:pPr>
+              <w:rPr>
+                <w:rFonts w:ascii="Times New Roman" w:hAnsi="Times New Roman" w:cs="Times New Roman"/>
+                <w:sz w:val="20"/>
+                <w:szCs w:val="20"/>
+              </w:rPr>
+            </w:pPr>
+            <w:r>
+              <w:rPr>
+                <w:rFonts w:ascii="Times New Roman" w:hAnsi="Times New Roman" w:cs="Times New Roman"/>
+                <w:sz w:val="20"/>
+                <w:szCs w:val="20"/>
+              </w:rPr>
+              <w:t>None</w:t>
+            </w:r>
           </w:p>
         </w:tc>
       </w:tr>

</xml_diff>

<commit_message>
Update AI Usage Register
Added AI usages such as non-functional requirement resource search, past similar project search, answer structure resource for forward engineering considerations, and analysis on the sections of each resource.
</commit_message>
<xml_diff>
--- a/docs/ai-usage-register.docx
+++ b/docs/ai-usage-register.docx
@@ -817,39 +817,40 @@
       <w:tblPr>
         <w:tblStyle w:val="TableGrid"/>
         <w:tblpPr w:leftFromText="180" w:rightFromText="180" w:vertAnchor="text" w:horzAnchor="margin" w:tblpXSpec="center" w:tblpY="-1014"/>
-        <w:tblW w:w="11148" w:type="dxa"/>
+        <w:tblW w:w="12102" w:type="dxa"/>
+        <w:tblLayout w:type="fixed"/>
         <w:tblLook w:val="04A0" w:firstRow="1" w:lastRow="0" w:firstColumn="1" w:lastColumn="0" w:noHBand="0" w:noVBand="1"/>
       </w:tblPr>
       <w:tblGrid>
-        <w:gridCol w:w="974"/>
-        <w:gridCol w:w="1133"/>
-        <w:gridCol w:w="1129"/>
-        <w:gridCol w:w="823"/>
-        <w:gridCol w:w="1966"/>
-        <w:gridCol w:w="1966"/>
-        <w:gridCol w:w="1247"/>
-        <w:gridCol w:w="1114"/>
-        <w:gridCol w:w="796"/>
+        <w:gridCol w:w="955"/>
+        <w:gridCol w:w="1047"/>
+        <w:gridCol w:w="1107"/>
+        <w:gridCol w:w="801"/>
+        <w:gridCol w:w="1614"/>
+        <w:gridCol w:w="2551"/>
+        <w:gridCol w:w="1418"/>
+        <w:gridCol w:w="1513"/>
+        <w:gridCol w:w="1096"/>
       </w:tblGrid>
       <w:tr>
         <w:tc>
           <w:tcPr>
-            <w:tcW w:w="987" w:type="dxa"/>
+            <w:tcW w:w="955" w:type="dxa"/>
             <w:shd w:val="clear" w:color="auto" w:fill="0F4761" w:themeFill="accent1" w:themeFillShade="BF"/>
           </w:tcPr>
           <w:p>
             <w:pPr>
               <w:rPr>
                 <w:rFonts w:ascii="Times New Roman" w:hAnsi="Times New Roman" w:cs="Times New Roman"/>
-                <w:sz w:val="20"/>
-                <w:szCs w:val="20"/>
-              </w:rPr>
-            </w:pPr>
-            <w:r>
-              <w:rPr>
-                <w:rFonts w:ascii="Times New Roman" w:hAnsi="Times New Roman" w:cs="Times New Roman"/>
-                <w:sz w:val="20"/>
-                <w:szCs w:val="20"/>
+                <w:sz w:val="16"/>
+                <w:szCs w:val="16"/>
+              </w:rPr>
+            </w:pPr>
+            <w:r>
+              <w:rPr>
+                <w:rFonts w:ascii="Times New Roman" w:hAnsi="Times New Roman" w:cs="Times New Roman"/>
+                <w:sz w:val="16"/>
+                <w:szCs w:val="16"/>
               </w:rPr>
               <w:lastRenderedPageBreak/>
               <w:t>ID</w:t>
@@ -858,22 +859,22 @@
         </w:tc>
         <w:tc>
           <w:tcPr>
-            <w:tcW w:w="1402" w:type="dxa"/>
+            <w:tcW w:w="1047" w:type="dxa"/>
             <w:shd w:val="clear" w:color="auto" w:fill="0F4761" w:themeFill="accent1" w:themeFillShade="BF"/>
           </w:tcPr>
           <w:p>
             <w:pPr>
               <w:rPr>
                 <w:rFonts w:ascii="Times New Roman" w:hAnsi="Times New Roman" w:cs="Times New Roman"/>
-                <w:sz w:val="20"/>
-                <w:szCs w:val="20"/>
-              </w:rPr>
-            </w:pPr>
-            <w:r>
-              <w:rPr>
-                <w:rFonts w:ascii="Times New Roman" w:hAnsi="Times New Roman" w:cs="Times New Roman"/>
-                <w:sz w:val="20"/>
-                <w:szCs w:val="20"/>
+                <w:sz w:val="16"/>
+                <w:szCs w:val="16"/>
+              </w:rPr>
+            </w:pPr>
+            <w:r>
+              <w:rPr>
+                <w:rFonts w:ascii="Times New Roman" w:hAnsi="Times New Roman" w:cs="Times New Roman"/>
+                <w:sz w:val="16"/>
+                <w:szCs w:val="16"/>
               </w:rPr>
               <w:t>Team member</w:t>
             </w:r>
@@ -881,22 +882,22 @@
         </w:tc>
         <w:tc>
           <w:tcPr>
-            <w:tcW w:w="1134" w:type="dxa"/>
+            <w:tcW w:w="1107" w:type="dxa"/>
             <w:shd w:val="clear" w:color="auto" w:fill="0F4761" w:themeFill="accent1" w:themeFillShade="BF"/>
           </w:tcPr>
           <w:p>
             <w:pPr>
               <w:rPr>
                 <w:rFonts w:ascii="Times New Roman" w:hAnsi="Times New Roman" w:cs="Times New Roman"/>
-                <w:sz w:val="20"/>
-                <w:szCs w:val="20"/>
-              </w:rPr>
-            </w:pPr>
-            <w:r>
-              <w:rPr>
-                <w:rFonts w:ascii="Times New Roman" w:hAnsi="Times New Roman" w:cs="Times New Roman"/>
-                <w:sz w:val="20"/>
-                <w:szCs w:val="20"/>
+                <w:sz w:val="16"/>
+                <w:szCs w:val="16"/>
+              </w:rPr>
+            </w:pPr>
+            <w:r>
+              <w:rPr>
+                <w:rFonts w:ascii="Times New Roman" w:hAnsi="Times New Roman" w:cs="Times New Roman"/>
+                <w:sz w:val="16"/>
+                <w:szCs w:val="16"/>
               </w:rPr>
               <w:t>Date</w:t>
             </w:r>
@@ -904,22 +905,22 @@
         </w:tc>
         <w:tc>
           <w:tcPr>
-            <w:tcW w:w="850" w:type="dxa"/>
+            <w:tcW w:w="801" w:type="dxa"/>
             <w:shd w:val="clear" w:color="auto" w:fill="0F4761" w:themeFill="accent1" w:themeFillShade="BF"/>
           </w:tcPr>
           <w:p>
             <w:pPr>
               <w:rPr>
                 <w:rFonts w:ascii="Times New Roman" w:hAnsi="Times New Roman" w:cs="Times New Roman"/>
-                <w:sz w:val="20"/>
-                <w:szCs w:val="20"/>
-              </w:rPr>
-            </w:pPr>
-            <w:r>
-              <w:rPr>
-                <w:rFonts w:ascii="Times New Roman" w:hAnsi="Times New Roman" w:cs="Times New Roman"/>
-                <w:sz w:val="20"/>
-                <w:szCs w:val="20"/>
+                <w:sz w:val="16"/>
+                <w:szCs w:val="16"/>
+              </w:rPr>
+            </w:pPr>
+            <w:r>
+              <w:rPr>
+                <w:rFonts w:ascii="Times New Roman" w:hAnsi="Times New Roman" w:cs="Times New Roman"/>
+                <w:sz w:val="16"/>
+                <w:szCs w:val="16"/>
               </w:rPr>
               <w:t>Tool</w:t>
             </w:r>
@@ -927,22 +928,22 @@
         </w:tc>
         <w:tc>
           <w:tcPr>
-            <w:tcW w:w="1407" w:type="dxa"/>
+            <w:tcW w:w="1614" w:type="dxa"/>
             <w:shd w:val="clear" w:color="auto" w:fill="0F4761" w:themeFill="accent1" w:themeFillShade="BF"/>
           </w:tcPr>
           <w:p>
             <w:pPr>
               <w:rPr>
                 <w:rFonts w:ascii="Times New Roman" w:hAnsi="Times New Roman" w:cs="Times New Roman"/>
-                <w:sz w:val="20"/>
-                <w:szCs w:val="20"/>
-              </w:rPr>
-            </w:pPr>
-            <w:r>
-              <w:rPr>
-                <w:rFonts w:ascii="Times New Roman" w:hAnsi="Times New Roman" w:cs="Times New Roman"/>
-                <w:sz w:val="18"/>
-                <w:szCs w:val="18"/>
+                <w:sz w:val="16"/>
+                <w:szCs w:val="16"/>
+              </w:rPr>
+            </w:pPr>
+            <w:r>
+              <w:rPr>
+                <w:rFonts w:ascii="Times New Roman" w:hAnsi="Times New Roman" w:cs="Times New Roman"/>
+                <w:sz w:val="16"/>
+                <w:szCs w:val="16"/>
               </w:rPr>
               <w:t>Engineering task</w:t>
             </w:r>
@@ -950,22 +951,22 @@
         </w:tc>
         <w:tc>
           <w:tcPr>
-            <w:tcW w:w="1544" w:type="dxa"/>
+            <w:tcW w:w="2551" w:type="dxa"/>
             <w:shd w:val="clear" w:color="auto" w:fill="0F4761" w:themeFill="accent1" w:themeFillShade="BF"/>
           </w:tcPr>
           <w:p>
             <w:pPr>
               <w:rPr>
                 <w:rFonts w:ascii="Times New Roman" w:hAnsi="Times New Roman" w:cs="Times New Roman"/>
-                <w:sz w:val="20"/>
-                <w:szCs w:val="20"/>
-              </w:rPr>
-            </w:pPr>
-            <w:r>
-              <w:rPr>
-                <w:rFonts w:ascii="Times New Roman" w:hAnsi="Times New Roman" w:cs="Times New Roman"/>
-                <w:sz w:val="20"/>
-                <w:szCs w:val="20"/>
+                <w:sz w:val="16"/>
+                <w:szCs w:val="16"/>
+              </w:rPr>
+            </w:pPr>
+            <w:r>
+              <w:rPr>
+                <w:rFonts w:ascii="Times New Roman" w:hAnsi="Times New Roman" w:cs="Times New Roman"/>
+                <w:sz w:val="16"/>
+                <w:szCs w:val="16"/>
               </w:rPr>
               <w:t>AI contribution</w:t>
             </w:r>
@@ -973,22 +974,22 @@
         </w:tc>
         <w:tc>
           <w:tcPr>
-            <w:tcW w:w="1602" w:type="dxa"/>
+            <w:tcW w:w="1418" w:type="dxa"/>
             <w:shd w:val="clear" w:color="auto" w:fill="0F4761" w:themeFill="accent1" w:themeFillShade="BF"/>
           </w:tcPr>
           <w:p>
             <w:pPr>
               <w:rPr>
                 <w:rFonts w:ascii="Times New Roman" w:hAnsi="Times New Roman" w:cs="Times New Roman"/>
-                <w:sz w:val="20"/>
-                <w:szCs w:val="20"/>
-              </w:rPr>
-            </w:pPr>
-            <w:r>
-              <w:rPr>
-                <w:rFonts w:ascii="Times New Roman" w:hAnsi="Times New Roman" w:cs="Times New Roman"/>
-                <w:sz w:val="20"/>
-                <w:szCs w:val="20"/>
+                <w:sz w:val="16"/>
+                <w:szCs w:val="16"/>
+              </w:rPr>
+            </w:pPr>
+            <w:r>
+              <w:rPr>
+                <w:rFonts w:ascii="Times New Roman" w:hAnsi="Times New Roman" w:cs="Times New Roman"/>
+                <w:sz w:val="16"/>
+                <w:szCs w:val="16"/>
               </w:rPr>
               <w:t>Verification</w:t>
             </w:r>
@@ -996,22 +997,22 @@
         </w:tc>
         <w:tc>
           <w:tcPr>
-            <w:tcW w:w="1149" w:type="dxa"/>
+            <w:tcW w:w="1513" w:type="dxa"/>
             <w:shd w:val="clear" w:color="auto" w:fill="0F4761" w:themeFill="accent1" w:themeFillShade="BF"/>
           </w:tcPr>
           <w:p>
             <w:pPr>
               <w:rPr>
                 <w:rFonts w:ascii="Times New Roman" w:hAnsi="Times New Roman" w:cs="Times New Roman"/>
-                <w:sz w:val="20"/>
-                <w:szCs w:val="20"/>
-              </w:rPr>
-            </w:pPr>
-            <w:r>
-              <w:rPr>
-                <w:rFonts w:ascii="Times New Roman" w:hAnsi="Times New Roman" w:cs="Times New Roman"/>
-                <w:sz w:val="20"/>
-                <w:szCs w:val="20"/>
+                <w:sz w:val="16"/>
+                <w:szCs w:val="16"/>
+              </w:rPr>
+            </w:pPr>
+            <w:r>
+              <w:rPr>
+                <w:rFonts w:ascii="Times New Roman" w:hAnsi="Times New Roman" w:cs="Times New Roman"/>
+                <w:sz w:val="16"/>
+                <w:szCs w:val="16"/>
               </w:rPr>
               <w:t>Decision</w:t>
             </w:r>
@@ -1019,22 +1020,22 @@
         </w:tc>
         <w:tc>
           <w:tcPr>
-            <w:tcW w:w="1073" w:type="dxa"/>
+            <w:tcW w:w="1096" w:type="dxa"/>
             <w:shd w:val="clear" w:color="auto" w:fill="0F4761" w:themeFill="accent1" w:themeFillShade="BF"/>
           </w:tcPr>
           <w:p>
             <w:pPr>
               <w:rPr>
                 <w:rFonts w:ascii="Times New Roman" w:hAnsi="Times New Roman" w:cs="Times New Roman"/>
-                <w:sz w:val="20"/>
-                <w:szCs w:val="20"/>
-              </w:rPr>
-            </w:pPr>
-            <w:r>
-              <w:rPr>
-                <w:rFonts w:ascii="Times New Roman" w:hAnsi="Times New Roman" w:cs="Times New Roman"/>
-                <w:sz w:val="20"/>
-                <w:szCs w:val="20"/>
+                <w:sz w:val="16"/>
+                <w:szCs w:val="16"/>
+              </w:rPr>
+            </w:pPr>
+            <w:r>
+              <w:rPr>
+                <w:rFonts w:ascii="Times New Roman" w:hAnsi="Times New Roman" w:cs="Times New Roman"/>
+                <w:sz w:val="16"/>
+                <w:szCs w:val="16"/>
               </w:rPr>
               <w:t>Issues Found</w:t>
             </w:r>
@@ -1044,21 +1045,21 @@
       <w:tr>
         <w:tc>
           <w:tcPr>
-            <w:tcW w:w="987" w:type="dxa"/>
-          </w:tcPr>
-          <w:p>
-            <w:pPr>
-              <w:rPr>
-                <w:rFonts w:ascii="Times New Roman" w:hAnsi="Times New Roman" w:cs="Times New Roman"/>
-                <w:sz w:val="20"/>
-                <w:szCs w:val="20"/>
-              </w:rPr>
-            </w:pPr>
-            <w:r>
-              <w:rPr>
-                <w:rFonts w:ascii="Times New Roman" w:hAnsi="Times New Roman" w:cs="Times New Roman"/>
-                <w:sz w:val="20"/>
-                <w:szCs w:val="20"/>
+            <w:tcW w:w="955" w:type="dxa"/>
+          </w:tcPr>
+          <w:p>
+            <w:pPr>
+              <w:rPr>
+                <w:rFonts w:ascii="Times New Roman" w:hAnsi="Times New Roman" w:cs="Times New Roman"/>
+                <w:sz w:val="16"/>
+                <w:szCs w:val="16"/>
+              </w:rPr>
+            </w:pPr>
+            <w:r>
+              <w:rPr>
+                <w:rFonts w:ascii="Times New Roman" w:hAnsi="Times New Roman" w:cs="Times New Roman"/>
+                <w:sz w:val="16"/>
+                <w:szCs w:val="16"/>
               </w:rPr>
               <w:t>AI-DEBUG-1</w:t>
             </w:r>
@@ -1067,29 +1068,29 @@
             <w:pPr>
               <w:rPr>
                 <w:rFonts w:ascii="Times New Roman" w:hAnsi="Times New Roman" w:cs="Times New Roman"/>
-                <w:sz w:val="20"/>
-                <w:szCs w:val="20"/>
-              </w:rPr>
-            </w:pPr>
-          </w:p>
-        </w:tc>
-        <w:tc>
-          <w:tcPr>
-            <w:tcW w:w="1402" w:type="dxa"/>
-          </w:tcPr>
-          <w:p>
-            <w:pPr>
-              <w:rPr>
-                <w:rFonts w:ascii="Times New Roman" w:hAnsi="Times New Roman" w:cs="Times New Roman"/>
-                <w:sz w:val="20"/>
-                <w:szCs w:val="20"/>
-              </w:rPr>
-            </w:pPr>
-            <w:r>
-              <w:rPr>
-                <w:rFonts w:ascii="Times New Roman" w:hAnsi="Times New Roman" w:cs="Times New Roman"/>
-                <w:sz w:val="20"/>
-                <w:szCs w:val="20"/>
+                <w:sz w:val="16"/>
+                <w:szCs w:val="16"/>
+              </w:rPr>
+            </w:pPr>
+          </w:p>
+        </w:tc>
+        <w:tc>
+          <w:tcPr>
+            <w:tcW w:w="1047" w:type="dxa"/>
+          </w:tcPr>
+          <w:p>
+            <w:pPr>
+              <w:rPr>
+                <w:rFonts w:ascii="Times New Roman" w:hAnsi="Times New Roman" w:cs="Times New Roman"/>
+                <w:sz w:val="16"/>
+                <w:szCs w:val="16"/>
+              </w:rPr>
+            </w:pPr>
+            <w:r>
+              <w:rPr>
+                <w:rFonts w:ascii="Times New Roman" w:hAnsi="Times New Roman" w:cs="Times New Roman"/>
+                <w:sz w:val="16"/>
+                <w:szCs w:val="16"/>
               </w:rPr>
               <w:t>Benno Weideman</w:t>
             </w:r>
@@ -1098,29 +1099,29 @@
             <w:pPr>
               <w:rPr>
                 <w:rFonts w:ascii="Times New Roman" w:hAnsi="Times New Roman" w:cs="Times New Roman"/>
-                <w:sz w:val="20"/>
-                <w:szCs w:val="20"/>
-              </w:rPr>
-            </w:pPr>
-          </w:p>
-        </w:tc>
-        <w:tc>
-          <w:tcPr>
-            <w:tcW w:w="1134" w:type="dxa"/>
-          </w:tcPr>
-          <w:p>
-            <w:pPr>
-              <w:rPr>
-                <w:rFonts w:ascii="Times New Roman" w:hAnsi="Times New Roman" w:cs="Times New Roman"/>
-                <w:sz w:val="20"/>
-                <w:szCs w:val="20"/>
-              </w:rPr>
-            </w:pPr>
-            <w:r>
-              <w:rPr>
-                <w:rFonts w:ascii="Times New Roman" w:hAnsi="Times New Roman" w:cs="Times New Roman"/>
-                <w:sz w:val="20"/>
-                <w:szCs w:val="20"/>
+                <w:sz w:val="16"/>
+                <w:szCs w:val="16"/>
+              </w:rPr>
+            </w:pPr>
+          </w:p>
+        </w:tc>
+        <w:tc>
+          <w:tcPr>
+            <w:tcW w:w="1107" w:type="dxa"/>
+          </w:tcPr>
+          <w:p>
+            <w:pPr>
+              <w:rPr>
+                <w:rFonts w:ascii="Times New Roman" w:hAnsi="Times New Roman" w:cs="Times New Roman"/>
+                <w:sz w:val="16"/>
+                <w:szCs w:val="16"/>
+              </w:rPr>
+            </w:pPr>
+            <w:r>
+              <w:rPr>
+                <w:rFonts w:ascii="Times New Roman" w:hAnsi="Times New Roman" w:cs="Times New Roman"/>
+                <w:sz w:val="16"/>
+                <w:szCs w:val="16"/>
               </w:rPr>
               <w:t>04/09/2026</w:t>
             </w:r>
@@ -1129,29 +1130,29 @@
             <w:pPr>
               <w:rPr>
                 <w:rFonts w:ascii="Times New Roman" w:hAnsi="Times New Roman" w:cs="Times New Roman"/>
-                <w:sz w:val="20"/>
-                <w:szCs w:val="20"/>
-              </w:rPr>
-            </w:pPr>
-          </w:p>
-        </w:tc>
-        <w:tc>
-          <w:tcPr>
-            <w:tcW w:w="850" w:type="dxa"/>
-          </w:tcPr>
-          <w:p>
-            <w:pPr>
-              <w:rPr>
-                <w:rFonts w:ascii="Times New Roman" w:hAnsi="Times New Roman" w:cs="Times New Roman"/>
-                <w:sz w:val="20"/>
-                <w:szCs w:val="20"/>
-              </w:rPr>
-            </w:pPr>
-            <w:r>
-              <w:rPr>
-                <w:rFonts w:ascii="Times New Roman" w:hAnsi="Times New Roman" w:cs="Times New Roman"/>
-                <w:sz w:val="20"/>
-                <w:szCs w:val="20"/>
+                <w:sz w:val="16"/>
+                <w:szCs w:val="16"/>
+              </w:rPr>
+            </w:pPr>
+          </w:p>
+        </w:tc>
+        <w:tc>
+          <w:tcPr>
+            <w:tcW w:w="801" w:type="dxa"/>
+          </w:tcPr>
+          <w:p>
+            <w:pPr>
+              <w:rPr>
+                <w:rFonts w:ascii="Times New Roman" w:hAnsi="Times New Roman" w:cs="Times New Roman"/>
+                <w:sz w:val="16"/>
+                <w:szCs w:val="16"/>
+              </w:rPr>
+            </w:pPr>
+            <w:r>
+              <w:rPr>
+                <w:rFonts w:ascii="Times New Roman" w:hAnsi="Times New Roman" w:cs="Times New Roman"/>
+                <w:sz w:val="16"/>
+                <w:szCs w:val="16"/>
               </w:rPr>
               <w:t>Gemini</w:t>
             </w:r>
@@ -1159,68 +1160,52 @@
         </w:tc>
         <w:tc>
           <w:tcPr>
-            <w:tcW w:w="1407" w:type="dxa"/>
-          </w:tcPr>
-          <w:p>
-            <w:pPr>
-              <w:rPr>
-                <w:rFonts w:ascii="Times New Roman" w:hAnsi="Times New Roman" w:cs="Times New Roman"/>
-                <w:sz w:val="20"/>
-                <w:szCs w:val="20"/>
-              </w:rPr>
-            </w:pPr>
-            <w:r>
-              <w:rPr>
-                <w:rFonts w:ascii="Times New Roman" w:hAnsi="Times New Roman" w:cs="Times New Roman"/>
-                <w:sz w:val="20"/>
-                <w:szCs w:val="20"/>
-              </w:rPr>
-              <w:t>Edit initial commit</w:t>
-            </w:r>
-            <w:r>
-              <w:rPr>
-                <w:rFonts w:ascii="Times New Roman" w:hAnsi="Times New Roman" w:cs="Times New Roman"/>
-                <w:sz w:val="20"/>
-                <w:szCs w:val="20"/>
-              </w:rPr>
-              <w:t xml:space="preserve"> of README</w:t>
-            </w:r>
-            <w:r>
-              <w:rPr>
-                <w:rFonts w:ascii="Times New Roman" w:hAnsi="Times New Roman" w:cs="Times New Roman"/>
-                <w:sz w:val="20"/>
-                <w:szCs w:val="20"/>
-              </w:rPr>
-              <w:t xml:space="preserve"> to have a clear description</w:t>
-            </w:r>
-          </w:p>
-          <w:p>
-            <w:pPr>
-              <w:rPr>
-                <w:rFonts w:ascii="Times New Roman" w:hAnsi="Times New Roman" w:cs="Times New Roman"/>
-                <w:sz w:val="20"/>
-                <w:szCs w:val="20"/>
-              </w:rPr>
-            </w:pPr>
-          </w:p>
-        </w:tc>
-        <w:tc>
-          <w:tcPr>
-            <w:tcW w:w="1544" w:type="dxa"/>
-          </w:tcPr>
-          <w:p>
-            <w:pPr>
-              <w:rPr>
-                <w:rFonts w:ascii="Times New Roman" w:hAnsi="Times New Roman" w:cs="Times New Roman"/>
-                <w:sz w:val="20"/>
-                <w:szCs w:val="20"/>
-              </w:rPr>
-            </w:pPr>
-            <w:r>
-              <w:rPr>
-                <w:rFonts w:ascii="Times New Roman" w:hAnsi="Times New Roman" w:cs="Times New Roman"/>
-                <w:sz w:val="20"/>
-                <w:szCs w:val="20"/>
+            <w:tcW w:w="1614" w:type="dxa"/>
+          </w:tcPr>
+          <w:p>
+            <w:pPr>
+              <w:rPr>
+                <w:rFonts w:ascii="Times New Roman" w:hAnsi="Times New Roman" w:cs="Times New Roman"/>
+                <w:sz w:val="16"/>
+                <w:szCs w:val="16"/>
+              </w:rPr>
+            </w:pPr>
+            <w:r>
+              <w:rPr>
+                <w:rFonts w:ascii="Times New Roman" w:hAnsi="Times New Roman" w:cs="Times New Roman"/>
+                <w:sz w:val="16"/>
+                <w:szCs w:val="16"/>
+              </w:rPr>
+              <w:t>Edit initial commit of README to have a clear description</w:t>
+            </w:r>
+          </w:p>
+          <w:p>
+            <w:pPr>
+              <w:rPr>
+                <w:rFonts w:ascii="Times New Roman" w:hAnsi="Times New Roman" w:cs="Times New Roman"/>
+                <w:sz w:val="16"/>
+                <w:szCs w:val="16"/>
+              </w:rPr>
+            </w:pPr>
+          </w:p>
+        </w:tc>
+        <w:tc>
+          <w:tcPr>
+            <w:tcW w:w="2551" w:type="dxa"/>
+          </w:tcPr>
+          <w:p>
+            <w:pPr>
+              <w:rPr>
+                <w:rFonts w:ascii="Times New Roman" w:hAnsi="Times New Roman" w:cs="Times New Roman"/>
+                <w:sz w:val="16"/>
+                <w:szCs w:val="16"/>
+              </w:rPr>
+            </w:pPr>
+            <w:r>
+              <w:rPr>
+                <w:rFonts w:ascii="Times New Roman" w:hAnsi="Times New Roman" w:cs="Times New Roman"/>
+                <w:sz w:val="16"/>
+                <w:szCs w:val="16"/>
               </w:rPr>
               <w:t>Create fresh main branch. Create initial commit with clear description.  Delete original main branch and rename fresh main to main. Force overwrites the new main to GitHub.</w:t>
             </w:r>
@@ -1229,92 +1214,60 @@
             <w:pPr>
               <w:rPr>
                 <w:rFonts w:ascii="Times New Roman" w:hAnsi="Times New Roman" w:cs="Times New Roman"/>
-                <w:sz w:val="20"/>
-                <w:szCs w:val="20"/>
-              </w:rPr>
-            </w:pPr>
-          </w:p>
-        </w:tc>
-        <w:tc>
-          <w:tcPr>
-            <w:tcW w:w="1602" w:type="dxa"/>
-          </w:tcPr>
-          <w:p>
-            <w:pPr>
-              <w:rPr>
-                <w:rFonts w:ascii="Times New Roman" w:hAnsi="Times New Roman" w:cs="Times New Roman"/>
-                <w:sz w:val="20"/>
-                <w:szCs w:val="20"/>
-              </w:rPr>
-            </w:pPr>
-            <w:r>
-              <w:rPr>
-                <w:rFonts w:ascii="Times New Roman" w:hAnsi="Times New Roman" w:cs="Times New Roman"/>
-                <w:sz w:val="20"/>
-                <w:szCs w:val="20"/>
-              </w:rPr>
-              <w:t>M</w:t>
-            </w:r>
-            <w:r>
-              <w:rPr>
-                <w:rFonts w:ascii="Times New Roman" w:hAnsi="Times New Roman" w:cs="Times New Roman"/>
-                <w:sz w:val="20"/>
-                <w:szCs w:val="20"/>
-              </w:rPr>
-              <w:t xml:space="preserve">anually checked the repository and locally on machine, the </w:t>
-            </w:r>
-            <w:r>
-              <w:rPr>
-                <w:rFonts w:ascii="Times New Roman" w:hAnsi="Times New Roman" w:cs="Times New Roman"/>
-                <w:sz w:val="20"/>
-                <w:szCs w:val="20"/>
-              </w:rPr>
-              <w:t>README</w:t>
-            </w:r>
-            <w:r>
-              <w:rPr>
-                <w:rFonts w:ascii="Times New Roman" w:hAnsi="Times New Roman" w:cs="Times New Roman"/>
-                <w:sz w:val="20"/>
-                <w:szCs w:val="20"/>
-              </w:rPr>
-              <w:t xml:space="preserve"> is there</w:t>
-            </w:r>
-            <w:r>
-              <w:rPr>
-                <w:rFonts w:ascii="Times New Roman" w:hAnsi="Times New Roman" w:cs="Times New Roman"/>
-                <w:sz w:val="20"/>
-                <w:szCs w:val="20"/>
-              </w:rPr>
-              <w:t xml:space="preserve"> with a clear description other than “Initial commit”.</w:t>
-            </w:r>
-          </w:p>
-          <w:p>
-            <w:pPr>
-              <w:rPr>
-                <w:rFonts w:ascii="Times New Roman" w:hAnsi="Times New Roman" w:cs="Times New Roman"/>
-                <w:sz w:val="20"/>
-                <w:szCs w:val="20"/>
-              </w:rPr>
-            </w:pPr>
-          </w:p>
-        </w:tc>
-        <w:tc>
-          <w:tcPr>
-            <w:tcW w:w="1149" w:type="dxa"/>
-          </w:tcPr>
-          <w:p>
-            <w:pPr>
-              <w:rPr>
-                <w:rFonts w:ascii="Times New Roman" w:hAnsi="Times New Roman" w:cs="Times New Roman"/>
-                <w:sz w:val="20"/>
-                <w:szCs w:val="20"/>
-              </w:rPr>
-            </w:pPr>
-            <w:r>
-              <w:rPr>
-                <w:rFonts w:ascii="Times New Roman" w:hAnsi="Times New Roman" w:cs="Times New Roman"/>
-                <w:sz w:val="20"/>
-                <w:szCs w:val="20"/>
+                <w:sz w:val="16"/>
+                <w:szCs w:val="16"/>
+              </w:rPr>
+            </w:pPr>
+          </w:p>
+        </w:tc>
+        <w:tc>
+          <w:tcPr>
+            <w:tcW w:w="1418" w:type="dxa"/>
+          </w:tcPr>
+          <w:p>
+            <w:pPr>
+              <w:rPr>
+                <w:rFonts w:ascii="Times New Roman" w:hAnsi="Times New Roman" w:cs="Times New Roman"/>
+                <w:sz w:val="16"/>
+                <w:szCs w:val="16"/>
+              </w:rPr>
+            </w:pPr>
+            <w:r>
+              <w:rPr>
+                <w:rFonts w:ascii="Times New Roman" w:hAnsi="Times New Roman" w:cs="Times New Roman"/>
+                <w:sz w:val="16"/>
+                <w:szCs w:val="16"/>
+              </w:rPr>
+              <w:t>Manually checked the repository and locally on machine, the README is there with a clear description other than “Initial commit”.</w:t>
+            </w:r>
+          </w:p>
+          <w:p>
+            <w:pPr>
+              <w:rPr>
+                <w:rFonts w:ascii="Times New Roman" w:hAnsi="Times New Roman" w:cs="Times New Roman"/>
+                <w:sz w:val="16"/>
+                <w:szCs w:val="16"/>
+              </w:rPr>
+            </w:pPr>
+          </w:p>
+        </w:tc>
+        <w:tc>
+          <w:tcPr>
+            <w:tcW w:w="1513" w:type="dxa"/>
+          </w:tcPr>
+          <w:p>
+            <w:pPr>
+              <w:rPr>
+                <w:rFonts w:ascii="Times New Roman" w:hAnsi="Times New Roman" w:cs="Times New Roman"/>
+                <w:sz w:val="16"/>
+                <w:szCs w:val="16"/>
+              </w:rPr>
+            </w:pPr>
+            <w:r>
+              <w:rPr>
+                <w:rFonts w:ascii="Times New Roman" w:hAnsi="Times New Roman" w:cs="Times New Roman"/>
+                <w:sz w:val="16"/>
+                <w:szCs w:val="16"/>
               </w:rPr>
               <w:t>Entire suggestion was accepted and applied to fix commit.</w:t>
             </w:r>
@@ -1323,29 +1276,29 @@
             <w:pPr>
               <w:rPr>
                 <w:rFonts w:ascii="Times New Roman" w:hAnsi="Times New Roman" w:cs="Times New Roman"/>
-                <w:sz w:val="20"/>
-                <w:szCs w:val="20"/>
-              </w:rPr>
-            </w:pPr>
-          </w:p>
-        </w:tc>
-        <w:tc>
-          <w:tcPr>
-            <w:tcW w:w="1073" w:type="dxa"/>
-          </w:tcPr>
-          <w:p>
-            <w:pPr>
-              <w:rPr>
-                <w:rFonts w:ascii="Times New Roman" w:hAnsi="Times New Roman" w:cs="Times New Roman"/>
-                <w:sz w:val="20"/>
-                <w:szCs w:val="20"/>
-              </w:rPr>
-            </w:pPr>
-            <w:r>
-              <w:rPr>
-                <w:rFonts w:ascii="Times New Roman" w:hAnsi="Times New Roman" w:cs="Times New Roman"/>
-                <w:sz w:val="20"/>
-                <w:szCs w:val="20"/>
+                <w:sz w:val="16"/>
+                <w:szCs w:val="16"/>
+              </w:rPr>
+            </w:pPr>
+          </w:p>
+        </w:tc>
+        <w:tc>
+          <w:tcPr>
+            <w:tcW w:w="1096" w:type="dxa"/>
+          </w:tcPr>
+          <w:p>
+            <w:pPr>
+              <w:rPr>
+                <w:rFonts w:ascii="Times New Roman" w:hAnsi="Times New Roman" w:cs="Times New Roman"/>
+                <w:sz w:val="16"/>
+                <w:szCs w:val="16"/>
+              </w:rPr>
+            </w:pPr>
+            <w:r>
+              <w:rPr>
+                <w:rFonts w:ascii="Times New Roman" w:hAnsi="Times New Roman" w:cs="Times New Roman"/>
+                <w:sz w:val="16"/>
+                <w:szCs w:val="16"/>
               </w:rPr>
               <w:t>None</w:t>
             </w:r>
@@ -1355,21 +1308,21 @@
       <w:tr>
         <w:tc>
           <w:tcPr>
-            <w:tcW w:w="987" w:type="dxa"/>
-          </w:tcPr>
-          <w:p>
-            <w:pPr>
-              <w:rPr>
-                <w:rFonts w:ascii="Times New Roman" w:hAnsi="Times New Roman" w:cs="Times New Roman"/>
-                <w:sz w:val="20"/>
-                <w:szCs w:val="20"/>
-              </w:rPr>
-            </w:pPr>
-            <w:r>
-              <w:rPr>
-                <w:rFonts w:ascii="Times New Roman" w:hAnsi="Times New Roman" w:cs="Times New Roman"/>
-                <w:sz w:val="20"/>
-                <w:szCs w:val="20"/>
+            <w:tcW w:w="955" w:type="dxa"/>
+          </w:tcPr>
+          <w:p>
+            <w:pPr>
+              <w:rPr>
+                <w:rFonts w:ascii="Times New Roman" w:hAnsi="Times New Roman" w:cs="Times New Roman"/>
+                <w:sz w:val="16"/>
+                <w:szCs w:val="16"/>
+              </w:rPr>
+            </w:pPr>
+            <w:r>
+              <w:rPr>
+                <w:rFonts w:ascii="Times New Roman" w:hAnsi="Times New Roman" w:cs="Times New Roman"/>
+                <w:sz w:val="16"/>
+                <w:szCs w:val="16"/>
               </w:rPr>
               <w:t>AI-IDEA-1</w:t>
             </w:r>
@@ -1378,29 +1331,29 @@
             <w:pPr>
               <w:rPr>
                 <w:rFonts w:ascii="Times New Roman" w:hAnsi="Times New Roman" w:cs="Times New Roman"/>
-                <w:sz w:val="20"/>
-                <w:szCs w:val="20"/>
-              </w:rPr>
-            </w:pPr>
-          </w:p>
-        </w:tc>
-        <w:tc>
-          <w:tcPr>
-            <w:tcW w:w="1402" w:type="dxa"/>
-          </w:tcPr>
-          <w:p>
-            <w:pPr>
-              <w:rPr>
-                <w:rFonts w:ascii="Times New Roman" w:hAnsi="Times New Roman" w:cs="Times New Roman"/>
-                <w:sz w:val="20"/>
-                <w:szCs w:val="20"/>
-              </w:rPr>
-            </w:pPr>
-            <w:r>
-              <w:rPr>
-                <w:rFonts w:ascii="Times New Roman" w:hAnsi="Times New Roman" w:cs="Times New Roman"/>
-                <w:sz w:val="20"/>
-                <w:szCs w:val="20"/>
+                <w:sz w:val="16"/>
+                <w:szCs w:val="16"/>
+              </w:rPr>
+            </w:pPr>
+          </w:p>
+        </w:tc>
+        <w:tc>
+          <w:tcPr>
+            <w:tcW w:w="1047" w:type="dxa"/>
+          </w:tcPr>
+          <w:p>
+            <w:pPr>
+              <w:rPr>
+                <w:rFonts w:ascii="Times New Roman" w:hAnsi="Times New Roman" w:cs="Times New Roman"/>
+                <w:sz w:val="16"/>
+                <w:szCs w:val="16"/>
+              </w:rPr>
+            </w:pPr>
+            <w:r>
+              <w:rPr>
+                <w:rFonts w:ascii="Times New Roman" w:hAnsi="Times New Roman" w:cs="Times New Roman"/>
+                <w:sz w:val="16"/>
+                <w:szCs w:val="16"/>
               </w:rPr>
               <w:t>Benno Weideman</w:t>
             </w:r>
@@ -1409,29 +1362,29 @@
             <w:pPr>
               <w:rPr>
                 <w:rFonts w:ascii="Times New Roman" w:hAnsi="Times New Roman" w:cs="Times New Roman"/>
-                <w:sz w:val="20"/>
-                <w:szCs w:val="20"/>
-              </w:rPr>
-            </w:pPr>
-          </w:p>
-        </w:tc>
-        <w:tc>
-          <w:tcPr>
-            <w:tcW w:w="1134" w:type="dxa"/>
-          </w:tcPr>
-          <w:p>
-            <w:pPr>
-              <w:rPr>
-                <w:rFonts w:ascii="Times New Roman" w:hAnsi="Times New Roman" w:cs="Times New Roman"/>
-                <w:sz w:val="20"/>
-                <w:szCs w:val="20"/>
-              </w:rPr>
-            </w:pPr>
-            <w:r>
-              <w:rPr>
-                <w:rFonts w:ascii="Times New Roman" w:hAnsi="Times New Roman" w:cs="Times New Roman"/>
-                <w:sz w:val="20"/>
-                <w:szCs w:val="20"/>
+                <w:sz w:val="16"/>
+                <w:szCs w:val="16"/>
+              </w:rPr>
+            </w:pPr>
+          </w:p>
+        </w:tc>
+        <w:tc>
+          <w:tcPr>
+            <w:tcW w:w="1107" w:type="dxa"/>
+          </w:tcPr>
+          <w:p>
+            <w:pPr>
+              <w:rPr>
+                <w:rFonts w:ascii="Times New Roman" w:hAnsi="Times New Roman" w:cs="Times New Roman"/>
+                <w:sz w:val="16"/>
+                <w:szCs w:val="16"/>
+              </w:rPr>
+            </w:pPr>
+            <w:r>
+              <w:rPr>
+                <w:rFonts w:ascii="Times New Roman" w:hAnsi="Times New Roman" w:cs="Times New Roman"/>
+                <w:sz w:val="16"/>
+                <w:szCs w:val="16"/>
               </w:rPr>
               <w:t>05/09/2026</w:t>
             </w:r>
@@ -1440,29 +1393,29 @@
             <w:pPr>
               <w:rPr>
                 <w:rFonts w:ascii="Times New Roman" w:hAnsi="Times New Roman" w:cs="Times New Roman"/>
-                <w:sz w:val="20"/>
-                <w:szCs w:val="20"/>
-              </w:rPr>
-            </w:pPr>
-          </w:p>
-        </w:tc>
-        <w:tc>
-          <w:tcPr>
-            <w:tcW w:w="850" w:type="dxa"/>
-          </w:tcPr>
-          <w:p>
-            <w:pPr>
-              <w:rPr>
-                <w:rFonts w:ascii="Times New Roman" w:hAnsi="Times New Roman" w:cs="Times New Roman"/>
-                <w:sz w:val="20"/>
-                <w:szCs w:val="20"/>
-              </w:rPr>
-            </w:pPr>
-            <w:r>
-              <w:rPr>
-                <w:rFonts w:ascii="Times New Roman" w:hAnsi="Times New Roman" w:cs="Times New Roman"/>
-                <w:sz w:val="20"/>
-                <w:szCs w:val="20"/>
+                <w:sz w:val="16"/>
+                <w:szCs w:val="16"/>
+              </w:rPr>
+            </w:pPr>
+          </w:p>
+        </w:tc>
+        <w:tc>
+          <w:tcPr>
+            <w:tcW w:w="801" w:type="dxa"/>
+          </w:tcPr>
+          <w:p>
+            <w:pPr>
+              <w:rPr>
+                <w:rFonts w:ascii="Times New Roman" w:hAnsi="Times New Roman" w:cs="Times New Roman"/>
+                <w:sz w:val="16"/>
+                <w:szCs w:val="16"/>
+              </w:rPr>
+            </w:pPr>
+            <w:r>
+              <w:rPr>
+                <w:rFonts w:ascii="Times New Roman" w:hAnsi="Times New Roman" w:cs="Times New Roman"/>
+                <w:sz w:val="16"/>
+                <w:szCs w:val="16"/>
               </w:rPr>
               <w:t>Gemini</w:t>
             </w:r>
@@ -1470,21 +1423,21 @@
         </w:tc>
         <w:tc>
           <w:tcPr>
-            <w:tcW w:w="1407" w:type="dxa"/>
-          </w:tcPr>
-          <w:p>
-            <w:pPr>
-              <w:rPr>
-                <w:rFonts w:ascii="Times New Roman" w:hAnsi="Times New Roman" w:cs="Times New Roman"/>
-                <w:sz w:val="20"/>
-                <w:szCs w:val="20"/>
-              </w:rPr>
-            </w:pPr>
-            <w:r>
-              <w:rPr>
-                <w:rFonts w:ascii="Times New Roman" w:hAnsi="Times New Roman" w:cs="Times New Roman"/>
-                <w:sz w:val="20"/>
-                <w:szCs w:val="20"/>
+            <w:tcW w:w="1614" w:type="dxa"/>
+          </w:tcPr>
+          <w:p>
+            <w:pPr>
+              <w:rPr>
+                <w:rFonts w:ascii="Times New Roman" w:hAnsi="Times New Roman" w:cs="Times New Roman"/>
+                <w:sz w:val="16"/>
+                <w:szCs w:val="16"/>
+              </w:rPr>
+            </w:pPr>
+            <w:r>
+              <w:rPr>
+                <w:rFonts w:ascii="Times New Roman" w:hAnsi="Times New Roman" w:cs="Times New Roman"/>
+                <w:sz w:val="16"/>
+                <w:szCs w:val="16"/>
               </w:rPr>
               <w:t>Idea generation of proper ID naming conventions for AI usage.</w:t>
             </w:r>
@@ -1493,29 +1446,29 @@
             <w:pPr>
               <w:rPr>
                 <w:rFonts w:ascii="Times New Roman" w:hAnsi="Times New Roman" w:cs="Times New Roman"/>
-                <w:sz w:val="20"/>
-                <w:szCs w:val="20"/>
-              </w:rPr>
-            </w:pPr>
-          </w:p>
-        </w:tc>
-        <w:tc>
-          <w:tcPr>
-            <w:tcW w:w="1544" w:type="dxa"/>
-          </w:tcPr>
-          <w:p>
-            <w:pPr>
-              <w:rPr>
-                <w:rFonts w:ascii="Times New Roman" w:hAnsi="Times New Roman" w:cs="Times New Roman"/>
-                <w:sz w:val="20"/>
-                <w:szCs w:val="20"/>
-              </w:rPr>
-            </w:pPr>
-            <w:r>
-              <w:rPr>
-                <w:rFonts w:ascii="Times New Roman" w:hAnsi="Times New Roman" w:cs="Times New Roman"/>
-                <w:sz w:val="20"/>
-                <w:szCs w:val="20"/>
+                <w:sz w:val="16"/>
+                <w:szCs w:val="16"/>
+              </w:rPr>
+            </w:pPr>
+          </w:p>
+        </w:tc>
+        <w:tc>
+          <w:tcPr>
+            <w:tcW w:w="2551" w:type="dxa"/>
+          </w:tcPr>
+          <w:p>
+            <w:pPr>
+              <w:rPr>
+                <w:rFonts w:ascii="Times New Roman" w:hAnsi="Times New Roman" w:cs="Times New Roman"/>
+                <w:sz w:val="16"/>
+                <w:szCs w:val="16"/>
+              </w:rPr>
+            </w:pPr>
+            <w:r>
+              <w:rPr>
+                <w:rFonts w:ascii="Times New Roman" w:hAnsi="Times New Roman" w:cs="Times New Roman"/>
+                <w:sz w:val="16"/>
+                <w:szCs w:val="16"/>
               </w:rPr>
               <w:t>Suggested naming convention for IDs such as ai- “pmpt” and “resp”.</w:t>
             </w:r>
@@ -1524,29 +1477,29 @@
             <w:pPr>
               <w:rPr>
                 <w:rFonts w:ascii="Times New Roman" w:hAnsi="Times New Roman" w:cs="Times New Roman"/>
-                <w:sz w:val="20"/>
-                <w:szCs w:val="20"/>
-              </w:rPr>
-            </w:pPr>
-          </w:p>
-        </w:tc>
-        <w:tc>
-          <w:tcPr>
-            <w:tcW w:w="1602" w:type="dxa"/>
-          </w:tcPr>
-          <w:p>
-            <w:pPr>
-              <w:rPr>
-                <w:rFonts w:ascii="Times New Roman" w:hAnsi="Times New Roman" w:cs="Times New Roman"/>
-                <w:sz w:val="20"/>
-                <w:szCs w:val="20"/>
-              </w:rPr>
-            </w:pPr>
-            <w:r>
-              <w:rPr>
-                <w:rFonts w:ascii="Times New Roman" w:hAnsi="Times New Roman" w:cs="Times New Roman"/>
-                <w:sz w:val="20"/>
-                <w:szCs w:val="20"/>
+                <w:sz w:val="16"/>
+                <w:szCs w:val="16"/>
+              </w:rPr>
+            </w:pPr>
+          </w:p>
+        </w:tc>
+        <w:tc>
+          <w:tcPr>
+            <w:tcW w:w="1418" w:type="dxa"/>
+          </w:tcPr>
+          <w:p>
+            <w:pPr>
+              <w:rPr>
+                <w:rFonts w:ascii="Times New Roman" w:hAnsi="Times New Roman" w:cs="Times New Roman"/>
+                <w:sz w:val="16"/>
+                <w:szCs w:val="16"/>
+              </w:rPr>
+            </w:pPr>
+            <w:r>
+              <w:rPr>
+                <w:rFonts w:ascii="Times New Roman" w:hAnsi="Times New Roman" w:cs="Times New Roman"/>
+                <w:sz w:val="16"/>
+                <w:szCs w:val="16"/>
               </w:rPr>
               <w:t>Visually checked the naming convention for ID and it is appropriate and concise.</w:t>
             </w:r>
@@ -1555,22 +1508,29 @@
             <w:pPr>
               <w:rPr>
                 <w:rFonts w:ascii="Times New Roman" w:hAnsi="Times New Roman" w:cs="Times New Roman"/>
-                <w:sz w:val="20"/>
-                <w:szCs w:val="20"/>
-              </w:rPr>
-            </w:pPr>
-          </w:p>
-        </w:tc>
-        <w:tc>
-          <w:tcPr>
-            <w:tcW w:w="1149" w:type="dxa"/>
-          </w:tcPr>
-          <w:p>
-            <w:r>
-              <w:rPr>
-                <w:rFonts w:ascii="Times New Roman" w:hAnsi="Times New Roman" w:cs="Times New Roman"/>
-                <w:sz w:val="20"/>
-                <w:szCs w:val="20"/>
+                <w:sz w:val="16"/>
+                <w:szCs w:val="16"/>
+              </w:rPr>
+            </w:pPr>
+          </w:p>
+        </w:tc>
+        <w:tc>
+          <w:tcPr>
+            <w:tcW w:w="1513" w:type="dxa"/>
+          </w:tcPr>
+          <w:p>
+            <w:pPr>
+              <w:rPr>
+                <w:rFonts w:ascii="Times New Roman" w:hAnsi="Times New Roman" w:cs="Times New Roman"/>
+                <w:sz w:val="16"/>
+                <w:szCs w:val="16"/>
+              </w:rPr>
+            </w:pPr>
+            <w:r>
+              <w:rPr>
+                <w:rFonts w:ascii="Times New Roman" w:hAnsi="Times New Roman" w:cs="Times New Roman"/>
+                <w:sz w:val="16"/>
+                <w:szCs w:val="16"/>
               </w:rPr>
               <w:t>Accepted the naming convention but did not accept the word usage. Own words tailored to project was used such as DEBUG, RES, and REV.</w:t>
             </w:r>
@@ -1579,29 +1539,29 @@
             <w:pPr>
               <w:rPr>
                 <w:rFonts w:ascii="Times New Roman" w:hAnsi="Times New Roman" w:cs="Times New Roman"/>
-                <w:sz w:val="20"/>
-                <w:szCs w:val="20"/>
-              </w:rPr>
-            </w:pPr>
-          </w:p>
-        </w:tc>
-        <w:tc>
-          <w:tcPr>
-            <w:tcW w:w="1073" w:type="dxa"/>
-          </w:tcPr>
-          <w:p>
-            <w:pPr>
-              <w:rPr>
-                <w:rFonts w:ascii="Times New Roman" w:hAnsi="Times New Roman" w:cs="Times New Roman"/>
-                <w:sz w:val="20"/>
-                <w:szCs w:val="20"/>
-              </w:rPr>
-            </w:pPr>
-            <w:r>
-              <w:rPr>
-                <w:rFonts w:ascii="Times New Roman" w:hAnsi="Times New Roman" w:cs="Times New Roman"/>
-                <w:sz w:val="20"/>
-                <w:szCs w:val="20"/>
+                <w:sz w:val="16"/>
+                <w:szCs w:val="16"/>
+              </w:rPr>
+            </w:pPr>
+          </w:p>
+        </w:tc>
+        <w:tc>
+          <w:tcPr>
+            <w:tcW w:w="1096" w:type="dxa"/>
+          </w:tcPr>
+          <w:p>
+            <w:pPr>
+              <w:rPr>
+                <w:rFonts w:ascii="Times New Roman" w:hAnsi="Times New Roman" w:cs="Times New Roman"/>
+                <w:sz w:val="16"/>
+                <w:szCs w:val="16"/>
+              </w:rPr>
+            </w:pPr>
+            <w:r>
+              <w:rPr>
+                <w:rFonts w:ascii="Times New Roman" w:hAnsi="Times New Roman" w:cs="Times New Roman"/>
+                <w:sz w:val="16"/>
+                <w:szCs w:val="16"/>
               </w:rPr>
               <w:t>None</w:t>
             </w:r>
@@ -1611,21 +1571,21 @@
       <w:tr>
         <w:tc>
           <w:tcPr>
-            <w:tcW w:w="987" w:type="dxa"/>
-          </w:tcPr>
-          <w:p>
-            <w:pPr>
-              <w:rPr>
-                <w:rFonts w:ascii="Times New Roman" w:hAnsi="Times New Roman" w:cs="Times New Roman"/>
-                <w:sz w:val="20"/>
-                <w:szCs w:val="20"/>
-              </w:rPr>
-            </w:pPr>
-            <w:r>
-              <w:rPr>
-                <w:rFonts w:ascii="Times New Roman" w:hAnsi="Times New Roman" w:cs="Times New Roman"/>
-                <w:sz w:val="20"/>
-                <w:szCs w:val="20"/>
+            <w:tcW w:w="955" w:type="dxa"/>
+          </w:tcPr>
+          <w:p>
+            <w:pPr>
+              <w:rPr>
+                <w:rFonts w:ascii="Times New Roman" w:hAnsi="Times New Roman" w:cs="Times New Roman"/>
+                <w:sz w:val="16"/>
+                <w:szCs w:val="16"/>
+              </w:rPr>
+            </w:pPr>
+            <w:r>
+              <w:rPr>
+                <w:rFonts w:ascii="Times New Roman" w:hAnsi="Times New Roman" w:cs="Times New Roman"/>
+                <w:sz w:val="16"/>
+                <w:szCs w:val="16"/>
               </w:rPr>
               <w:t>AI-FORM-1</w:t>
             </w:r>
@@ -1633,21 +1593,21 @@
         </w:tc>
         <w:tc>
           <w:tcPr>
-            <w:tcW w:w="1402" w:type="dxa"/>
-          </w:tcPr>
-          <w:p>
-            <w:pPr>
-              <w:rPr>
-                <w:rFonts w:ascii="Times New Roman" w:hAnsi="Times New Roman" w:cs="Times New Roman"/>
-                <w:sz w:val="20"/>
-                <w:szCs w:val="20"/>
-              </w:rPr>
-            </w:pPr>
-            <w:r>
-              <w:rPr>
-                <w:rFonts w:ascii="Times New Roman" w:hAnsi="Times New Roman" w:cs="Times New Roman"/>
-                <w:sz w:val="20"/>
-                <w:szCs w:val="20"/>
+            <w:tcW w:w="1047" w:type="dxa"/>
+          </w:tcPr>
+          <w:p>
+            <w:pPr>
+              <w:rPr>
+                <w:rFonts w:ascii="Times New Roman" w:hAnsi="Times New Roman" w:cs="Times New Roman"/>
+                <w:sz w:val="16"/>
+                <w:szCs w:val="16"/>
+              </w:rPr>
+            </w:pPr>
+            <w:r>
+              <w:rPr>
+                <w:rFonts w:ascii="Times New Roman" w:hAnsi="Times New Roman" w:cs="Times New Roman"/>
+                <w:sz w:val="16"/>
+                <w:szCs w:val="16"/>
               </w:rPr>
               <w:t>Benno Weideman</w:t>
             </w:r>
@@ -1655,21 +1615,21 @@
         </w:tc>
         <w:tc>
           <w:tcPr>
-            <w:tcW w:w="1134" w:type="dxa"/>
-          </w:tcPr>
-          <w:p>
-            <w:pPr>
-              <w:rPr>
-                <w:rFonts w:ascii="Times New Roman" w:hAnsi="Times New Roman" w:cs="Times New Roman"/>
-                <w:sz w:val="20"/>
-                <w:szCs w:val="20"/>
-              </w:rPr>
-            </w:pPr>
-            <w:r>
-              <w:rPr>
-                <w:rFonts w:ascii="Times New Roman" w:hAnsi="Times New Roman" w:cs="Times New Roman"/>
-                <w:sz w:val="20"/>
-                <w:szCs w:val="20"/>
+            <w:tcW w:w="1107" w:type="dxa"/>
+          </w:tcPr>
+          <w:p>
+            <w:pPr>
+              <w:rPr>
+                <w:rFonts w:ascii="Times New Roman" w:hAnsi="Times New Roman" w:cs="Times New Roman"/>
+                <w:sz w:val="16"/>
+                <w:szCs w:val="16"/>
+              </w:rPr>
+            </w:pPr>
+            <w:r>
+              <w:rPr>
+                <w:rFonts w:ascii="Times New Roman" w:hAnsi="Times New Roman" w:cs="Times New Roman"/>
+                <w:sz w:val="16"/>
+                <w:szCs w:val="16"/>
               </w:rPr>
               <w:t>05/09/2026</w:t>
             </w:r>
@@ -1677,21 +1637,21 @@
         </w:tc>
         <w:tc>
           <w:tcPr>
-            <w:tcW w:w="850" w:type="dxa"/>
-          </w:tcPr>
-          <w:p>
-            <w:pPr>
-              <w:rPr>
-                <w:rFonts w:ascii="Times New Roman" w:hAnsi="Times New Roman" w:cs="Times New Roman"/>
-                <w:sz w:val="20"/>
-                <w:szCs w:val="20"/>
-              </w:rPr>
-            </w:pPr>
-            <w:r>
-              <w:rPr>
-                <w:rFonts w:ascii="Times New Roman" w:hAnsi="Times New Roman" w:cs="Times New Roman"/>
-                <w:sz w:val="20"/>
-                <w:szCs w:val="20"/>
+            <w:tcW w:w="801" w:type="dxa"/>
+          </w:tcPr>
+          <w:p>
+            <w:pPr>
+              <w:rPr>
+                <w:rFonts w:ascii="Times New Roman" w:hAnsi="Times New Roman" w:cs="Times New Roman"/>
+                <w:sz w:val="16"/>
+                <w:szCs w:val="16"/>
+              </w:rPr>
+            </w:pPr>
+            <w:r>
+              <w:rPr>
+                <w:rFonts w:ascii="Times New Roman" w:hAnsi="Times New Roman" w:cs="Times New Roman"/>
+                <w:sz w:val="16"/>
+                <w:szCs w:val="16"/>
               </w:rPr>
               <w:t>Claude</w:t>
             </w:r>
@@ -1699,21 +1659,21 @@
         </w:tc>
         <w:tc>
           <w:tcPr>
-            <w:tcW w:w="1407" w:type="dxa"/>
-          </w:tcPr>
-          <w:p>
-            <w:pPr>
-              <w:rPr>
-                <w:rFonts w:ascii="Times New Roman" w:hAnsi="Times New Roman" w:cs="Times New Roman"/>
-                <w:sz w:val="20"/>
-                <w:szCs w:val="20"/>
-              </w:rPr>
-            </w:pPr>
-            <w:r>
-              <w:rPr>
-                <w:rFonts w:ascii="Times New Roman" w:hAnsi="Times New Roman" w:cs="Times New Roman"/>
-                <w:sz w:val="20"/>
-                <w:szCs w:val="20"/>
+            <w:tcW w:w="1614" w:type="dxa"/>
+          </w:tcPr>
+          <w:p>
+            <w:pPr>
+              <w:rPr>
+                <w:rFonts w:ascii="Times New Roman" w:hAnsi="Times New Roman" w:cs="Times New Roman"/>
+                <w:sz w:val="16"/>
+                <w:szCs w:val="16"/>
+              </w:rPr>
+            </w:pPr>
+            <w:r>
+              <w:rPr>
+                <w:rFonts w:ascii="Times New Roman" w:hAnsi="Times New Roman" w:cs="Times New Roman"/>
+                <w:sz w:val="16"/>
+                <w:szCs w:val="16"/>
               </w:rPr>
               <w:t>Apply styling to GOVERNANCE.MD file.</w:t>
             </w:r>
@@ -1721,21 +1681,21 @@
         </w:tc>
         <w:tc>
           <w:tcPr>
-            <w:tcW w:w="1544" w:type="dxa"/>
-          </w:tcPr>
-          <w:p>
-            <w:pPr>
-              <w:rPr>
-                <w:rFonts w:ascii="Times New Roman" w:hAnsi="Times New Roman" w:cs="Times New Roman"/>
-                <w:sz w:val="20"/>
-                <w:szCs w:val="20"/>
-              </w:rPr>
-            </w:pPr>
-            <w:r>
-              <w:rPr>
-                <w:rFonts w:ascii="Times New Roman" w:hAnsi="Times New Roman" w:cs="Times New Roman"/>
-                <w:sz w:val="20"/>
-                <w:szCs w:val="20"/>
+            <w:tcW w:w="2551" w:type="dxa"/>
+          </w:tcPr>
+          <w:p>
+            <w:pPr>
+              <w:rPr>
+                <w:rFonts w:ascii="Times New Roman" w:hAnsi="Times New Roman" w:cs="Times New Roman"/>
+                <w:sz w:val="16"/>
+                <w:szCs w:val="16"/>
+              </w:rPr>
+            </w:pPr>
+            <w:r>
+              <w:rPr>
+                <w:rFonts w:ascii="Times New Roman" w:hAnsi="Times New Roman" w:cs="Times New Roman"/>
+                <w:sz w:val="16"/>
+                <w:szCs w:val="16"/>
               </w:rPr>
               <w:t>AI applied styling to GOVERNANCE.MD file making it more appropriate and user friendly.</w:t>
             </w:r>
@@ -1743,21 +1703,21 @@
         </w:tc>
         <w:tc>
           <w:tcPr>
-            <w:tcW w:w="1602" w:type="dxa"/>
-          </w:tcPr>
-          <w:p>
-            <w:pPr>
-              <w:rPr>
-                <w:rFonts w:ascii="Times New Roman" w:hAnsi="Times New Roman" w:cs="Times New Roman"/>
-                <w:sz w:val="20"/>
-                <w:szCs w:val="20"/>
-              </w:rPr>
-            </w:pPr>
-            <w:r>
-              <w:rPr>
-                <w:rFonts w:ascii="Times New Roman" w:hAnsi="Times New Roman" w:cs="Times New Roman"/>
-                <w:sz w:val="20"/>
-                <w:szCs w:val="20"/>
+            <w:tcW w:w="1418" w:type="dxa"/>
+          </w:tcPr>
+          <w:p>
+            <w:pPr>
+              <w:rPr>
+                <w:rFonts w:ascii="Times New Roman" w:hAnsi="Times New Roman" w:cs="Times New Roman"/>
+                <w:sz w:val="16"/>
+                <w:szCs w:val="16"/>
+              </w:rPr>
+            </w:pPr>
+            <w:r>
+              <w:rPr>
+                <w:rFonts w:ascii="Times New Roman" w:hAnsi="Times New Roman" w:cs="Times New Roman"/>
+                <w:sz w:val="16"/>
+                <w:szCs w:val="16"/>
               </w:rPr>
               <w:t>File looks visually appealing. Content was not changed.</w:t>
             </w:r>
@@ -1765,21 +1725,21 @@
         </w:tc>
         <w:tc>
           <w:tcPr>
-            <w:tcW w:w="1149" w:type="dxa"/>
-          </w:tcPr>
-          <w:p>
-            <w:pPr>
-              <w:rPr>
-                <w:rFonts w:ascii="Times New Roman" w:hAnsi="Times New Roman" w:cs="Times New Roman"/>
-                <w:sz w:val="20"/>
-                <w:szCs w:val="20"/>
-              </w:rPr>
-            </w:pPr>
-            <w:r>
-              <w:rPr>
-                <w:rFonts w:ascii="Times New Roman" w:hAnsi="Times New Roman" w:cs="Times New Roman"/>
-                <w:sz w:val="20"/>
-                <w:szCs w:val="20"/>
+            <w:tcW w:w="1513" w:type="dxa"/>
+          </w:tcPr>
+          <w:p>
+            <w:pPr>
+              <w:rPr>
+                <w:rFonts w:ascii="Times New Roman" w:hAnsi="Times New Roman" w:cs="Times New Roman"/>
+                <w:sz w:val="16"/>
+                <w:szCs w:val="16"/>
+              </w:rPr>
+            </w:pPr>
+            <w:r>
+              <w:rPr>
+                <w:rFonts w:ascii="Times New Roman" w:hAnsi="Times New Roman" w:cs="Times New Roman"/>
+                <w:sz w:val="16"/>
+                <w:szCs w:val="16"/>
               </w:rPr>
               <w:t>Accept the entire change of styling.</w:t>
             </w:r>
@@ -1787,23 +1747,1579 @@
         </w:tc>
         <w:tc>
           <w:tcPr>
-            <w:tcW w:w="1073" w:type="dxa"/>
-          </w:tcPr>
-          <w:p>
-            <w:pPr>
-              <w:rPr>
-                <w:rFonts w:ascii="Times New Roman" w:hAnsi="Times New Roman" w:cs="Times New Roman"/>
-                <w:sz w:val="20"/>
-                <w:szCs w:val="20"/>
-              </w:rPr>
-            </w:pPr>
-            <w:r>
-              <w:rPr>
-                <w:rFonts w:ascii="Times New Roman" w:hAnsi="Times New Roman" w:cs="Times New Roman"/>
-                <w:sz w:val="20"/>
-                <w:szCs w:val="20"/>
+            <w:tcW w:w="1096" w:type="dxa"/>
+          </w:tcPr>
+          <w:p>
+            <w:pPr>
+              <w:rPr>
+                <w:rFonts w:ascii="Times New Roman" w:hAnsi="Times New Roman" w:cs="Times New Roman"/>
+                <w:sz w:val="16"/>
+                <w:szCs w:val="16"/>
+              </w:rPr>
+            </w:pPr>
+            <w:r>
+              <w:rPr>
+                <w:rFonts w:ascii="Times New Roman" w:hAnsi="Times New Roman" w:cs="Times New Roman"/>
+                <w:sz w:val="16"/>
+                <w:szCs w:val="16"/>
               </w:rPr>
               <w:t>None</w:t>
+            </w:r>
+          </w:p>
+        </w:tc>
+      </w:tr>
+      <w:tr>
+        <w:tc>
+          <w:tcPr>
+            <w:tcW w:w="955" w:type="dxa"/>
+          </w:tcPr>
+          <w:p>
+            <w:pPr>
+              <w:rPr>
+                <w:rFonts w:ascii="Times New Roman" w:hAnsi="Times New Roman" w:cs="Times New Roman"/>
+                <w:sz w:val="16"/>
+                <w:szCs w:val="16"/>
+              </w:rPr>
+            </w:pPr>
+            <w:r>
+              <w:rPr>
+                <w:rFonts w:ascii="Times New Roman" w:hAnsi="Times New Roman" w:cs="Times New Roman"/>
+                <w:sz w:val="16"/>
+                <w:szCs w:val="16"/>
+              </w:rPr>
+              <w:t>AI-RES-1</w:t>
+            </w:r>
+          </w:p>
+        </w:tc>
+        <w:tc>
+          <w:tcPr>
+            <w:tcW w:w="1047" w:type="dxa"/>
+          </w:tcPr>
+          <w:p>
+            <w:pPr>
+              <w:rPr>
+                <w:rFonts w:ascii="Times New Roman" w:hAnsi="Times New Roman" w:cs="Times New Roman"/>
+                <w:sz w:val="16"/>
+                <w:szCs w:val="16"/>
+              </w:rPr>
+            </w:pPr>
+            <w:r>
+              <w:rPr>
+                <w:rFonts w:ascii="Times New Roman" w:hAnsi="Times New Roman" w:cs="Times New Roman"/>
+                <w:sz w:val="16"/>
+                <w:szCs w:val="16"/>
+              </w:rPr>
+              <w:t>Benno Weideman</w:t>
+            </w:r>
+          </w:p>
+        </w:tc>
+        <w:tc>
+          <w:tcPr>
+            <w:tcW w:w="1107" w:type="dxa"/>
+          </w:tcPr>
+          <w:p>
+            <w:pPr>
+              <w:rPr>
+                <w:rFonts w:ascii="Times New Roman" w:hAnsi="Times New Roman" w:cs="Times New Roman"/>
+                <w:sz w:val="16"/>
+                <w:szCs w:val="16"/>
+              </w:rPr>
+            </w:pPr>
+            <w:r>
+              <w:rPr>
+                <w:rFonts w:ascii="Times New Roman" w:hAnsi="Times New Roman" w:cs="Times New Roman"/>
+                <w:sz w:val="16"/>
+                <w:szCs w:val="16"/>
+              </w:rPr>
+              <w:t>0</w:t>
+            </w:r>
+            <w:r>
+              <w:rPr>
+                <w:rFonts w:ascii="Times New Roman" w:hAnsi="Times New Roman" w:cs="Times New Roman"/>
+                <w:sz w:val="16"/>
+                <w:szCs w:val="16"/>
+              </w:rPr>
+              <w:t>7</w:t>
+            </w:r>
+            <w:r>
+              <w:rPr>
+                <w:rFonts w:ascii="Times New Roman" w:hAnsi="Times New Roman" w:cs="Times New Roman"/>
+                <w:sz w:val="16"/>
+                <w:szCs w:val="16"/>
+              </w:rPr>
+              <w:t>/</w:t>
+            </w:r>
+            <w:r>
+              <w:rPr>
+                <w:rFonts w:ascii="Times New Roman" w:hAnsi="Times New Roman" w:cs="Times New Roman"/>
+                <w:sz w:val="16"/>
+                <w:szCs w:val="16"/>
+              </w:rPr>
+              <w:t>09/2026</w:t>
+            </w:r>
+          </w:p>
+        </w:tc>
+        <w:tc>
+          <w:tcPr>
+            <w:tcW w:w="801" w:type="dxa"/>
+          </w:tcPr>
+          <w:p>
+            <w:pPr>
+              <w:rPr>
+                <w:rFonts w:ascii="Times New Roman" w:hAnsi="Times New Roman" w:cs="Times New Roman"/>
+                <w:sz w:val="16"/>
+                <w:szCs w:val="16"/>
+              </w:rPr>
+            </w:pPr>
+            <w:r>
+              <w:rPr>
+                <w:rFonts w:ascii="Times New Roman" w:hAnsi="Times New Roman" w:cs="Times New Roman"/>
+                <w:sz w:val="16"/>
+                <w:szCs w:val="16"/>
+              </w:rPr>
+              <w:t>Gemini</w:t>
+            </w:r>
+          </w:p>
+        </w:tc>
+        <w:tc>
+          <w:tcPr>
+            <w:tcW w:w="1614" w:type="dxa"/>
+          </w:tcPr>
+          <w:p>
+            <w:pPr>
+              <w:rPr>
+                <w:rFonts w:ascii="Times New Roman" w:hAnsi="Times New Roman" w:cs="Times New Roman"/>
+                <w:sz w:val="16"/>
+                <w:szCs w:val="16"/>
+              </w:rPr>
+            </w:pPr>
+            <w:r>
+              <w:rPr>
+                <w:rFonts w:ascii="Times New Roman" w:hAnsi="Times New Roman" w:cs="Times New Roman"/>
+                <w:sz w:val="16"/>
+                <w:szCs w:val="16"/>
+              </w:rPr>
+              <w:t>Provide links to the academic/standard/professional resources, not older than 2022, also make sure that it is free of cost and instantly readable.</w:t>
+            </w:r>
+          </w:p>
+        </w:tc>
+        <w:tc>
+          <w:tcPr>
+            <w:tcW w:w="2551" w:type="dxa"/>
+          </w:tcPr>
+          <w:p>
+            <w:pPr>
+              <w:rPr>
+                <w:rFonts w:ascii="Times New Roman" w:hAnsi="Times New Roman" w:cs="Times New Roman"/>
+                <w:sz w:val="16"/>
+                <w:szCs w:val="16"/>
+              </w:rPr>
+            </w:pPr>
+            <w:r>
+              <w:rPr>
+                <w:rFonts w:ascii="Times New Roman" w:hAnsi="Times New Roman" w:cs="Times New Roman"/>
+                <w:sz w:val="16"/>
+                <w:szCs w:val="16"/>
+              </w:rPr>
+              <w:t>Systems &amp; Software Quality Standards</w:t>
+            </w:r>
+          </w:p>
+          <w:p>
+            <w:pPr>
+              <w:rPr>
+                <w:rFonts w:ascii="Times New Roman" w:hAnsi="Times New Roman" w:cs="Times New Roman"/>
+                <w:sz w:val="16"/>
+                <w:szCs w:val="16"/>
+              </w:rPr>
+            </w:pPr>
+            <w:r>
+              <w:rPr>
+                <w:rFonts w:ascii="Times New Roman" w:hAnsi="Times New Roman" w:cs="Times New Roman"/>
+                <w:sz w:val="16"/>
+                <w:szCs w:val="16"/>
+              </w:rPr>
+              <w:t>ISO/IEC 25010 Software Quality Model</w:t>
+            </w:r>
+            <w:r>
+              <w:rPr>
+                <w:rFonts w:ascii="Times New Roman" w:hAnsi="Times New Roman" w:cs="Times New Roman"/>
+                <w:sz w:val="16"/>
+                <w:szCs w:val="16"/>
+              </w:rPr>
+              <w:t xml:space="preserve"> is the title with link provided and AI explains what it is and why it helps</w:t>
+            </w:r>
+            <w:r>
+              <w:rPr>
+                <w:rFonts w:ascii="Times New Roman" w:hAnsi="Times New Roman" w:cs="Times New Roman"/>
+                <w:sz w:val="16"/>
+                <w:szCs w:val="16"/>
+              </w:rPr>
+              <w:t xml:space="preserve"> for this research</w:t>
+            </w:r>
+            <w:r>
+              <w:rPr>
+                <w:rFonts w:ascii="Times New Roman" w:hAnsi="Times New Roman" w:cs="Times New Roman"/>
+                <w:sz w:val="16"/>
+                <w:szCs w:val="16"/>
+              </w:rPr>
+              <w:t xml:space="preserve"> </w:t>
+            </w:r>
+            <w:sdt>
+              <w:sdtPr>
+                <w:rPr>
+                  <w:rFonts w:ascii="Times New Roman" w:hAnsi="Times New Roman" w:cs="Times New Roman"/>
+                  <w:sz w:val="16"/>
+                  <w:szCs w:val="16"/>
+                </w:rPr>
+                <w:id w:val="840038095"/>
+                <w:citation/>
+              </w:sdtPr>
+              <w:sdtEndPr/>
+              <w:sdtContent>
+                <w:r>
+                  <w:rPr>
+                    <w:rFonts w:ascii="Times New Roman" w:hAnsi="Times New Roman" w:cs="Times New Roman"/>
+                    <w:sz w:val="16"/>
+                    <w:szCs w:val="16"/>
+                  </w:rPr>
+                  <w:fldChar w:fldCharType="begin"/>
+                </w:r>
+                <w:r>
+                  <w:rPr>
+                    <w:rFonts w:ascii="Times New Roman" w:hAnsi="Times New Roman" w:cs="Times New Roman"/>
+                    <w:sz w:val="16"/>
+                    <w:szCs w:val="16"/>
+                  </w:rPr>
+                  <w:instrText xml:space="preserve"> CITATION Pac26 \l 7177 </w:instrText>
+                </w:r>
+                <w:r>
+                  <w:rPr>
+                    <w:rFonts w:ascii="Times New Roman" w:hAnsi="Times New Roman" w:cs="Times New Roman"/>
+                    <w:sz w:val="16"/>
+                    <w:szCs w:val="16"/>
+                  </w:rPr>
+                  <w:fldChar w:fldCharType="separate"/>
+                </w:r>
+                <w:r>
+                  <w:rPr>
+                    <w:rFonts w:ascii="Times New Roman" w:hAnsi="Times New Roman" w:cs="Times New Roman"/>
+                    <w:noProof/>
+                    <w:sz w:val="16"/>
+                    <w:szCs w:val="16"/>
+                  </w:rPr>
+                  <w:t>(Pacific Certifications, 2026)</w:t>
+                </w:r>
+                <w:r>
+                  <w:rPr>
+                    <w:rFonts w:ascii="Times New Roman" w:hAnsi="Times New Roman" w:cs="Times New Roman"/>
+                    <w:sz w:val="16"/>
+                    <w:szCs w:val="16"/>
+                  </w:rPr>
+                  <w:fldChar w:fldCharType="end"/>
+                </w:r>
+              </w:sdtContent>
+            </w:sdt>
+            <w:r>
+              <w:rPr>
+                <w:rFonts w:ascii="Times New Roman" w:hAnsi="Times New Roman" w:cs="Times New Roman"/>
+                <w:sz w:val="16"/>
+                <w:szCs w:val="16"/>
+              </w:rPr>
+              <w:t>.</w:t>
+            </w:r>
+          </w:p>
+        </w:tc>
+        <w:tc>
+          <w:tcPr>
+            <w:tcW w:w="1418" w:type="dxa"/>
+          </w:tcPr>
+          <w:p>
+            <w:pPr>
+              <w:rPr>
+                <w:rFonts w:ascii="Times New Roman" w:hAnsi="Times New Roman" w:cs="Times New Roman"/>
+                <w:sz w:val="16"/>
+                <w:szCs w:val="16"/>
+              </w:rPr>
+            </w:pPr>
+            <w:r>
+              <w:rPr>
+                <w:rFonts w:ascii="Times New Roman" w:hAnsi="Times New Roman" w:cs="Times New Roman"/>
+                <w:sz w:val="16"/>
+                <w:szCs w:val="16"/>
+              </w:rPr>
+              <w:t xml:space="preserve">Link is provided and access works, </w:t>
+            </w:r>
+            <w:r>
+              <w:rPr>
+                <w:rFonts w:ascii="Times New Roman" w:hAnsi="Times New Roman" w:cs="Times New Roman"/>
+                <w:sz w:val="16"/>
+                <w:szCs w:val="16"/>
+              </w:rPr>
+              <w:t>Pacific Certifications is a real company.</w:t>
+            </w:r>
+          </w:p>
+        </w:tc>
+        <w:tc>
+          <w:tcPr>
+            <w:tcW w:w="1513" w:type="dxa"/>
+          </w:tcPr>
+          <w:p>
+            <w:pPr>
+              <w:rPr>
+                <w:rFonts w:ascii="Times New Roman" w:hAnsi="Times New Roman" w:cs="Times New Roman"/>
+                <w:sz w:val="16"/>
+                <w:szCs w:val="16"/>
+              </w:rPr>
+            </w:pPr>
+            <w:r>
+              <w:rPr>
+                <w:rFonts w:ascii="Times New Roman" w:hAnsi="Times New Roman" w:cs="Times New Roman"/>
+                <w:sz w:val="16"/>
+                <w:szCs w:val="16"/>
+              </w:rPr>
+              <w:t xml:space="preserve">Accept the pdf, </w:t>
+            </w:r>
+            <w:r>
+              <w:rPr>
+                <w:rFonts w:ascii="Times New Roman" w:hAnsi="Times New Roman" w:cs="Times New Roman"/>
+                <w:sz w:val="16"/>
+                <w:szCs w:val="16"/>
+              </w:rPr>
+              <w:t>used</w:t>
+            </w:r>
+            <w:r>
+              <w:rPr>
+                <w:rFonts w:ascii="Times New Roman" w:hAnsi="Times New Roman" w:cs="Times New Roman"/>
+                <w:sz w:val="16"/>
+                <w:szCs w:val="16"/>
+              </w:rPr>
+              <w:t xml:space="preserve"> it for usability, availability, portability, </w:t>
+            </w:r>
+            <w:r>
+              <w:rPr>
+                <w:rFonts w:ascii="Times New Roman" w:hAnsi="Times New Roman" w:cs="Times New Roman"/>
+                <w:sz w:val="16"/>
+                <w:szCs w:val="16"/>
+              </w:rPr>
+              <w:t>error prevention</w:t>
+            </w:r>
+            <w:r>
+              <w:rPr>
+                <w:rFonts w:ascii="Times New Roman" w:hAnsi="Times New Roman" w:cs="Times New Roman"/>
+                <w:sz w:val="16"/>
+                <w:szCs w:val="16"/>
+              </w:rPr>
+              <w:t>, and security</w:t>
+            </w:r>
+            <w:r>
+              <w:rPr>
+                <w:rFonts w:ascii="Times New Roman" w:hAnsi="Times New Roman" w:cs="Times New Roman"/>
+                <w:sz w:val="16"/>
+                <w:szCs w:val="16"/>
+              </w:rPr>
+              <w:t xml:space="preserve"> for non-functional requirements.</w:t>
+            </w:r>
+            <w:r>
+              <w:rPr>
+                <w:rFonts w:ascii="Times New Roman" w:hAnsi="Times New Roman" w:cs="Times New Roman"/>
+                <w:sz w:val="16"/>
+                <w:szCs w:val="16"/>
+              </w:rPr>
+              <w:t xml:space="preserve"> </w:t>
+            </w:r>
+          </w:p>
+        </w:tc>
+        <w:tc>
+          <w:tcPr>
+            <w:tcW w:w="1096" w:type="dxa"/>
+          </w:tcPr>
+          <w:p>
+            <w:pPr>
+              <w:rPr>
+                <w:rFonts w:ascii="Times New Roman" w:hAnsi="Times New Roman" w:cs="Times New Roman"/>
+                <w:sz w:val="16"/>
+                <w:szCs w:val="16"/>
+              </w:rPr>
+            </w:pPr>
+            <w:r>
+              <w:rPr>
+                <w:rFonts w:ascii="Times New Roman" w:hAnsi="Times New Roman" w:cs="Times New Roman"/>
+                <w:sz w:val="16"/>
+                <w:szCs w:val="16"/>
+              </w:rPr>
+              <w:t>Struggled to gain access to specific resources that was suggested by my prompt.</w:t>
+            </w:r>
+          </w:p>
+        </w:tc>
+      </w:tr>
+      <w:tr>
+        <w:tc>
+          <w:tcPr>
+            <w:tcW w:w="955" w:type="dxa"/>
+          </w:tcPr>
+          <w:p>
+            <w:pPr>
+              <w:rPr>
+                <w:rFonts w:ascii="Times New Roman" w:hAnsi="Times New Roman" w:cs="Times New Roman"/>
+                <w:sz w:val="16"/>
+                <w:szCs w:val="16"/>
+              </w:rPr>
+            </w:pPr>
+            <w:r>
+              <w:rPr>
+                <w:rFonts w:ascii="Times New Roman" w:hAnsi="Times New Roman" w:cs="Times New Roman"/>
+                <w:sz w:val="16"/>
+                <w:szCs w:val="16"/>
+              </w:rPr>
+              <w:t>AI-RES-2</w:t>
+            </w:r>
+          </w:p>
+        </w:tc>
+        <w:tc>
+          <w:tcPr>
+            <w:tcW w:w="1047" w:type="dxa"/>
+          </w:tcPr>
+          <w:p>
+            <w:pPr>
+              <w:rPr>
+                <w:rFonts w:ascii="Times New Roman" w:hAnsi="Times New Roman" w:cs="Times New Roman"/>
+                <w:sz w:val="16"/>
+                <w:szCs w:val="16"/>
+              </w:rPr>
+            </w:pPr>
+            <w:r>
+              <w:rPr>
+                <w:rFonts w:ascii="Times New Roman" w:hAnsi="Times New Roman" w:cs="Times New Roman"/>
+                <w:sz w:val="16"/>
+                <w:szCs w:val="16"/>
+              </w:rPr>
+              <w:t>Benno Weideman</w:t>
+            </w:r>
+          </w:p>
+        </w:tc>
+        <w:tc>
+          <w:tcPr>
+            <w:tcW w:w="1107" w:type="dxa"/>
+          </w:tcPr>
+          <w:p>
+            <w:pPr>
+              <w:rPr>
+                <w:rFonts w:ascii="Times New Roman" w:hAnsi="Times New Roman" w:cs="Times New Roman"/>
+                <w:sz w:val="16"/>
+                <w:szCs w:val="16"/>
+              </w:rPr>
+            </w:pPr>
+            <w:r>
+              <w:rPr>
+                <w:rFonts w:ascii="Times New Roman" w:hAnsi="Times New Roman" w:cs="Times New Roman"/>
+                <w:sz w:val="16"/>
+                <w:szCs w:val="16"/>
+              </w:rPr>
+              <w:t>07/09/2026</w:t>
+            </w:r>
+          </w:p>
+        </w:tc>
+        <w:tc>
+          <w:tcPr>
+            <w:tcW w:w="801" w:type="dxa"/>
+          </w:tcPr>
+          <w:p>
+            <w:pPr>
+              <w:rPr>
+                <w:rFonts w:ascii="Times New Roman" w:hAnsi="Times New Roman" w:cs="Times New Roman"/>
+                <w:sz w:val="16"/>
+                <w:szCs w:val="16"/>
+              </w:rPr>
+            </w:pPr>
+            <w:r>
+              <w:rPr>
+                <w:rFonts w:ascii="Times New Roman" w:hAnsi="Times New Roman" w:cs="Times New Roman"/>
+                <w:sz w:val="16"/>
+                <w:szCs w:val="16"/>
+              </w:rPr>
+              <w:t>Gemini</w:t>
+            </w:r>
+          </w:p>
+        </w:tc>
+        <w:tc>
+          <w:tcPr>
+            <w:tcW w:w="1614" w:type="dxa"/>
+          </w:tcPr>
+          <w:p>
+            <w:pPr>
+              <w:rPr>
+                <w:rFonts w:ascii="Times New Roman" w:hAnsi="Times New Roman" w:cs="Times New Roman"/>
+                <w:sz w:val="16"/>
+                <w:szCs w:val="16"/>
+              </w:rPr>
+            </w:pPr>
+            <w:r>
+              <w:rPr>
+                <w:rFonts w:ascii="Times New Roman" w:hAnsi="Times New Roman" w:cs="Times New Roman"/>
+                <w:sz w:val="16"/>
+                <w:szCs w:val="16"/>
+              </w:rPr>
+              <w:t>Provide me academic/professional/standard resources from 2022 that is free that explicitly talks about their nonfunctional requirements in depth and is a similar system to civicconnect.</w:t>
+            </w:r>
+          </w:p>
+        </w:tc>
+        <w:tc>
+          <w:tcPr>
+            <w:tcW w:w="2551" w:type="dxa"/>
+          </w:tcPr>
+          <w:p>
+            <w:pPr>
+              <w:rPr>
+                <w:rFonts w:ascii="Times New Roman" w:hAnsi="Times New Roman" w:cs="Times New Roman"/>
+                <w:sz w:val="16"/>
+                <w:szCs w:val="16"/>
+              </w:rPr>
+            </w:pPr>
+            <w:r>
+              <w:rPr>
+                <w:rFonts w:ascii="Times New Roman" w:hAnsi="Times New Roman" w:cs="Times New Roman"/>
+                <w:sz w:val="16"/>
+                <w:szCs w:val="16"/>
+              </w:rPr>
+              <w:t xml:space="preserve">OpenLMIS Technical Documentation — Non-Functional Requirements Specification, </w:t>
+            </w:r>
+            <w:r>
+              <w:rPr>
+                <w:rFonts w:ascii="Times New Roman" w:hAnsi="Times New Roman" w:cs="Times New Roman"/>
+              </w:rPr>
+              <w:t xml:space="preserve"> </w:t>
+            </w:r>
+            <w:r>
+              <w:rPr>
+                <w:rFonts w:ascii="Times New Roman" w:hAnsi="Times New Roman" w:cs="Times New Roman"/>
+                <w:sz w:val="16"/>
+                <w:szCs w:val="16"/>
+              </w:rPr>
+              <w:t xml:space="preserve">ISO/IEC 25010:2023 Product Quality Model &amp; Industry Standards, Open311 GeoReport API Specification (Official Standard), </w:t>
+            </w:r>
+            <w:r>
+              <w:rPr>
+                <w:rFonts w:ascii="Times New Roman" w:hAnsi="Times New Roman" w:cs="Times New Roman"/>
+                <w:sz w:val="16"/>
+                <w:szCs w:val="16"/>
+              </w:rPr>
+              <w:t>OSDM Non-Functional Requirements Specification,</w:t>
+            </w:r>
+            <w:r>
+              <w:rPr>
+                <w:rFonts w:ascii="Times New Roman" w:hAnsi="Times New Roman" w:cs="Times New Roman"/>
+                <w:sz w:val="16"/>
+                <w:szCs w:val="16"/>
+              </w:rPr>
+              <w:t xml:space="preserve"> and</w:t>
+            </w:r>
+            <w:r>
+              <w:rPr>
+                <w:rFonts w:ascii="Times New Roman" w:hAnsi="Times New Roman" w:cs="Times New Roman"/>
+                <w:sz w:val="16"/>
+                <w:szCs w:val="16"/>
+              </w:rPr>
+              <w:t xml:space="preserve"> </w:t>
+            </w:r>
+            <w:r>
+              <w:rPr>
+                <w:rFonts w:ascii="Times New Roman" w:hAnsi="Times New Roman" w:cs="Times New Roman"/>
+              </w:rPr>
+              <w:t xml:space="preserve"> </w:t>
+            </w:r>
+            <w:r>
+              <w:rPr>
+                <w:rFonts w:ascii="Times New Roman" w:hAnsi="Times New Roman" w:cs="Times New Roman"/>
+                <w:sz w:val="16"/>
+                <w:szCs w:val="16"/>
+              </w:rPr>
+              <w:t>Airports Company South Africa (ACSA) — Customer Relationship Management &amp; Service Request Solution Scope (October 2022)</w:t>
+            </w:r>
+            <w:r>
+              <w:rPr>
+                <w:rFonts w:ascii="Times New Roman" w:hAnsi="Times New Roman" w:cs="Times New Roman"/>
+                <w:sz w:val="16"/>
+                <w:szCs w:val="16"/>
+              </w:rPr>
+              <w:t>.</w:t>
+            </w:r>
+          </w:p>
+        </w:tc>
+        <w:tc>
+          <w:tcPr>
+            <w:tcW w:w="1418" w:type="dxa"/>
+          </w:tcPr>
+          <w:p>
+            <w:pPr>
+              <w:rPr>
+                <w:rFonts w:ascii="Times New Roman" w:hAnsi="Times New Roman" w:cs="Times New Roman"/>
+                <w:sz w:val="16"/>
+                <w:szCs w:val="16"/>
+              </w:rPr>
+            </w:pPr>
+            <w:r>
+              <w:rPr>
+                <w:rFonts w:ascii="Times New Roman" w:hAnsi="Times New Roman" w:cs="Times New Roman"/>
+                <w:sz w:val="16"/>
+                <w:szCs w:val="16"/>
+              </w:rPr>
+              <w:t xml:space="preserve">Link provided to ACSA CRM &amp; Service Request Solution Scope works, </w:t>
+            </w:r>
+            <w:r>
+              <w:rPr>
+                <w:rFonts w:ascii="Times New Roman" w:hAnsi="Times New Roman" w:cs="Times New Roman"/>
+                <w:sz w:val="16"/>
+                <w:szCs w:val="16"/>
+              </w:rPr>
+              <w:t>company exists.</w:t>
+            </w:r>
+          </w:p>
+        </w:tc>
+        <w:tc>
+          <w:tcPr>
+            <w:tcW w:w="1513" w:type="dxa"/>
+          </w:tcPr>
+          <w:p>
+            <w:pPr>
+              <w:rPr>
+                <w:rFonts w:ascii="Times New Roman" w:hAnsi="Times New Roman" w:cs="Times New Roman"/>
+                <w:sz w:val="16"/>
+                <w:szCs w:val="16"/>
+              </w:rPr>
+            </w:pPr>
+            <w:r>
+              <w:rPr>
+                <w:rFonts w:ascii="Times New Roman" w:hAnsi="Times New Roman" w:cs="Times New Roman"/>
+                <w:sz w:val="16"/>
+                <w:szCs w:val="16"/>
+              </w:rPr>
+              <w:t xml:space="preserve">Accept the ACSA resource, </w:t>
+            </w:r>
+            <w:r>
+              <w:rPr>
+                <w:rFonts w:ascii="Times New Roman" w:hAnsi="Times New Roman" w:cs="Times New Roman"/>
+                <w:sz w:val="16"/>
+                <w:szCs w:val="16"/>
+              </w:rPr>
+              <w:t>especially</w:t>
+            </w:r>
+            <w:r>
+              <w:rPr>
+                <w:rFonts w:ascii="Times New Roman" w:hAnsi="Times New Roman" w:cs="Times New Roman"/>
+                <w:sz w:val="16"/>
+                <w:szCs w:val="16"/>
+              </w:rPr>
+              <w:t xml:space="preserve"> </w:t>
+            </w:r>
+            <w:r>
+              <w:rPr>
+                <w:rFonts w:ascii="Times New Roman" w:hAnsi="Times New Roman" w:cs="Times New Roman"/>
+                <w:sz w:val="16"/>
+                <w:szCs w:val="16"/>
+              </w:rPr>
+              <w:t xml:space="preserve">the sum of all full functional </w:t>
+            </w:r>
+            <w:r>
+              <w:rPr>
+                <w:rFonts w:ascii="Times New Roman" w:hAnsi="Times New Roman" w:cs="Times New Roman"/>
+                <w:sz w:val="16"/>
+                <w:szCs w:val="16"/>
+              </w:rPr>
+              <w:t>rights</w:t>
+            </w:r>
+            <w:r>
+              <w:rPr>
+                <w:rFonts w:ascii="Times New Roman" w:hAnsi="Times New Roman" w:cs="Times New Roman"/>
+                <w:sz w:val="16"/>
+                <w:szCs w:val="16"/>
+              </w:rPr>
+              <w:t xml:space="preserve"> that are </w:t>
+            </w:r>
+            <w:r>
+              <w:rPr>
+                <w:rFonts w:ascii="Times New Roman" w:hAnsi="Times New Roman" w:cs="Times New Roman"/>
+                <w:sz w:val="16"/>
+                <w:szCs w:val="16"/>
+              </w:rPr>
+              <w:t xml:space="preserve">customer query management, </w:t>
+            </w:r>
+            <w:r>
+              <w:rPr>
+                <w:rFonts w:ascii="Times New Roman" w:hAnsi="Times New Roman" w:cs="Times New Roman"/>
+                <w:sz w:val="16"/>
+                <w:szCs w:val="16"/>
+              </w:rPr>
+              <w:t xml:space="preserve">key account management, </w:t>
+            </w:r>
+            <w:r>
+              <w:rPr>
+                <w:rFonts w:ascii="Times New Roman" w:hAnsi="Times New Roman" w:cs="Times New Roman"/>
+                <w:sz w:val="16"/>
+                <w:szCs w:val="16"/>
+              </w:rPr>
+              <w:t>and employee query management.</w:t>
+            </w:r>
+            <w:r>
+              <w:rPr>
+                <w:rFonts w:ascii="Times New Roman" w:hAnsi="Times New Roman" w:cs="Times New Roman"/>
+                <w:sz w:val="16"/>
+                <w:szCs w:val="16"/>
+              </w:rPr>
+              <w:t xml:space="preserve"> This had users of 100, 40 and 70</w:t>
+            </w:r>
+            <w:r>
+              <w:rPr>
+                <w:rFonts w:ascii="Times New Roman" w:hAnsi="Times New Roman" w:cs="Times New Roman"/>
+                <w:sz w:val="16"/>
+                <w:szCs w:val="16"/>
+              </w:rPr>
+              <w:t xml:space="preserve"> respectively and combined them to 210 concurrent users for non-functional requirements</w:t>
+            </w:r>
+            <w:r>
+              <w:rPr>
+                <w:rFonts w:ascii="Times New Roman" w:hAnsi="Times New Roman" w:cs="Times New Roman"/>
+                <w:sz w:val="16"/>
+                <w:szCs w:val="16"/>
+              </w:rPr>
+              <w:t xml:space="preserve"> </w:t>
+            </w:r>
+            <w:sdt>
+              <w:sdtPr>
+                <w:rPr>
+                  <w:rFonts w:ascii="Times New Roman" w:hAnsi="Times New Roman" w:cs="Times New Roman"/>
+                  <w:sz w:val="16"/>
+                  <w:szCs w:val="16"/>
+                </w:rPr>
+                <w:id w:val="-1004284845"/>
+                <w:citation/>
+              </w:sdtPr>
+              <w:sdtEndPr/>
+              <w:sdtContent>
+                <w:r>
+                  <w:rPr>
+                    <w:rFonts w:ascii="Times New Roman" w:hAnsi="Times New Roman" w:cs="Times New Roman"/>
+                    <w:sz w:val="16"/>
+                    <w:szCs w:val="16"/>
+                  </w:rPr>
+                  <w:fldChar w:fldCharType="begin"/>
+                </w:r>
+                <w:r>
+                  <w:rPr>
+                    <w:rFonts w:ascii="Times New Roman" w:hAnsi="Times New Roman" w:cs="Times New Roman"/>
+                    <w:sz w:val="16"/>
+                    <w:szCs w:val="16"/>
+                  </w:rPr>
+                  <w:instrText xml:space="preserve"> CITATION Air26 \l 7177 </w:instrText>
+                </w:r>
+                <w:r>
+                  <w:rPr>
+                    <w:rFonts w:ascii="Times New Roman" w:hAnsi="Times New Roman" w:cs="Times New Roman"/>
+                    <w:sz w:val="16"/>
+                    <w:szCs w:val="16"/>
+                  </w:rPr>
+                  <w:fldChar w:fldCharType="separate"/>
+                </w:r>
+                <w:r>
+                  <w:rPr>
+                    <w:rFonts w:ascii="Times New Roman" w:hAnsi="Times New Roman" w:cs="Times New Roman"/>
+                    <w:noProof/>
+                    <w:sz w:val="16"/>
+                    <w:szCs w:val="16"/>
+                  </w:rPr>
+                  <w:t>(Airport Company South Africa, n.d.)</w:t>
+                </w:r>
+                <w:r>
+                  <w:rPr>
+                    <w:rFonts w:ascii="Times New Roman" w:hAnsi="Times New Roman" w:cs="Times New Roman"/>
+                    <w:sz w:val="16"/>
+                    <w:szCs w:val="16"/>
+                  </w:rPr>
+                  <w:fldChar w:fldCharType="end"/>
+                </w:r>
+              </w:sdtContent>
+            </w:sdt>
+            <w:r>
+              <w:rPr>
+                <w:rFonts w:ascii="Times New Roman" w:hAnsi="Times New Roman" w:cs="Times New Roman"/>
+                <w:sz w:val="16"/>
+                <w:szCs w:val="16"/>
+              </w:rPr>
+              <w:t>.</w:t>
+            </w:r>
+          </w:p>
+        </w:tc>
+        <w:tc>
+          <w:tcPr>
+            <w:tcW w:w="1096" w:type="dxa"/>
+          </w:tcPr>
+          <w:p>
+            <w:pPr>
+              <w:rPr>
+                <w:rFonts w:ascii="Times New Roman" w:hAnsi="Times New Roman" w:cs="Times New Roman"/>
+                <w:sz w:val="16"/>
+                <w:szCs w:val="16"/>
+              </w:rPr>
+            </w:pPr>
+            <w:r>
+              <w:rPr>
+                <w:rFonts w:ascii="Times New Roman" w:hAnsi="Times New Roman" w:cs="Times New Roman"/>
+                <w:sz w:val="16"/>
+                <w:szCs w:val="16"/>
+              </w:rPr>
+              <w:t>Struggled to find resources that are close to the CivicConnect project that details non-functional requirements.</w:t>
+            </w:r>
+          </w:p>
+        </w:tc>
+      </w:tr>
+      <w:tr>
+        <w:tc>
+          <w:tcPr>
+            <w:tcW w:w="955" w:type="dxa"/>
+          </w:tcPr>
+          <w:p>
+            <w:pPr>
+              <w:rPr>
+                <w:rFonts w:ascii="Times New Roman" w:hAnsi="Times New Roman" w:cs="Times New Roman"/>
+                <w:sz w:val="16"/>
+                <w:szCs w:val="16"/>
+              </w:rPr>
+            </w:pPr>
+            <w:r>
+              <w:rPr>
+                <w:rFonts w:ascii="Times New Roman" w:hAnsi="Times New Roman" w:cs="Times New Roman"/>
+                <w:sz w:val="16"/>
+                <w:szCs w:val="16"/>
+              </w:rPr>
+              <w:t>AI-ANA-1</w:t>
+            </w:r>
+          </w:p>
+        </w:tc>
+        <w:tc>
+          <w:tcPr>
+            <w:tcW w:w="1047" w:type="dxa"/>
+          </w:tcPr>
+          <w:p>
+            <w:pPr>
+              <w:rPr>
+                <w:rFonts w:ascii="Times New Roman" w:hAnsi="Times New Roman" w:cs="Times New Roman"/>
+                <w:sz w:val="16"/>
+                <w:szCs w:val="16"/>
+              </w:rPr>
+            </w:pPr>
+            <w:r>
+              <w:rPr>
+                <w:rFonts w:ascii="Times New Roman" w:hAnsi="Times New Roman" w:cs="Times New Roman"/>
+                <w:sz w:val="16"/>
+                <w:szCs w:val="16"/>
+              </w:rPr>
+              <w:t>Benno Weideman</w:t>
+            </w:r>
+          </w:p>
+        </w:tc>
+        <w:tc>
+          <w:tcPr>
+            <w:tcW w:w="1107" w:type="dxa"/>
+          </w:tcPr>
+          <w:p>
+            <w:pPr>
+              <w:rPr>
+                <w:rFonts w:ascii="Times New Roman" w:hAnsi="Times New Roman" w:cs="Times New Roman"/>
+                <w:sz w:val="16"/>
+                <w:szCs w:val="16"/>
+              </w:rPr>
+            </w:pPr>
+            <w:r>
+              <w:rPr>
+                <w:rFonts w:ascii="Times New Roman" w:hAnsi="Times New Roman" w:cs="Times New Roman"/>
+                <w:sz w:val="16"/>
+                <w:szCs w:val="16"/>
+              </w:rPr>
+              <w:t>08/09/2026</w:t>
+            </w:r>
+          </w:p>
+        </w:tc>
+        <w:tc>
+          <w:tcPr>
+            <w:tcW w:w="801" w:type="dxa"/>
+          </w:tcPr>
+          <w:p>
+            <w:pPr>
+              <w:rPr>
+                <w:rFonts w:ascii="Times New Roman" w:hAnsi="Times New Roman" w:cs="Times New Roman"/>
+                <w:sz w:val="16"/>
+                <w:szCs w:val="16"/>
+              </w:rPr>
+            </w:pPr>
+            <w:r>
+              <w:rPr>
+                <w:rFonts w:ascii="Times New Roman" w:hAnsi="Times New Roman" w:cs="Times New Roman"/>
+                <w:sz w:val="16"/>
+                <w:szCs w:val="16"/>
+              </w:rPr>
+              <w:t>Gemini</w:t>
+            </w:r>
+          </w:p>
+        </w:tc>
+        <w:tc>
+          <w:tcPr>
+            <w:tcW w:w="1614" w:type="dxa"/>
+          </w:tcPr>
+          <w:p>
+            <w:pPr>
+              <w:rPr>
+                <w:rFonts w:ascii="Times New Roman" w:hAnsi="Times New Roman" w:cs="Times New Roman"/>
+                <w:sz w:val="16"/>
+                <w:szCs w:val="16"/>
+              </w:rPr>
+            </w:pPr>
+            <w:r>
+              <w:rPr>
+                <w:rFonts w:ascii="Times New Roman" w:hAnsi="Times New Roman" w:cs="Times New Roman"/>
+                <w:sz w:val="16"/>
+                <w:szCs w:val="16"/>
+              </w:rPr>
+              <w:t>Provide a solid explanation of what is expected to write for the forward engineering consideration with regards to the CivicConnect project.</w:t>
+            </w:r>
+          </w:p>
+        </w:tc>
+        <w:tc>
+          <w:tcPr>
+            <w:tcW w:w="2551" w:type="dxa"/>
+          </w:tcPr>
+          <w:p>
+            <w:pPr>
+              <w:rPr>
+                <w:rFonts w:ascii="Times New Roman" w:hAnsi="Times New Roman" w:cs="Times New Roman"/>
+                <w:sz w:val="16"/>
+                <w:szCs w:val="16"/>
+              </w:rPr>
+            </w:pPr>
+            <w:r>
+              <w:rPr>
+                <w:rFonts w:ascii="Times New Roman" w:hAnsi="Times New Roman" w:cs="Times New Roman"/>
+                <w:sz w:val="16"/>
+                <w:szCs w:val="16"/>
+              </w:rPr>
+              <w:t>Explained in depth what is a forward engineering consideration, what is required for why it matters</w:t>
+            </w:r>
+            <w:r>
+              <w:rPr>
+                <w:rFonts w:ascii="Times New Roman" w:hAnsi="Times New Roman" w:cs="Times New Roman"/>
+                <w:sz w:val="16"/>
+                <w:szCs w:val="16"/>
+              </w:rPr>
+              <w:t xml:space="preserve"> now, what later activity may it influence, what information is still missing, and what is the risk of ignoring it.</w:t>
+            </w:r>
+          </w:p>
+        </w:tc>
+        <w:tc>
+          <w:tcPr>
+            <w:tcW w:w="1418" w:type="dxa"/>
+          </w:tcPr>
+          <w:p>
+            <w:pPr>
+              <w:rPr>
+                <w:rFonts w:ascii="Times New Roman" w:hAnsi="Times New Roman" w:cs="Times New Roman"/>
+                <w:sz w:val="16"/>
+                <w:szCs w:val="16"/>
+              </w:rPr>
+            </w:pPr>
+            <w:r>
+              <w:rPr>
+                <w:rFonts w:ascii="Times New Roman" w:hAnsi="Times New Roman" w:cs="Times New Roman"/>
+                <w:sz w:val="16"/>
+                <w:szCs w:val="16"/>
+              </w:rPr>
+              <w:t>Provided a full breakdown of each element in the forward engineering consideration table.</w:t>
+            </w:r>
+          </w:p>
+        </w:tc>
+        <w:tc>
+          <w:tcPr>
+            <w:tcW w:w="1513" w:type="dxa"/>
+          </w:tcPr>
+          <w:p>
+            <w:pPr>
+              <w:rPr>
+                <w:rFonts w:ascii="Times New Roman" w:hAnsi="Times New Roman" w:cs="Times New Roman"/>
+                <w:sz w:val="16"/>
+                <w:szCs w:val="16"/>
+              </w:rPr>
+            </w:pPr>
+            <w:r>
+              <w:rPr>
+                <w:rFonts w:ascii="Times New Roman" w:hAnsi="Times New Roman" w:cs="Times New Roman"/>
+                <w:sz w:val="16"/>
+                <w:szCs w:val="16"/>
+              </w:rPr>
+              <w:t>Accepted the format on how to write and structure the answers</w:t>
+            </w:r>
+          </w:p>
+        </w:tc>
+        <w:tc>
+          <w:tcPr>
+            <w:tcW w:w="1096" w:type="dxa"/>
+          </w:tcPr>
+          <w:p>
+            <w:pPr>
+              <w:rPr>
+                <w:rFonts w:ascii="Times New Roman" w:hAnsi="Times New Roman" w:cs="Times New Roman"/>
+                <w:sz w:val="16"/>
+                <w:szCs w:val="16"/>
+              </w:rPr>
+            </w:pPr>
+            <w:r>
+              <w:rPr>
+                <w:rFonts w:ascii="Times New Roman" w:hAnsi="Times New Roman" w:cs="Times New Roman"/>
+                <w:sz w:val="16"/>
+                <w:szCs w:val="16"/>
+              </w:rPr>
+              <w:t>Struggled to understand what was expected to write for forward engineering consideration</w:t>
+            </w:r>
+            <w:r>
+              <w:rPr>
+                <w:rFonts w:ascii="Times New Roman" w:hAnsi="Times New Roman" w:cs="Times New Roman"/>
+                <w:sz w:val="16"/>
+                <w:szCs w:val="16"/>
+              </w:rPr>
+              <w:t xml:space="preserve"> with AI, this solution helped.</w:t>
+            </w:r>
+          </w:p>
+        </w:tc>
+      </w:tr>
+      <w:tr>
+        <w:tc>
+          <w:tcPr>
+            <w:tcW w:w="955" w:type="dxa"/>
+          </w:tcPr>
+          <w:p>
+            <w:pPr>
+              <w:rPr>
+                <w:rFonts w:ascii="Times New Roman" w:hAnsi="Times New Roman" w:cs="Times New Roman"/>
+                <w:sz w:val="16"/>
+                <w:szCs w:val="16"/>
+              </w:rPr>
+            </w:pPr>
+            <w:r>
+              <w:rPr>
+                <w:rFonts w:ascii="Times New Roman" w:hAnsi="Times New Roman" w:cs="Times New Roman"/>
+                <w:sz w:val="16"/>
+                <w:szCs w:val="16"/>
+              </w:rPr>
+              <w:t>AI-RES-3</w:t>
+            </w:r>
+          </w:p>
+        </w:tc>
+        <w:tc>
+          <w:tcPr>
+            <w:tcW w:w="1047" w:type="dxa"/>
+          </w:tcPr>
+          <w:p>
+            <w:pPr>
+              <w:rPr>
+                <w:rFonts w:ascii="Times New Roman" w:hAnsi="Times New Roman" w:cs="Times New Roman"/>
+                <w:sz w:val="16"/>
+                <w:szCs w:val="16"/>
+              </w:rPr>
+            </w:pPr>
+            <w:r>
+              <w:rPr>
+                <w:rFonts w:ascii="Times New Roman" w:hAnsi="Times New Roman" w:cs="Times New Roman"/>
+                <w:sz w:val="16"/>
+                <w:szCs w:val="16"/>
+              </w:rPr>
+              <w:t>Benno Weideman</w:t>
+            </w:r>
+          </w:p>
+        </w:tc>
+        <w:tc>
+          <w:tcPr>
+            <w:tcW w:w="1107" w:type="dxa"/>
+          </w:tcPr>
+          <w:p>
+            <w:pPr>
+              <w:rPr>
+                <w:rFonts w:ascii="Times New Roman" w:hAnsi="Times New Roman" w:cs="Times New Roman"/>
+                <w:sz w:val="16"/>
+                <w:szCs w:val="16"/>
+              </w:rPr>
+            </w:pPr>
+            <w:r>
+              <w:rPr>
+                <w:rFonts w:ascii="Times New Roman" w:hAnsi="Times New Roman" w:cs="Times New Roman"/>
+                <w:sz w:val="16"/>
+                <w:szCs w:val="16"/>
+              </w:rPr>
+              <w:t>08/09/2026</w:t>
+            </w:r>
+          </w:p>
+        </w:tc>
+        <w:tc>
+          <w:tcPr>
+            <w:tcW w:w="801" w:type="dxa"/>
+          </w:tcPr>
+          <w:p>
+            <w:pPr>
+              <w:rPr>
+                <w:rFonts w:ascii="Times New Roman" w:hAnsi="Times New Roman" w:cs="Times New Roman"/>
+                <w:sz w:val="16"/>
+                <w:szCs w:val="16"/>
+              </w:rPr>
+            </w:pPr>
+            <w:r>
+              <w:rPr>
+                <w:rFonts w:ascii="Times New Roman" w:hAnsi="Times New Roman" w:cs="Times New Roman"/>
+                <w:sz w:val="16"/>
+                <w:szCs w:val="16"/>
+              </w:rPr>
+              <w:t>Claude</w:t>
+            </w:r>
+          </w:p>
+        </w:tc>
+        <w:tc>
+          <w:tcPr>
+            <w:tcW w:w="1614" w:type="dxa"/>
+          </w:tcPr>
+          <w:p>
+            <w:pPr>
+              <w:rPr>
+                <w:rFonts w:ascii="Times New Roman" w:hAnsi="Times New Roman" w:cs="Times New Roman"/>
+                <w:sz w:val="16"/>
+                <w:szCs w:val="16"/>
+              </w:rPr>
+            </w:pPr>
+            <w:r>
+              <w:rPr>
+                <w:rFonts w:ascii="Times New Roman" w:hAnsi="Times New Roman" w:cs="Times New Roman"/>
+                <w:sz w:val="16"/>
+                <w:szCs w:val="16"/>
+              </w:rPr>
+              <w:t>Provide 5 valid resources that are free, professional/academic/standard and are not older than 2022</w:t>
+            </w:r>
+            <w:r>
+              <w:rPr>
+                <w:rFonts w:ascii="Times New Roman" w:hAnsi="Times New Roman" w:cs="Times New Roman"/>
+                <w:sz w:val="16"/>
+                <w:szCs w:val="16"/>
+              </w:rPr>
+              <w:t xml:space="preserve">. These 5 resources should be aligned with the 5 forward engineering considerations that our team chose such as native vs web, free tier development, </w:t>
+            </w:r>
+            <w:r>
+              <w:rPr>
+                <w:rFonts w:ascii="Times New Roman" w:hAnsi="Times New Roman" w:cs="Times New Roman"/>
+                <w:sz w:val="16"/>
+                <w:szCs w:val="16"/>
+              </w:rPr>
+              <w:t>database failover operation, scalability, and security</w:t>
+            </w:r>
+          </w:p>
+        </w:tc>
+        <w:tc>
+          <w:tcPr>
+            <w:tcW w:w="2551" w:type="dxa"/>
+          </w:tcPr>
+          <w:p>
+            <w:pPr>
+              <w:rPr>
+                <w:rFonts w:ascii="Times New Roman" w:hAnsi="Times New Roman" w:cs="Times New Roman"/>
+                <w:sz w:val="16"/>
+                <w:szCs w:val="16"/>
+              </w:rPr>
+            </w:pPr>
+            <w:r>
+              <w:rPr>
+                <w:rFonts w:ascii="Times New Roman" w:hAnsi="Times New Roman" w:cs="Times New Roman"/>
+                <w:sz w:val="16"/>
+                <w:szCs w:val="16"/>
+              </w:rPr>
+              <w:t>Provided 5 resources regarding the 5 forward engineering considerations that will help find evidence of risks of ignoring them.</w:t>
+            </w:r>
+          </w:p>
+        </w:tc>
+        <w:tc>
+          <w:tcPr>
+            <w:tcW w:w="1418" w:type="dxa"/>
+          </w:tcPr>
+          <w:p>
+            <w:pPr>
+              <w:rPr>
+                <w:rFonts w:ascii="Times New Roman" w:hAnsi="Times New Roman" w:cs="Times New Roman"/>
+                <w:sz w:val="16"/>
+                <w:szCs w:val="16"/>
+              </w:rPr>
+            </w:pPr>
+            <w:r>
+              <w:rPr>
+                <w:rFonts w:ascii="Times New Roman" w:hAnsi="Times New Roman" w:cs="Times New Roman"/>
+                <w:sz w:val="16"/>
+                <w:szCs w:val="16"/>
+              </w:rPr>
+              <w:t xml:space="preserve">All 5 resources have valid DOIs, they are searchable in </w:t>
+            </w:r>
+            <w:r>
+              <w:rPr>
+                <w:rFonts w:ascii="Times New Roman" w:hAnsi="Times New Roman" w:cs="Times New Roman"/>
+                <w:sz w:val="16"/>
+                <w:szCs w:val="16"/>
+              </w:rPr>
+              <w:t xml:space="preserve">Google Scholar, authors are real, </w:t>
+            </w:r>
+            <w:r>
+              <w:rPr>
+                <w:rFonts w:ascii="Times New Roman" w:hAnsi="Times New Roman" w:cs="Times New Roman"/>
+                <w:sz w:val="16"/>
+                <w:szCs w:val="16"/>
+              </w:rPr>
+              <w:t>links to website for some of the resources are real companies.</w:t>
+            </w:r>
+          </w:p>
+        </w:tc>
+        <w:tc>
+          <w:tcPr>
+            <w:tcW w:w="1513" w:type="dxa"/>
+          </w:tcPr>
+          <w:p>
+            <w:pPr>
+              <w:rPr>
+                <w:rFonts w:ascii="Times New Roman" w:hAnsi="Times New Roman" w:cs="Times New Roman"/>
+                <w:sz w:val="16"/>
+                <w:szCs w:val="16"/>
+              </w:rPr>
+            </w:pPr>
+            <w:r>
+              <w:rPr>
+                <w:rFonts w:ascii="Times New Roman" w:hAnsi="Times New Roman" w:cs="Times New Roman"/>
+                <w:sz w:val="16"/>
+                <w:szCs w:val="16"/>
+              </w:rPr>
+              <w:t xml:space="preserve">Accepted only </w:t>
+            </w:r>
+            <w:r>
+              <w:rPr>
+                <w:rFonts w:ascii="Times New Roman" w:hAnsi="Times New Roman" w:cs="Times New Roman"/>
+                <w:sz w:val="16"/>
+                <w:szCs w:val="16"/>
+              </w:rPr>
+              <w:t>5 resources.</w:t>
+            </w:r>
+          </w:p>
+        </w:tc>
+        <w:tc>
+          <w:tcPr>
+            <w:tcW w:w="1096" w:type="dxa"/>
+          </w:tcPr>
+          <w:p>
+            <w:pPr>
+              <w:rPr>
+                <w:rFonts w:ascii="Times New Roman" w:hAnsi="Times New Roman" w:cs="Times New Roman"/>
+                <w:sz w:val="16"/>
+                <w:szCs w:val="16"/>
+              </w:rPr>
+            </w:pPr>
+            <w:r>
+              <w:rPr>
+                <w:rFonts w:ascii="Times New Roman" w:hAnsi="Times New Roman" w:cs="Times New Roman"/>
+                <w:sz w:val="16"/>
+                <w:szCs w:val="16"/>
+              </w:rPr>
+              <w:t>Struggled to find resources that provide evidence for risks and had to prompt AI to give proper resources.</w:t>
+            </w:r>
+          </w:p>
+        </w:tc>
+      </w:tr>
+      <w:tr>
+        <w:tc>
+          <w:tcPr>
+            <w:tcW w:w="955" w:type="dxa"/>
+          </w:tcPr>
+          <w:p>
+            <w:pPr>
+              <w:rPr>
+                <w:rFonts w:ascii="Times New Roman" w:hAnsi="Times New Roman" w:cs="Times New Roman"/>
+                <w:sz w:val="16"/>
+                <w:szCs w:val="16"/>
+              </w:rPr>
+            </w:pPr>
+            <w:r>
+              <w:rPr>
+                <w:rFonts w:ascii="Times New Roman" w:hAnsi="Times New Roman" w:cs="Times New Roman"/>
+                <w:sz w:val="16"/>
+                <w:szCs w:val="16"/>
+              </w:rPr>
+              <w:lastRenderedPageBreak/>
+              <w:t>AI-REV-1</w:t>
+            </w:r>
+          </w:p>
+        </w:tc>
+        <w:tc>
+          <w:tcPr>
+            <w:tcW w:w="1047" w:type="dxa"/>
+          </w:tcPr>
+          <w:p>
+            <w:pPr>
+              <w:rPr>
+                <w:rFonts w:ascii="Times New Roman" w:hAnsi="Times New Roman" w:cs="Times New Roman"/>
+                <w:sz w:val="16"/>
+                <w:szCs w:val="16"/>
+              </w:rPr>
+            </w:pPr>
+            <w:r>
+              <w:rPr>
+                <w:rFonts w:ascii="Times New Roman" w:hAnsi="Times New Roman" w:cs="Times New Roman"/>
+                <w:sz w:val="16"/>
+                <w:szCs w:val="16"/>
+              </w:rPr>
+              <w:t>Benno Weideman</w:t>
+            </w:r>
+          </w:p>
+        </w:tc>
+        <w:tc>
+          <w:tcPr>
+            <w:tcW w:w="1107" w:type="dxa"/>
+          </w:tcPr>
+          <w:p>
+            <w:pPr>
+              <w:rPr>
+                <w:rFonts w:ascii="Times New Roman" w:hAnsi="Times New Roman" w:cs="Times New Roman"/>
+                <w:sz w:val="16"/>
+                <w:szCs w:val="16"/>
+              </w:rPr>
+            </w:pPr>
+            <w:r>
+              <w:rPr>
+                <w:rFonts w:ascii="Times New Roman" w:hAnsi="Times New Roman" w:cs="Times New Roman"/>
+                <w:sz w:val="16"/>
+                <w:szCs w:val="16"/>
+              </w:rPr>
+              <w:t>08/09/2026</w:t>
+            </w:r>
+          </w:p>
+        </w:tc>
+        <w:tc>
+          <w:tcPr>
+            <w:tcW w:w="801" w:type="dxa"/>
+          </w:tcPr>
+          <w:p>
+            <w:pPr>
+              <w:rPr>
+                <w:rFonts w:ascii="Times New Roman" w:hAnsi="Times New Roman" w:cs="Times New Roman"/>
+                <w:sz w:val="16"/>
+                <w:szCs w:val="16"/>
+              </w:rPr>
+            </w:pPr>
+            <w:r>
+              <w:rPr>
+                <w:rFonts w:ascii="Times New Roman" w:hAnsi="Times New Roman" w:cs="Times New Roman"/>
+                <w:sz w:val="16"/>
+                <w:szCs w:val="16"/>
+              </w:rPr>
+              <w:t>Claude</w:t>
+            </w:r>
+          </w:p>
+        </w:tc>
+        <w:tc>
+          <w:tcPr>
+            <w:tcW w:w="1614" w:type="dxa"/>
+          </w:tcPr>
+          <w:p>
+            <w:pPr>
+              <w:rPr>
+                <w:rFonts w:ascii="Times New Roman" w:hAnsi="Times New Roman" w:cs="Times New Roman"/>
+                <w:sz w:val="16"/>
+                <w:szCs w:val="16"/>
+              </w:rPr>
+            </w:pPr>
+            <w:r>
+              <w:rPr>
+                <w:rFonts w:ascii="Times New Roman" w:hAnsi="Times New Roman" w:cs="Times New Roman"/>
+                <w:sz w:val="16"/>
+                <w:szCs w:val="16"/>
+              </w:rPr>
+              <w:t xml:space="preserve">Prompted AI to explain </w:t>
+            </w:r>
+            <w:r>
+              <w:rPr>
+                <w:rFonts w:ascii="Times New Roman" w:hAnsi="Times New Roman" w:cs="Times New Roman"/>
+                <w:sz w:val="16"/>
+                <w:szCs w:val="16"/>
+              </w:rPr>
+              <w:t xml:space="preserve">where to find answers of evidence for each resource and explain </w:t>
+            </w:r>
+            <w:r>
+              <w:rPr>
+                <w:rFonts w:ascii="Times New Roman" w:hAnsi="Times New Roman" w:cs="Times New Roman"/>
+                <w:sz w:val="16"/>
+                <w:szCs w:val="16"/>
+              </w:rPr>
+              <w:t xml:space="preserve">why the </w:t>
+            </w:r>
+            <w:r>
+              <w:rPr>
+                <w:rFonts w:ascii="Times New Roman" w:hAnsi="Times New Roman" w:cs="Times New Roman"/>
+                <w:sz w:val="16"/>
+                <w:szCs w:val="16"/>
+              </w:rPr>
+              <w:t xml:space="preserve">native vs web app, free tier development, and </w:t>
+            </w:r>
+            <w:r>
+              <w:rPr>
+                <w:rFonts w:ascii="Times New Roman" w:hAnsi="Times New Roman" w:cs="Times New Roman"/>
+                <w:sz w:val="16"/>
+                <w:szCs w:val="16"/>
+              </w:rPr>
+              <w:t>database failover operation risks</w:t>
+            </w:r>
+            <w:r>
+              <w:rPr>
+                <w:rFonts w:ascii="Times New Roman" w:hAnsi="Times New Roman" w:cs="Times New Roman"/>
+                <w:sz w:val="16"/>
+                <w:szCs w:val="16"/>
+              </w:rPr>
+              <w:t xml:space="preserve"> resources provide evidence.</w:t>
+            </w:r>
+          </w:p>
+        </w:tc>
+        <w:tc>
+          <w:tcPr>
+            <w:tcW w:w="2551" w:type="dxa"/>
+          </w:tcPr>
+          <w:p>
+            <w:pPr>
+              <w:rPr>
+                <w:rFonts w:ascii="Times New Roman" w:hAnsi="Times New Roman" w:cs="Times New Roman"/>
+                <w:sz w:val="16"/>
+                <w:szCs w:val="16"/>
+              </w:rPr>
+            </w:pPr>
+            <w:r>
+              <w:rPr>
+                <w:rFonts w:ascii="Times New Roman" w:hAnsi="Times New Roman" w:cs="Times New Roman"/>
+                <w:sz w:val="16"/>
+                <w:szCs w:val="16"/>
+              </w:rPr>
+              <w:t>Analysed the sections fo</w:t>
+            </w:r>
+            <w:r>
+              <w:rPr>
+                <w:rFonts w:ascii="Times New Roman" w:hAnsi="Times New Roman" w:cs="Times New Roman"/>
+                <w:sz w:val="16"/>
+                <w:szCs w:val="16"/>
+              </w:rPr>
+              <w:t xml:space="preserve">r each </w:t>
+            </w:r>
+            <w:r>
+              <w:rPr>
+                <w:rFonts w:ascii="Times New Roman" w:hAnsi="Times New Roman" w:cs="Times New Roman"/>
+                <w:sz w:val="16"/>
+                <w:szCs w:val="16"/>
+              </w:rPr>
+              <w:t>resource</w:t>
+            </w:r>
+            <w:r>
+              <w:rPr>
+                <w:rFonts w:ascii="Times New Roman" w:hAnsi="Times New Roman" w:cs="Times New Roman"/>
+                <w:sz w:val="16"/>
+                <w:szCs w:val="16"/>
+              </w:rPr>
+              <w:t xml:space="preserve"> and show where to find answers.</w:t>
+            </w:r>
+            <w:r>
+              <w:rPr>
+                <w:rFonts w:ascii="Times New Roman" w:hAnsi="Times New Roman" w:cs="Times New Roman"/>
+                <w:sz w:val="16"/>
+                <w:szCs w:val="16"/>
+              </w:rPr>
+              <w:t xml:space="preserve"> Also </w:t>
+            </w:r>
+            <w:r>
+              <w:rPr>
+                <w:rFonts w:ascii="Times New Roman" w:hAnsi="Times New Roman" w:cs="Times New Roman"/>
+                <w:sz w:val="16"/>
+                <w:szCs w:val="16"/>
+              </w:rPr>
+              <w:t xml:space="preserve">explained how they can help to </w:t>
+            </w:r>
+            <w:r>
+              <w:rPr>
+                <w:rFonts w:ascii="Times New Roman" w:hAnsi="Times New Roman" w:cs="Times New Roman"/>
+                <w:sz w:val="16"/>
+                <w:szCs w:val="16"/>
+              </w:rPr>
+              <w:t>provide evidence.</w:t>
+            </w:r>
+          </w:p>
+        </w:tc>
+        <w:tc>
+          <w:tcPr>
+            <w:tcW w:w="1418" w:type="dxa"/>
+          </w:tcPr>
+          <w:p>
+            <w:pPr>
+              <w:rPr>
+                <w:rFonts w:ascii="Times New Roman" w:hAnsi="Times New Roman" w:cs="Times New Roman"/>
+                <w:sz w:val="16"/>
+                <w:szCs w:val="16"/>
+              </w:rPr>
+            </w:pPr>
+            <w:r>
+              <w:rPr>
+                <w:rFonts w:ascii="Times New Roman" w:hAnsi="Times New Roman" w:cs="Times New Roman"/>
+                <w:sz w:val="16"/>
+                <w:szCs w:val="16"/>
+              </w:rPr>
+              <w:t>Read through the resources and the summary of AI is aligned with what the actual resources say</w:t>
+            </w:r>
+          </w:p>
+        </w:tc>
+        <w:tc>
+          <w:tcPr>
+            <w:tcW w:w="1513" w:type="dxa"/>
+          </w:tcPr>
+          <w:p>
+            <w:pPr>
+              <w:rPr>
+                <w:rFonts w:ascii="Times New Roman" w:hAnsi="Times New Roman" w:cs="Times New Roman"/>
+                <w:sz w:val="16"/>
+                <w:szCs w:val="16"/>
+              </w:rPr>
+            </w:pPr>
+            <w:r>
+              <w:rPr>
+                <w:rFonts w:ascii="Times New Roman" w:hAnsi="Times New Roman" w:cs="Times New Roman"/>
+                <w:sz w:val="16"/>
+                <w:szCs w:val="16"/>
+              </w:rPr>
+              <w:t xml:space="preserve">Accept sections that has answers and </w:t>
+            </w:r>
+            <w:r>
+              <w:rPr>
+                <w:rFonts w:ascii="Times New Roman" w:hAnsi="Times New Roman" w:cs="Times New Roman"/>
+                <w:sz w:val="16"/>
+                <w:szCs w:val="16"/>
+              </w:rPr>
+              <w:t>used own words to explain the risks of ignoring the forward engineering considerations.</w:t>
+            </w:r>
+          </w:p>
+        </w:tc>
+        <w:tc>
+          <w:tcPr>
+            <w:tcW w:w="1096" w:type="dxa"/>
+          </w:tcPr>
+          <w:p>
+            <w:pPr>
+              <w:rPr>
+                <w:rFonts w:ascii="Times New Roman" w:hAnsi="Times New Roman" w:cs="Times New Roman"/>
+                <w:sz w:val="16"/>
+                <w:szCs w:val="16"/>
+              </w:rPr>
+            </w:pPr>
+            <w:r>
+              <w:rPr>
+                <w:rFonts w:ascii="Times New Roman" w:hAnsi="Times New Roman" w:cs="Times New Roman"/>
+                <w:sz w:val="16"/>
+                <w:szCs w:val="16"/>
+              </w:rPr>
+              <w:t>Struggled to find sections that can aid research in the documents.</w:t>
             </w:r>
           </w:p>
         </w:tc>
@@ -1816,6 +3332,209 @@
         </w:rPr>
       </w:pPr>
     </w:p>
+    <w:p>
+      <w:pPr>
+        <w:rPr>
+          <w:rFonts w:ascii="Times New Roman" w:hAnsi="Times New Roman" w:cs="Times New Roman"/>
+        </w:rPr>
+      </w:pPr>
+    </w:p>
+    <w:p>
+      <w:pPr>
+        <w:rPr>
+          <w:rFonts w:ascii="Times New Roman" w:hAnsi="Times New Roman" w:cs="Times New Roman"/>
+        </w:rPr>
+      </w:pPr>
+      <w:r>
+        <w:rPr>
+          <w:rFonts w:ascii="Times New Roman" w:hAnsi="Times New Roman" w:cs="Times New Roman"/>
+        </w:rPr>
+        <w:br w:type="page"/>
+      </w:r>
+    </w:p>
+    <w:sdt>
+      <w:sdtPr>
+        <w:rPr>
+          <w:rFonts w:ascii="Times New Roman" w:eastAsiaTheme="minorHAnsi" w:hAnsi="Times New Roman" w:cs="Times New Roman"/>
+          <w:color w:val="auto"/>
+          <w:sz w:val="24"/>
+          <w:szCs w:val="24"/>
+          <w:lang w:val="en-GB"/>
+        </w:rPr>
+        <w:id w:val="1486810542"/>
+        <w:docPartObj>
+          <w:docPartGallery w:val="Bibliographies"/>
+          <w:docPartUnique/>
+        </w:docPartObj>
+      </w:sdtPr>
+      <w:sdtEndPr>
+        <w:rPr>
+          <w:lang w:val="en-ZA"/>
+        </w:rPr>
+      </w:sdtEndPr>
+      <w:sdtContent>
+        <w:p>
+          <w:pPr>
+            <w:pStyle w:val="Heading1"/>
+            <w:rPr>
+              <w:rFonts w:ascii="Times New Roman" w:hAnsi="Times New Roman" w:cs="Times New Roman"/>
+            </w:rPr>
+          </w:pPr>
+          <w:r>
+            <w:rPr>
+              <w:rFonts w:ascii="Times New Roman" w:hAnsi="Times New Roman" w:cs="Times New Roman"/>
+              <w:lang w:val="en-GB"/>
+            </w:rPr>
+            <w:t>References</w:t>
+          </w:r>
+        </w:p>
+        <w:sdt>
+          <w:sdtPr>
+            <w:rPr>
+              <w:rFonts w:ascii="Times New Roman" w:hAnsi="Times New Roman" w:cs="Times New Roman"/>
+            </w:rPr>
+            <w:id w:val="-573587230"/>
+            <w:bibliography/>
+          </w:sdtPr>
+          <w:sdtEndPr/>
+          <w:sdtContent>
+            <w:p>
+              <w:pPr>
+                <w:pStyle w:val="Bibliography"/>
+                <w:rPr>
+                  <w:rFonts w:ascii="Times New Roman" w:hAnsi="Times New Roman" w:cs="Times New Roman"/>
+                  <w:noProof/>
+                  <w:kern w:val="0"/>
+                  <w14:ligatures w14:val="none"/>
+                </w:rPr>
+              </w:pPr>
+              <w:r>
+                <w:rPr>
+                  <w:rFonts w:ascii="Times New Roman" w:hAnsi="Times New Roman" w:cs="Times New Roman"/>
+                </w:rPr>
+                <w:fldChar w:fldCharType="begin"/>
+              </w:r>
+              <w:r>
+                <w:rPr>
+                  <w:rFonts w:ascii="Times New Roman" w:hAnsi="Times New Roman" w:cs="Times New Roman"/>
+                </w:rPr>
+                <w:instrText>BIBLIOGRAPHY</w:instrText>
+              </w:r>
+              <w:r>
+                <w:rPr>
+                  <w:rFonts w:ascii="Times New Roman" w:hAnsi="Times New Roman" w:cs="Times New Roman"/>
+                </w:rPr>
+                <w:fldChar w:fldCharType="separate"/>
+              </w:r>
+              <w:r>
+                <w:rPr>
+                  <w:rFonts w:ascii="Times New Roman" w:hAnsi="Times New Roman" w:cs="Times New Roman"/>
+                  <w:noProof/>
+                </w:rPr>
+                <w:t xml:space="preserve">Airport Company South Africa, n.d. </w:t>
+              </w:r>
+              <w:r>
+                <w:rPr>
+                  <w:rFonts w:ascii="Times New Roman" w:hAnsi="Times New Roman" w:cs="Times New Roman"/>
+                  <w:i/>
+                  <w:iCs/>
+                  <w:noProof/>
+                </w:rPr>
+                <w:t>Customer Relationship Management Solution</w:t>
+              </w:r>
+              <w:r>
+                <w:rPr>
+                  <w:rFonts w:ascii="Times New Roman" w:hAnsi="Times New Roman" w:cs="Times New Roman"/>
+                  <w:noProof/>
+                </w:rPr>
+                <w:t xml:space="preserve">. [Document] Available at: </w:t>
+              </w:r>
+              <w:hyperlink r:id="rId6" w:history="1">
+                <w:r>
+                  <w:rPr>
+                    <w:rStyle w:val="Hyperlink"/>
+                    <w:rFonts w:ascii="Times New Roman" w:hAnsi="Times New Roman" w:cs="Times New Roman"/>
+                    <w:noProof/>
+                  </w:rPr>
+                  <w:t>https://www.airports.co.za/Documents/Annexure%20A%20Customer%20Relationship%20Management_Scope%20of%20Work_14%20October%202022.pdf</w:t>
+                </w:r>
+              </w:hyperlink>
+              <w:r>
+                <w:rPr>
+                  <w:rFonts w:ascii="Times New Roman" w:hAnsi="Times New Roman" w:cs="Times New Roman"/>
+                  <w:noProof/>
+                </w:rPr>
+                <w:t xml:space="preserve"> [Accessed 7 September 2026].</w:t>
+              </w:r>
+            </w:p>
+            <w:p>
+              <w:pPr>
+                <w:pStyle w:val="Bibliography"/>
+                <w:rPr>
+                  <w:rFonts w:ascii="Times New Roman" w:hAnsi="Times New Roman" w:cs="Times New Roman"/>
+                  <w:noProof/>
+                </w:rPr>
+              </w:pPr>
+              <w:r>
+                <w:rPr>
+                  <w:rFonts w:ascii="Times New Roman" w:hAnsi="Times New Roman" w:cs="Times New Roman"/>
+                  <w:noProof/>
+                </w:rPr>
+                <w:t xml:space="preserve">Pacific Certifications, 2026. </w:t>
+              </w:r>
+              <w:r>
+                <w:rPr>
+                  <w:rFonts w:ascii="Times New Roman" w:hAnsi="Times New Roman" w:cs="Times New Roman"/>
+                  <w:i/>
+                  <w:iCs/>
+                  <w:noProof/>
+                </w:rPr>
+                <w:t>ISO/IEC 25010:2023 Guide to Software Product Quality Standards</w:t>
+              </w:r>
+              <w:r>
+                <w:rPr>
+                  <w:rFonts w:ascii="Times New Roman" w:hAnsi="Times New Roman" w:cs="Times New Roman"/>
+                  <w:noProof/>
+                </w:rPr>
+                <w:t xml:space="preserve">. [Online] Available at: </w:t>
+              </w:r>
+              <w:hyperlink r:id="rId7" w:history="1">
+                <w:r>
+                  <w:rPr>
+                    <w:rStyle w:val="Hyperlink"/>
+                    <w:rFonts w:ascii="Times New Roman" w:hAnsi="Times New Roman" w:cs="Times New Roman"/>
+                    <w:noProof/>
+                  </w:rPr>
+                  <w:t>https://blog.pacificcert.com/iso-25010-software-product-quality-model/</w:t>
+                </w:r>
+              </w:hyperlink>
+              <w:r>
+                <w:rPr>
+                  <w:rFonts w:ascii="Times New Roman" w:hAnsi="Times New Roman" w:cs="Times New Roman"/>
+                  <w:noProof/>
+                </w:rPr>
+                <w:t xml:space="preserve"> [Accessed 6 September 2026].</w:t>
+              </w:r>
+            </w:p>
+            <w:p>
+              <w:pPr>
+                <w:rPr>
+                  <w:rFonts w:ascii="Times New Roman" w:hAnsi="Times New Roman" w:cs="Times New Roman"/>
+                </w:rPr>
+              </w:pPr>
+              <w:r>
+                <w:rPr>
+                  <w:rFonts w:ascii="Times New Roman" w:hAnsi="Times New Roman" w:cs="Times New Roman"/>
+                  <w:b/>
+                  <w:bCs/>
+                </w:rPr>
+                <w:fldChar w:fldCharType="end"/>
+              </w:r>
+            </w:p>
+          </w:sdtContent>
+        </w:sdt>
+      </w:sdtContent>
+    </w:sdt>
     <w:p>
       <w:pPr>
         <w:rPr>
@@ -2980,6 +4699,26 @@
       </w:tblBorders>
     </w:tblPr>
   </w:style>
+  <w:style w:type="paragraph" w:styleId="Bibliography">
+    <w:name w:val="Bibliography"/>
+    <w:basedOn w:val="Normal"/>
+    <w:next w:val="Normal"/>
+    <w:uiPriority w:val="37"/>
+    <w:unhideWhenUsed/>
+    <w:rsid w:val="008F78A4"/>
+  </w:style>
+  <w:style w:type="character" w:styleId="Hyperlink">
+    <w:name w:val="Hyperlink"/>
+    <w:basedOn w:val="DefaultParagraphFont"/>
+    <w:uiPriority w:val="99"/>
+    <w:semiHidden/>
+    <w:unhideWhenUsed/>
+    <w:rsid w:val="008F78A4"/>
+    <w:rPr>
+      <w:color w:val="0000FF"/>
+      <w:u w:val="single"/>
+    </w:rPr>
+  </w:style>
 </w:styles>
 </file>
 
@@ -3296,4 +5035,51 @@
     </a:ext>
   </a:extLst>
 </a:theme>
+</file>
+
+<file path=customXml/item1.xml><?xml version="1.0" encoding="utf-8"?>
+<b:Sources xmlns:b="http://schemas.openxmlformats.org/officeDocument/2006/bibliography" xmlns="http://schemas.openxmlformats.org/officeDocument/2006/bibliography" SelectedStyle="\HarvardAnglia.XSL" StyleName="Harvard - Anglia*" Version="1">
+  <b:Source>
+    <b:Tag>Pac26</b:Tag>
+    <b:SourceType>InternetSite</b:SourceType>
+    <b:Guid>{4B6157D4-A9FF-4AD4-A76E-5C45FF0D80E2}</b:Guid>
+    <b:Title>ISO/IEC 25010:2023 Guide to Software Product Quality Standards</b:Title>
+    <b:Year>2026</b:Year>
+    <b:Author>
+      <b:Author>
+        <b:Corporate>Pacific Certifications</b:Corporate>
+      </b:Author>
+    </b:Author>
+    <b:YearAccessed>2026</b:YearAccessed>
+    <b:MonthAccessed>September</b:MonthAccessed>
+    <b:DayAccessed>6</b:DayAccessed>
+    <b:URL>https://blog.pacificcert.com/iso-25010-software-product-quality-model/</b:URL>
+    <b:RefOrder>1</b:RefOrder>
+  </b:Source>
+  <b:Source>
+    <b:Tag>Air26</b:Tag>
+    <b:SourceType>DocumentFromInternetSite</b:SourceType>
+    <b:Guid>{8C295F7D-3F77-4DD6-9D81-B82DCE530B86}</b:Guid>
+    <b:Title>Customer Relationship Management Solution </b:Title>
+    <b:YearAccessed>2026</b:YearAccessed>
+    <b:MonthAccessed>September</b:MonthAccessed>
+    <b:DayAccessed>7</b:DayAccessed>
+    <b:URL>https://www.airports.co.za/Documents/Annexure%20A%20Customer%20Relationship%20Management_Scope%20of%20Work_14%20October%202022.pdf</b:URL>
+    <b:Medium>Document</b:Medium>
+    <b:Author>
+      <b:Author>
+        <b:Corporate>Airport Company South Africa</b:Corporate>
+      </b:Author>
+    </b:Author>
+    <b:RefOrder>2</b:RefOrder>
+  </b:Source>
+</b:Sources>
+</file>
+
+<file path=customXml/itemProps1.xml><?xml version="1.0" encoding="utf-8"?>
+<ds:datastoreItem xmlns:ds="http://schemas.openxmlformats.org/officeDocument/2006/customXml" ds:itemID="{6E2754BF-CBBF-4DF5-A693-65923294DC19}">
+  <ds:schemaRefs>
+    <ds:schemaRef ds:uri="http://schemas.openxmlformats.org/officeDocument/2006/bibliography"/>
+  </ds:schemaRefs>
+</ds:datastoreItem>
 </file>
</xml_diff>